<commit_message>
feat(docs): add cover page and TOC to manuel médecin
</commit_message>
<xml_diff>
--- a/docs/Manuel_Utilisateur_Medecin_RadioPlan.docx
+++ b/docs/Manuel_Utilisateur_Medecin_RadioPlan.docx
@@ -3,13 +3,163 @@
 <w:document xmlns:wpc="http://schemas.microsoft.com/office/word/2010/wordprocessingCanvas" xmlns:mc="http://schemas.openxmlformats.org/markup-compatibility/2006" xmlns:o="urn:schemas-microsoft-com:office:office" xmlns:r="http://schemas.openxmlformats.org/officeDocument/2006/relationships" xmlns:m="http://schemas.openxmlformats.org/officeDocument/2006/math" xmlns:v="urn:schemas-microsoft-com:vml" xmlns:wp14="http://schemas.microsoft.com/office/word/2010/wordprocessingDrawing" xmlns:wp="http://schemas.openxmlformats.org/drawingml/2006/wordprocessingDrawing" xmlns:w10="urn:schemas-microsoft-com:office:word" xmlns:w="http://schemas.openxmlformats.org/wordprocessingml/2006/main" xmlns:w14="http://schemas.microsoft.com/office/word/2010/wordml" xmlns:w15="http://schemas.microsoft.com/office/word/2012/wordml" xmlns:wpg="http://schemas.microsoft.com/office/word/2010/wordprocessingGroup" xmlns:wpi="http://schemas.microsoft.com/office/word/2010/wordprocessingInk" xmlns:wne="http://schemas.microsoft.com/office/word/2006/wordml" xmlns:wps="http://schemas.microsoft.com/office/word/2010/wordprocessingShape" xmlns:cx="http://schemas.microsoft.com/office/drawing/2014/chartex" xmlns:cx1="http://schemas.microsoft.com/office/drawing/2015/9/8/chartex" xmlns:cx2="http://schemas.microsoft.com/office/drawing/2015/10/21/chartex" xmlns:cx3="http://schemas.microsoft.com/office/drawing/2016/5/9/chartex" xmlns:cx4="http://schemas.microsoft.com/office/drawing/2016/5/10/chartex" xmlns:cx5="http://schemas.microsoft.com/office/drawing/2016/5/11/chartex" xmlns:cx6="http://schemas.microsoft.com/office/drawing/2016/5/12/chartex" xmlns:cx7="http://schemas.microsoft.com/office/drawing/2016/5/13/chartex" xmlns:cx8="http://schemas.microsoft.com/office/drawing/2016/5/14/chartex" xmlns:aink="http://schemas.microsoft.com/office/drawing/2016/ink" xmlns:am3d="http://schemas.microsoft.com/office/drawing/2017/model3d" xmlns:w16cex="http://schemas.microsoft.com/office/word/2018/wordml/cex" xmlns:w16cid="http://schemas.microsoft.com/office/word/2016/wordml/cid" xmlns:w16="http://schemas.microsoft.com/office/word/2018/wordml" xmlns:w16sdtdh="http://schemas.microsoft.com/office/word/2020/wordml/sdtdatahash" xmlns:w16se="http://schemas.microsoft.com/office/word/2015/wordml/symex" mc:Ignorable="w14 w15 wp14">
   <w:body>
     <w:p>
+      <w:pPr>
+        <w:spacing w:after="0" w:before="2400"/>
+      </w:pPr>
+    </w:p>
+    <w:p>
+      <w:pPr>
+        <w:spacing w:after="200" w:before="0"/>
+        <w:jc w:val="center"/>
+      </w:pPr>
       <w:r>
         <w:rPr>
           <w:rFonts w:ascii="Arial" w:cs="Arial" w:eastAsia="Arial" w:hAnsi="Arial"/>
+          <w:b/>
+          <w:bCs/>
+          <w:color w:val="3B5BDB"/>
+          <w:sz w:val="72"/>
+          <w:szCs w:val="72"/>
+        </w:rPr>
+        <w:t xml:space="preserve">RadioPlan AI</w:t>
+      </w:r>
+    </w:p>
+    <w:p>
+      <w:pPr>
+        <w:spacing w:after="80" w:before="0"/>
+        <w:jc w:val="center"/>
+      </w:pPr>
+      <w:r>
+        <w:rPr>
+          <w:rFonts w:ascii="Arial" w:cs="Arial" w:eastAsia="Arial" w:hAnsi="Arial"/>
+          <w:b w:val="false"/>
+          <w:bCs w:val="false"/>
+          <w:color w:val="495057"/>
+          <w:sz w:val="44"/>
+          <w:szCs w:val="44"/>
+        </w:rPr>
+        <w:t xml:space="preserve">Manuel Utilisateur</w:t>
+      </w:r>
+    </w:p>
+    <w:p>
+      <w:pPr>
+        <w:spacing w:after="480" w:before="0"/>
+        <w:jc w:val="center"/>
+      </w:pPr>
+      <w:r>
+        <w:rPr>
+          <w:rFonts w:ascii="Arial" w:cs="Arial" w:eastAsia="Arial" w:hAnsi="Arial"/>
+          <w:color w:val="6C757D"/>
+          <w:sz w:val="32"/>
+          <w:szCs w:val="32"/>
+        </w:rPr>
+        <w:t xml:space="preserve">Rôle : Médecin</w:t>
+      </w:r>
+    </w:p>
+    <w:p>
+      <w:pPr>
+        <w:pBdr>
+          <w:bottom w:val="single" w:color="C5D3E8" w:sz="4" w:space="1"/>
+        </w:pBdr>
+        <w:spacing w:after="120" w:before="120"/>
+      </w:pPr>
+    </w:p>
+    <w:p>
+      <w:pPr>
+        <w:spacing w:after="0" w:before="240"/>
+      </w:pPr>
+    </w:p>
+    <w:p>
+      <w:pPr>
+        <w:spacing w:after="80" w:before="0"/>
+        <w:jc w:val="center"/>
+      </w:pPr>
+      <w:r>
+        <w:rPr>
+          <w:rFonts w:ascii="Arial" w:cs="Arial" w:eastAsia="Arial" w:hAnsi="Arial"/>
+          <w:b/>
+          <w:bCs/>
+          <w:color w:val="212529"/>
+          <w:sz w:val="28"/>
+          <w:szCs w:val="28"/>
+        </w:rPr>
+        <w:t xml:space="preserve">Hôpital Henri Mondor</w:t>
+      </w:r>
+    </w:p>
+    <w:p>
+      <w:pPr>
+        <w:spacing w:after="80" w:before="0"/>
+        <w:jc w:val="center"/>
+      </w:pPr>
+      <w:r>
+        <w:rPr>
+          <w:rFonts w:ascii="Arial" w:cs="Arial" w:eastAsia="Arial" w:hAnsi="Arial"/>
+          <w:color w:val="495057"/>
+          <w:sz w:val="26"/>
+          <w:szCs w:val="26"/>
+        </w:rPr>
+        <w:t xml:space="preserve">Service Radiothérapie</w:t>
+      </w:r>
+    </w:p>
+    <w:p>
+      <w:pPr>
+        <w:spacing w:after="480" w:before="0"/>
+        <w:jc w:val="center"/>
+      </w:pPr>
+      <w:r>
+        <w:rPr>
+          <w:rFonts w:ascii="Arial" w:cs="Arial" w:eastAsia="Arial" w:hAnsi="Arial"/>
+          <w:color w:val="6C757D"/>
           <w:sz w:val="22"/>
           <w:szCs w:val="22"/>
         </w:rPr>
-        <w:t xml:space="preserve">PLACEHOLDER</w:t>
+        <w:t xml:space="preserve">Avril 2026 — Version 1.0</w:t>
+      </w:r>
+    </w:p>
+    <w:p>
+      <w:r>
+        <w:br w:type="page"/>
+      </w:r>
+    </w:p>
+    <w:p>
+      <w:pPr>
+        <w:pStyle w:val="Heading1"/>
+        <w:spacing w:after="240" w:before="0"/>
+      </w:pPr>
+      <w:r>
+        <w:rPr>
+          <w:rFonts w:ascii="Arial" w:cs="Arial" w:eastAsia="Arial" w:hAnsi="Arial"/>
+          <w:b/>
+          <w:bCs/>
+          <w:color w:val="3B5BDB"/>
+          <w:sz w:val="32"/>
+          <w:szCs w:val="32"/>
+        </w:rPr>
+        <w:t xml:space="preserve">Table des matières</w:t>
+      </w:r>
+    </w:p>
+    <w:sdt>
+      <w:sdtPr>
+        <w:alias w:val="Table des matières"/>
+      </w:sdtPr>
+      <w:sdtContent>
+        <w:p>
+          <w:r>
+            <w:fldChar w:fldCharType="begin" w:dirty="true"/>
+            <w:instrText xml:space="preserve">TOC \h \o "1-3"</w:instrText>
+            <w:fldChar w:fldCharType="separate"/>
+          </w:r>
+        </w:p>
+        <w:p>
+          <w:r>
+            <w:fldChar w:fldCharType="end"/>
+          </w:r>
+        </w:p>
+      </w:sdtContent>
+    </w:sdt>
+    <w:p>
+      <w:r>
+        <w:br w:type="page"/>
       </w:r>
     </w:p>
     <w:sectPr>

</xml_diff>

<commit_message>
feat(docs): add chapter 1 - Premiers pas
</commit_message>
<xml_diff>
--- a/docs/Manuel_Utilisateur_Medecin_RadioPlan.docx
+++ b/docs/Manuel_Utilisateur_Medecin_RadioPlan.docx
@@ -160,6 +160,1088 @@
     <w:p>
       <w:r>
         <w:br w:type="page"/>
+      </w:r>
+    </w:p>
+    <w:p>
+      <w:pPr>
+        <w:pStyle w:val="Heading1"/>
+        <w:pageBreakBefore/>
+        <w:spacing w:after="240" w:before="0"/>
+      </w:pPr>
+      <w:r>
+        <w:rPr>
+          <w:rFonts w:ascii="Arial" w:cs="Arial" w:eastAsia="Arial" w:hAnsi="Arial"/>
+          <w:b/>
+          <w:bCs/>
+          <w:color w:val="3B5BDB"/>
+          <w:sz w:val="32"/>
+          <w:szCs w:val="32"/>
+        </w:rPr>
+        <w:t xml:space="preserve">1. Premiers pas</w:t>
+      </w:r>
+    </w:p>
+    <w:p>
+      <w:pPr>
+        <w:spacing w:after="100" w:before="60"/>
+      </w:pPr>
+      <w:r>
+        <w:rPr>
+          <w:rFonts w:ascii="Arial" w:cs="Arial" w:eastAsia="Arial" w:hAnsi="Arial"/>
+          <w:b w:val="false"/>
+          <w:bCs w:val="false"/>
+          <w:i w:val="false"/>
+          <w:iCs w:val="false"/>
+          <w:color w:val="212529"/>
+          <w:sz w:val="22"/>
+          <w:szCs w:val="22"/>
+        </w:rPr>
+        <w:t xml:space="preserve">Bienvenue dans RadioPlan AI. Ce manuel te guide dans l'utilisation de l'application au quotidien. En quelques minutes, tu seras opérationnel.</w:t>
+      </w:r>
+    </w:p>
+    <w:p>
+      <w:pPr>
+        <w:pStyle w:val="Heading2"/>
+        <w:spacing w:after="120" w:before="280"/>
+      </w:pPr>
+      <w:r>
+        <w:rPr>
+          <w:rFonts w:ascii="Arial" w:cs="Arial" w:eastAsia="Arial" w:hAnsi="Arial"/>
+          <w:b/>
+          <w:bCs/>
+          <w:color w:val="1971C2"/>
+          <w:sz w:val="26"/>
+          <w:szCs w:val="26"/>
+        </w:rPr>
+        <w:t xml:space="preserve">1.1 Se connecter</w:t>
+      </w:r>
+    </w:p>
+    <w:p>
+      <w:pPr>
+        <w:pStyle w:val="ListParagraph"/>
+        <w:numPr>
+          <w:ilvl w:val="0"/>
+          <w:numId w:val="2"/>
+        </w:numPr>
+        <w:spacing w:after="40" w:before="40"/>
+      </w:pPr>
+      <w:r>
+        <w:rPr>
+          <w:rFonts w:ascii="Arial" w:cs="Arial" w:eastAsia="Arial" w:hAnsi="Arial"/>
+          <w:color w:val="212529"/>
+          <w:sz w:val="22"/>
+          <w:szCs w:val="22"/>
+        </w:rPr>
+        <w:t xml:space="preserve">Ouvre ton navigateur et accède à l'URL de l'application (fournie par ton administrateur).</w:t>
+      </w:r>
+    </w:p>
+    <w:p>
+      <w:pPr>
+        <w:pStyle w:val="ListParagraph"/>
+        <w:numPr>
+          <w:ilvl w:val="0"/>
+          <w:numId w:val="2"/>
+        </w:numPr>
+        <w:spacing w:after="40" w:before="40"/>
+      </w:pPr>
+      <w:r>
+        <w:rPr>
+          <w:rFonts w:ascii="Arial" w:cs="Arial" w:eastAsia="Arial" w:hAnsi="Arial"/>
+          <w:color w:val="212529"/>
+          <w:sz w:val="22"/>
+          <w:szCs w:val="22"/>
+        </w:rPr>
+        <w:t xml:space="preserve">Saisis ton adresse email et ton mot de passe, puis clique sur Connexion.</w:t>
+      </w:r>
+    </w:p>
+    <w:p>
+      <w:pPr>
+        <w:pStyle w:val="ListParagraph"/>
+        <w:numPr>
+          <w:ilvl w:val="0"/>
+          <w:numId w:val="2"/>
+        </w:numPr>
+        <w:spacing w:after="40" w:before="40"/>
+      </w:pPr>
+      <w:r>
+        <w:rPr>
+          <w:rFonts w:ascii="Arial" w:cs="Arial" w:eastAsia="Arial" w:hAnsi="Arial"/>
+          <w:color w:val="212529"/>
+          <w:sz w:val="22"/>
+          <w:szCs w:val="22"/>
+        </w:rPr>
+        <w:t xml:space="preserve">Si tu as oublié ton mot de passe : clique sur "Mot de passe oublié" → un email de réinitialisation te sera envoyé.</w:t>
+      </w:r>
+    </w:p>
+    <w:p>
+      <w:pPr>
+        <w:pBdr>
+          <w:left w:val="single" w:color="3B5BDB" w:sz="8" w:space="8"/>
+        </w:pBdr>
+        <w:spacing w:after="80" w:before="80"/>
+        <w:ind w:left="360"/>
+      </w:pPr>
+      <w:r>
+        <w:rPr>
+          <w:rFonts w:ascii="Arial" w:cs="Arial" w:eastAsia="Arial" w:hAnsi="Arial"/>
+          <w:sz w:val="22"/>
+          <w:szCs w:val="22"/>
+        </w:rPr>
+        <w:t xml:space="preserve">💡 </w:t>
+      </w:r>
+      <w:r>
+        <w:rPr>
+          <w:rFonts w:ascii="Arial" w:cs="Arial" w:eastAsia="Arial" w:hAnsi="Arial"/>
+          <w:i/>
+          <w:iCs/>
+          <w:color w:val="1971C2"/>
+          <w:sz w:val="22"/>
+          <w:szCs w:val="22"/>
+        </w:rPr>
+        <w:t xml:space="preserve">L'application fonctionne sur tous les navigateurs modernes (Chrome, Firefox, Safari, Edge). Aucune installation requise.</w:t>
+      </w:r>
+    </w:p>
+    <w:p>
+      <w:pPr>
+        <w:pStyle w:val="Heading2"/>
+        <w:spacing w:after="120" w:before="280"/>
+      </w:pPr>
+      <w:r>
+        <w:rPr>
+          <w:rFonts w:ascii="Arial" w:cs="Arial" w:eastAsia="Arial" w:hAnsi="Arial"/>
+          <w:b/>
+          <w:bCs/>
+          <w:color w:val="1971C2"/>
+          <w:sz w:val="26"/>
+          <w:szCs w:val="26"/>
+        </w:rPr>
+        <w:t xml:space="preserve">1.2 Découvrir l'interface</w:t>
+      </w:r>
+    </w:p>
+    <w:p>
+      <w:pPr>
+        <w:spacing w:after="100" w:before="60"/>
+      </w:pPr>
+      <w:r>
+        <w:rPr>
+          <w:rFonts w:ascii="Arial" w:cs="Arial" w:eastAsia="Arial" w:hAnsi="Arial"/>
+          <w:b w:val="false"/>
+          <w:bCs w:val="false"/>
+          <w:i w:val="false"/>
+          <w:iCs w:val="false"/>
+          <w:color w:val="212529"/>
+          <w:sz w:val="22"/>
+          <w:szCs w:val="22"/>
+        </w:rPr>
+        <w:t xml:space="preserve">L'interface s'adapte automatiquement à ton écran :</w:t>
+      </w:r>
+    </w:p>
+    <w:p>
+      <w:pPr>
+        <w:pStyle w:val="ListParagraph"/>
+        <w:numPr>
+          <w:ilvl w:val="0"/>
+          <w:numId w:val="3"/>
+        </w:numPr>
+        <w:spacing w:after="40" w:before="40"/>
+      </w:pPr>
+      <w:r>
+        <w:rPr>
+          <w:rFonts w:ascii="Arial" w:cs="Arial" w:eastAsia="Arial" w:hAnsi="Arial"/>
+          <w:color w:val="212529"/>
+          <w:sz w:val="22"/>
+          <w:szCs w:val="22"/>
+        </w:rPr>
+        <w:t xml:space="preserve">Sur desktop/tablette : une barre latérale (sidebar) à gauche contient tous les liens de navigation et la cloche de notifications.</w:t>
+      </w:r>
+    </w:p>
+    <w:p>
+      <w:pPr>
+        <w:pStyle w:val="ListParagraph"/>
+        <w:numPr>
+          <w:ilvl w:val="0"/>
+          <w:numId w:val="3"/>
+        </w:numPr>
+        <w:spacing w:after="40" w:before="40"/>
+      </w:pPr>
+      <w:r>
+        <w:rPr>
+          <w:rFonts w:ascii="Arial" w:cs="Arial" w:eastAsia="Arial" w:hAnsi="Arial"/>
+          <w:color w:val="212529"/>
+          <w:sz w:val="22"/>
+          <w:szCs w:val="22"/>
+        </w:rPr>
+        <w:t xml:space="preserve">Sur mobile : la navigation se trouve en bas de l'écran (barre d'icônes). La cloche de notifications est accessible en haut à droite.</w:t>
+      </w:r>
+    </w:p>
+    <w:p>
+      <w:pPr>
+        <w:pStyle w:val="Heading2"/>
+        <w:spacing w:after="120" w:before="280"/>
+      </w:pPr>
+      <w:r>
+        <w:rPr>
+          <w:rFonts w:ascii="Arial" w:cs="Arial" w:eastAsia="Arial" w:hAnsi="Arial"/>
+          <w:b/>
+          <w:bCs/>
+          <w:color w:val="1971C2"/>
+          <w:sz w:val="26"/>
+          <w:szCs w:val="26"/>
+        </w:rPr>
+        <w:t xml:space="preserve">1.3 Pages accessibles au médecin</w:t>
+      </w:r>
+    </w:p>
+    <w:p>
+      <w:pPr>
+        <w:spacing w:after="120" w:before="0"/>
+      </w:pPr>
+    </w:p>
+    <w:tbl>
+      <w:tblPr>
+        <w:tblW w:type="dxa" w:w="9000"/>
+        <w:tblBorders>
+          <w:top w:val="single" w:color="auto" w:sz="4"/>
+          <w:left w:val="single" w:color="auto" w:sz="4"/>
+          <w:bottom w:val="single" w:color="auto" w:sz="4"/>
+          <w:right w:val="single" w:color="auto" w:sz="4"/>
+          <w:insideH w:val="single" w:color="auto" w:sz="4"/>
+          <w:insideV w:val="single" w:color="auto" w:sz="4"/>
+        </w:tblBorders>
+      </w:tblPr>
+      <w:tblGrid>
+        <w:gridCol w:w="3400"/>
+        <w:gridCol w:w="2200"/>
+        <w:gridCol w:w="3400"/>
+      </w:tblGrid>
+      <w:tr>
+        <w:trPr>
+          <w:tblHeader/>
+        </w:trPr>
+        <w:tc>
+          <w:tcPr>
+            <w:tcW w:type="dxa" w:w="3400"/>
+            <w:tcBorders>
+              <w:top w:val="single" w:color="3B5BDB" w:sz="1"/>
+              <w:left w:val="single" w:color="3B5BDB" w:sz="1"/>
+              <w:bottom w:val="single" w:color="3B5BDB" w:sz="1"/>
+              <w:right w:val="single" w:color="3B5BDB" w:sz="1"/>
+            </w:tcBorders>
+            <w:shd w:fill="1E3A5F" w:val="clear"/>
+            <w:tcMar>
+              <w:top w:type="dxa" w:w="80"/>
+              <w:left w:type="dxa" w:w="140"/>
+              <w:bottom w:type="dxa" w:w="80"/>
+              <w:right w:type="dxa" w:w="140"/>
+            </w:tcMar>
+          </w:tcPr>
+          <w:p>
+            <w:pPr>
+              <w:spacing w:after="0" w:before="0"/>
+            </w:pPr>
+            <w:r>
+              <w:rPr>
+                <w:rFonts w:ascii="Arial" w:cs="Arial" w:eastAsia="Arial" w:hAnsi="Arial"/>
+                <w:b/>
+                <w:bCs/>
+                <w:color w:val="FFFFFF"/>
+                <w:sz w:val="20"/>
+                <w:szCs w:val="20"/>
+              </w:rPr>
+              <w:t xml:space="preserve">Page</w:t>
+            </w:r>
+          </w:p>
+        </w:tc>
+        <w:tc>
+          <w:tcPr>
+            <w:tcW w:type="dxa" w:w="2200"/>
+            <w:tcBorders>
+              <w:top w:val="single" w:color="3B5BDB" w:sz="1"/>
+              <w:left w:val="single" w:color="3B5BDB" w:sz="1"/>
+              <w:bottom w:val="single" w:color="3B5BDB" w:sz="1"/>
+              <w:right w:val="single" w:color="3B5BDB" w:sz="1"/>
+            </w:tcBorders>
+            <w:shd w:fill="1E3A5F" w:val="clear"/>
+            <w:tcMar>
+              <w:top w:type="dxa" w:w="80"/>
+              <w:left w:type="dxa" w:w="140"/>
+              <w:bottom w:type="dxa" w:w="80"/>
+              <w:right w:type="dxa" w:w="140"/>
+            </w:tcMar>
+          </w:tcPr>
+          <w:p>
+            <w:pPr>
+              <w:spacing w:after="0" w:before="0"/>
+            </w:pPr>
+            <w:r>
+              <w:rPr>
+                <w:rFonts w:ascii="Arial" w:cs="Arial" w:eastAsia="Arial" w:hAnsi="Arial"/>
+                <w:b/>
+                <w:bCs/>
+                <w:color w:val="FFFFFF"/>
+                <w:sz w:val="20"/>
+                <w:szCs w:val="20"/>
+              </w:rPr>
+              <w:t xml:space="preserve">Accès</w:t>
+            </w:r>
+          </w:p>
+        </w:tc>
+        <w:tc>
+          <w:tcPr>
+            <w:tcW w:type="dxa" w:w="3400"/>
+            <w:tcBorders>
+              <w:top w:val="single" w:color="3B5BDB" w:sz="1"/>
+              <w:left w:val="single" w:color="3B5BDB" w:sz="1"/>
+              <w:bottom w:val="single" w:color="3B5BDB" w:sz="1"/>
+              <w:right w:val="single" w:color="3B5BDB" w:sz="1"/>
+            </w:tcBorders>
+            <w:shd w:fill="1E3A5F" w:val="clear"/>
+            <w:tcMar>
+              <w:top w:type="dxa" w:w="80"/>
+              <w:left w:type="dxa" w:w="140"/>
+              <w:bottom w:type="dxa" w:w="80"/>
+              <w:right w:type="dxa" w:w="140"/>
+            </w:tcMar>
+          </w:tcPr>
+          <w:p>
+            <w:pPr>
+              <w:spacing w:after="0" w:before="0"/>
+            </w:pPr>
+            <w:r>
+              <w:rPr>
+                <w:rFonts w:ascii="Arial" w:cs="Arial" w:eastAsia="Arial" w:hAnsi="Arial"/>
+                <w:b/>
+                <w:bCs/>
+                <w:color w:val="FFFFFF"/>
+                <w:sz w:val="20"/>
+                <w:szCs w:val="20"/>
+              </w:rPr>
+              <w:t xml:space="preserve">Rôle</w:t>
+            </w:r>
+          </w:p>
+        </w:tc>
+      </w:tr>
+      <w:tr>
+        <w:tc>
+          <w:tcPr>
+            <w:tcW w:type="dxa" w:w="3400"/>
+            <w:tcBorders>
+              <w:top w:val="single" w:color="C5D3E8" w:sz="1"/>
+              <w:left w:val="single" w:color="C5D3E8" w:sz="1"/>
+              <w:bottom w:val="single" w:color="C5D3E8" w:sz="1"/>
+              <w:right w:val="single" w:color="C5D3E8" w:sz="1"/>
+            </w:tcBorders>
+            <w:shd w:fill="FFFFFF" w:val="clear"/>
+            <w:tcMar>
+              <w:top w:type="dxa" w:w="80"/>
+              <w:left w:type="dxa" w:w="140"/>
+              <w:bottom w:type="dxa" w:w="80"/>
+              <w:right w:type="dxa" w:w="140"/>
+            </w:tcMar>
+          </w:tcPr>
+          <w:p>
+            <w:pPr>
+              <w:spacing w:after="0" w:before="0"/>
+            </w:pPr>
+            <w:r>
+              <w:rPr>
+                <w:rFonts w:ascii="Arial" w:cs="Arial" w:eastAsia="Arial" w:hAnsi="Arial"/>
+                <w:color w:val="212529"/>
+                <w:sz w:val="20"/>
+                <w:szCs w:val="20"/>
+              </w:rPr>
+              <w:t xml:space="preserve">Tableau de bord</w:t>
+            </w:r>
+          </w:p>
+        </w:tc>
+        <w:tc>
+          <w:tcPr>
+            <w:tcW w:type="dxa" w:w="2200"/>
+            <w:tcBorders>
+              <w:top w:val="single" w:color="C5D3E8" w:sz="1"/>
+              <w:left w:val="single" w:color="C5D3E8" w:sz="1"/>
+              <w:bottom w:val="single" w:color="C5D3E8" w:sz="1"/>
+              <w:right w:val="single" w:color="C5D3E8" w:sz="1"/>
+            </w:tcBorders>
+            <w:shd w:fill="FFFFFF" w:val="clear"/>
+            <w:tcMar>
+              <w:top w:type="dxa" w:w="80"/>
+              <w:left w:type="dxa" w:w="140"/>
+              <w:bottom w:type="dxa" w:w="80"/>
+              <w:right w:type="dxa" w:w="140"/>
+            </w:tcMar>
+          </w:tcPr>
+          <w:p>
+            <w:pPr>
+              <w:spacing w:after="0" w:before="0"/>
+            </w:pPr>
+            <w:r>
+              <w:rPr>
+                <w:rFonts w:ascii="Arial" w:cs="Arial" w:eastAsia="Arial" w:hAnsi="Arial"/>
+                <w:color w:val="212529"/>
+                <w:sz w:val="20"/>
+                <w:szCs w:val="20"/>
+              </w:rPr>
+              <w:t xml:space="preserve">Toujours</w:t>
+            </w:r>
+          </w:p>
+        </w:tc>
+        <w:tc>
+          <w:tcPr>
+            <w:tcW w:type="dxa" w:w="3400"/>
+            <w:tcBorders>
+              <w:top w:val="single" w:color="C5D3E8" w:sz="1"/>
+              <w:left w:val="single" w:color="C5D3E8" w:sz="1"/>
+              <w:bottom w:val="single" w:color="C5D3E8" w:sz="1"/>
+              <w:right w:val="single" w:color="C5D3E8" w:sz="1"/>
+            </w:tcBorders>
+            <w:shd w:fill="FFFFFF" w:val="clear"/>
+            <w:tcMar>
+              <w:top w:type="dxa" w:w="80"/>
+              <w:left w:type="dxa" w:w="140"/>
+              <w:bottom w:type="dxa" w:w="80"/>
+              <w:right w:type="dxa" w:w="140"/>
+            </w:tcMar>
+          </w:tcPr>
+          <w:p>
+            <w:pPr>
+              <w:spacing w:after="0" w:before="0"/>
+            </w:pPr>
+            <w:r>
+              <w:rPr>
+                <w:rFonts w:ascii="Arial" w:cs="Arial" w:eastAsia="Arial" w:hAnsi="Arial"/>
+                <w:color w:val="212529"/>
+                <w:sz w:val="20"/>
+                <w:szCs w:val="20"/>
+              </w:rPr>
+              <w:t xml:space="preserve">Vue générale de la semaine</w:t>
+            </w:r>
+          </w:p>
+        </w:tc>
+      </w:tr>
+      <w:tr>
+        <w:tc>
+          <w:tcPr>
+            <w:tcW w:type="dxa" w:w="3400"/>
+            <w:tcBorders>
+              <w:top w:val="single" w:color="C5D3E8" w:sz="1"/>
+              <w:left w:val="single" w:color="C5D3E8" w:sz="1"/>
+              <w:bottom w:val="single" w:color="C5D3E8" w:sz="1"/>
+              <w:right w:val="single" w:color="C5D3E8" w:sz="1"/>
+            </w:tcBorders>
+            <w:shd w:fill="F1F3F9" w:val="clear"/>
+            <w:tcMar>
+              <w:top w:type="dxa" w:w="80"/>
+              <w:left w:type="dxa" w:w="140"/>
+              <w:bottom w:type="dxa" w:w="80"/>
+              <w:right w:type="dxa" w:w="140"/>
+            </w:tcMar>
+          </w:tcPr>
+          <w:p>
+            <w:pPr>
+              <w:spacing w:after="0" w:before="0"/>
+            </w:pPr>
+            <w:r>
+              <w:rPr>
+                <w:rFonts w:ascii="Arial" w:cs="Arial" w:eastAsia="Arial" w:hAnsi="Arial"/>
+                <w:color w:val="212529"/>
+                <w:sz w:val="20"/>
+                <w:szCs w:val="20"/>
+              </w:rPr>
+              <w:t xml:space="preserve">Mon Planning</w:t>
+            </w:r>
+          </w:p>
+        </w:tc>
+        <w:tc>
+          <w:tcPr>
+            <w:tcW w:type="dxa" w:w="2200"/>
+            <w:tcBorders>
+              <w:top w:val="single" w:color="C5D3E8" w:sz="1"/>
+              <w:left w:val="single" w:color="C5D3E8" w:sz="1"/>
+              <w:bottom w:val="single" w:color="C5D3E8" w:sz="1"/>
+              <w:right w:val="single" w:color="C5D3E8" w:sz="1"/>
+            </w:tcBorders>
+            <w:shd w:fill="F1F3F9" w:val="clear"/>
+            <w:tcMar>
+              <w:top w:type="dxa" w:w="80"/>
+              <w:left w:type="dxa" w:w="140"/>
+              <w:bottom w:type="dxa" w:w="80"/>
+              <w:right w:type="dxa" w:w="140"/>
+            </w:tcMar>
+          </w:tcPr>
+          <w:p>
+            <w:pPr>
+              <w:spacing w:after="0" w:before="0"/>
+            </w:pPr>
+            <w:r>
+              <w:rPr>
+                <w:rFonts w:ascii="Arial" w:cs="Arial" w:eastAsia="Arial" w:hAnsi="Arial"/>
+                <w:color w:val="212529"/>
+                <w:sz w:val="20"/>
+                <w:szCs w:val="20"/>
+              </w:rPr>
+              <w:t xml:space="preserve">Toujours</w:t>
+            </w:r>
+          </w:p>
+        </w:tc>
+        <w:tc>
+          <w:tcPr>
+            <w:tcW w:type="dxa" w:w="3400"/>
+            <w:tcBorders>
+              <w:top w:val="single" w:color="C5D3E8" w:sz="1"/>
+              <w:left w:val="single" w:color="C5D3E8" w:sz="1"/>
+              <w:bottom w:val="single" w:color="C5D3E8" w:sz="1"/>
+              <w:right w:val="single" w:color="C5D3E8" w:sz="1"/>
+            </w:tcBorders>
+            <w:shd w:fill="F1F3F9" w:val="clear"/>
+            <w:tcMar>
+              <w:top w:type="dxa" w:w="80"/>
+              <w:left w:type="dxa" w:w="140"/>
+              <w:bottom w:type="dxa" w:w="80"/>
+              <w:right w:type="dxa" w:w="140"/>
+            </w:tcMar>
+          </w:tcPr>
+          <w:p>
+            <w:pPr>
+              <w:spacing w:after="0" w:before="0"/>
+            </w:pPr>
+            <w:r>
+              <w:rPr>
+                <w:rFonts w:ascii="Arial" w:cs="Arial" w:eastAsia="Arial" w:hAnsi="Arial"/>
+                <w:color w:val="212529"/>
+                <w:sz w:val="20"/>
+                <w:szCs w:val="20"/>
+              </w:rPr>
+              <w:t xml:space="preserve">Ton agenda personnel semaine/mois</w:t>
+            </w:r>
+          </w:p>
+        </w:tc>
+      </w:tr>
+      <w:tr>
+        <w:tc>
+          <w:tcPr>
+            <w:tcW w:type="dxa" w:w="3400"/>
+            <w:tcBorders>
+              <w:top w:val="single" w:color="C5D3E8" w:sz="1"/>
+              <w:left w:val="single" w:color="C5D3E8" w:sz="1"/>
+              <w:bottom w:val="single" w:color="C5D3E8" w:sz="1"/>
+              <w:right w:val="single" w:color="C5D3E8" w:sz="1"/>
+            </w:tcBorders>
+            <w:shd w:fill="FFFFFF" w:val="clear"/>
+            <w:tcMar>
+              <w:top w:type="dxa" w:w="80"/>
+              <w:left w:type="dxa" w:w="140"/>
+              <w:bottom w:type="dxa" w:w="80"/>
+              <w:right w:type="dxa" w:w="140"/>
+            </w:tcMar>
+          </w:tcPr>
+          <w:p>
+            <w:pPr>
+              <w:spacing w:after="0" w:before="0"/>
+            </w:pPr>
+            <w:r>
+              <w:rPr>
+                <w:rFonts w:ascii="Arial" w:cs="Arial" w:eastAsia="Arial" w:hAnsi="Arial"/>
+                <w:color w:val="212529"/>
+                <w:sz w:val="20"/>
+                <w:szCs w:val="20"/>
+              </w:rPr>
+              <w:t xml:space="preserve">Planning Global</w:t>
+            </w:r>
+          </w:p>
+        </w:tc>
+        <w:tc>
+          <w:tcPr>
+            <w:tcW w:type="dxa" w:w="2200"/>
+            <w:tcBorders>
+              <w:top w:val="single" w:color="C5D3E8" w:sz="1"/>
+              <w:left w:val="single" w:color="C5D3E8" w:sz="1"/>
+              <w:bottom w:val="single" w:color="C5D3E8" w:sz="1"/>
+              <w:right w:val="single" w:color="C5D3E8" w:sz="1"/>
+            </w:tcBorders>
+            <w:shd w:fill="FFFFFF" w:val="clear"/>
+            <w:tcMar>
+              <w:top w:type="dxa" w:w="80"/>
+              <w:left w:type="dxa" w:w="140"/>
+              <w:bottom w:type="dxa" w:w="80"/>
+              <w:right w:type="dxa" w:w="140"/>
+            </w:tcMar>
+          </w:tcPr>
+          <w:p>
+            <w:pPr>
+              <w:spacing w:after="0" w:before="0"/>
+            </w:pPr>
+            <w:r>
+              <w:rPr>
+                <w:rFonts w:ascii="Arial" w:cs="Arial" w:eastAsia="Arial" w:hAnsi="Arial"/>
+                <w:color w:val="212529"/>
+                <w:sz w:val="20"/>
+                <w:szCs w:val="20"/>
+              </w:rPr>
+              <w:t xml:space="preserve">Si autorisé par l'admin</w:t>
+            </w:r>
+          </w:p>
+        </w:tc>
+        <w:tc>
+          <w:tcPr>
+            <w:tcW w:type="dxa" w:w="3400"/>
+            <w:tcBorders>
+              <w:top w:val="single" w:color="C5D3E8" w:sz="1"/>
+              <w:left w:val="single" w:color="C5D3E8" w:sz="1"/>
+              <w:bottom w:val="single" w:color="C5D3E8" w:sz="1"/>
+              <w:right w:val="single" w:color="C5D3E8" w:sz="1"/>
+            </w:tcBorders>
+            <w:shd w:fill="FFFFFF" w:val="clear"/>
+            <w:tcMar>
+              <w:top w:type="dxa" w:w="80"/>
+              <w:left w:type="dxa" w:w="140"/>
+              <w:bottom w:type="dxa" w:w="80"/>
+              <w:right w:type="dxa" w:w="140"/>
+            </w:tcMar>
+          </w:tcPr>
+          <w:p>
+            <w:pPr>
+              <w:spacing w:after="0" w:before="0"/>
+            </w:pPr>
+            <w:r>
+              <w:rPr>
+                <w:rFonts w:ascii="Arial" w:cs="Arial" w:eastAsia="Arial" w:hAnsi="Arial"/>
+                <w:color w:val="212529"/>
+                <w:sz w:val="20"/>
+                <w:szCs w:val="20"/>
+              </w:rPr>
+              <w:t xml:space="preserve">Planning de toute l'équipe</w:t>
+            </w:r>
+          </w:p>
+        </w:tc>
+      </w:tr>
+      <w:tr>
+        <w:tc>
+          <w:tcPr>
+            <w:tcW w:type="dxa" w:w="3400"/>
+            <w:tcBorders>
+              <w:top w:val="single" w:color="C5D3E8" w:sz="1"/>
+              <w:left w:val="single" w:color="C5D3E8" w:sz="1"/>
+              <w:bottom w:val="single" w:color="C5D3E8" w:sz="1"/>
+              <w:right w:val="single" w:color="C5D3E8" w:sz="1"/>
+            </w:tcBorders>
+            <w:shd w:fill="F1F3F9" w:val="clear"/>
+            <w:tcMar>
+              <w:top w:type="dxa" w:w="80"/>
+              <w:left w:type="dxa" w:w="140"/>
+              <w:bottom w:type="dxa" w:w="80"/>
+              <w:right w:type="dxa" w:w="140"/>
+            </w:tcMar>
+          </w:tcPr>
+          <w:p>
+            <w:pPr>
+              <w:spacing w:after="0" w:before="0"/>
+            </w:pPr>
+            <w:r>
+              <w:rPr>
+                <w:rFonts w:ascii="Arial" w:cs="Arial" w:eastAsia="Arial" w:hAnsi="Arial"/>
+                <w:color w:val="212529"/>
+                <w:sz w:val="20"/>
+                <w:szCs w:val="20"/>
+              </w:rPr>
+              <w:t xml:space="preserve">Activités</w:t>
+            </w:r>
+          </w:p>
+        </w:tc>
+        <w:tc>
+          <w:tcPr>
+            <w:tcW w:type="dxa" w:w="2200"/>
+            <w:tcBorders>
+              <w:top w:val="single" w:color="C5D3E8" w:sz="1"/>
+              <w:left w:val="single" w:color="C5D3E8" w:sz="1"/>
+              <w:bottom w:val="single" w:color="C5D3E8" w:sz="1"/>
+              <w:right w:val="single" w:color="C5D3E8" w:sz="1"/>
+            </w:tcBorders>
+            <w:shd w:fill="F1F3F9" w:val="clear"/>
+            <w:tcMar>
+              <w:top w:type="dxa" w:w="80"/>
+              <w:left w:type="dxa" w:w="140"/>
+              <w:bottom w:type="dxa" w:w="80"/>
+              <w:right w:type="dxa" w:w="140"/>
+            </w:tcMar>
+          </w:tcPr>
+          <w:p>
+            <w:pPr>
+              <w:spacing w:after="0" w:before="0"/>
+            </w:pPr>
+            <w:r>
+              <w:rPr>
+                <w:rFonts w:ascii="Arial" w:cs="Arial" w:eastAsia="Arial" w:hAnsi="Arial"/>
+                <w:color w:val="212529"/>
+                <w:sz w:val="20"/>
+                <w:szCs w:val="20"/>
+              </w:rPr>
+              <w:t xml:space="preserve">Toujours</w:t>
+            </w:r>
+          </w:p>
+        </w:tc>
+        <w:tc>
+          <w:tcPr>
+            <w:tcW w:type="dxa" w:w="3400"/>
+            <w:tcBorders>
+              <w:top w:val="single" w:color="C5D3E8" w:sz="1"/>
+              <w:left w:val="single" w:color="C5D3E8" w:sz="1"/>
+              <w:bottom w:val="single" w:color="C5D3E8" w:sz="1"/>
+              <w:right w:val="single" w:color="C5D3E8" w:sz="1"/>
+            </w:tcBorders>
+            <w:shd w:fill="F1F3F9" w:val="clear"/>
+            <w:tcMar>
+              <w:top w:type="dxa" w:w="80"/>
+              <w:left w:type="dxa" w:w="140"/>
+              <w:bottom w:type="dxa" w:w="80"/>
+              <w:right w:type="dxa" w:w="140"/>
+            </w:tcMar>
+          </w:tcPr>
+          <w:p>
+            <w:pPr>
+              <w:spacing w:after="0" w:before="0"/>
+            </w:pPr>
+            <w:r>
+              <w:rPr>
+                <w:rFonts w:ascii="Arial" w:cs="Arial" w:eastAsia="Arial" w:hAnsi="Arial"/>
+                <w:color w:val="212529"/>
+                <w:sz w:val="20"/>
+                <w:szCs w:val="20"/>
+              </w:rPr>
+              <w:t xml:space="preserve">Répartition des gardes et activités</w:t>
+            </w:r>
+          </w:p>
+        </w:tc>
+      </w:tr>
+      <w:tr>
+        <w:tc>
+          <w:tcPr>
+            <w:tcW w:type="dxa" w:w="3400"/>
+            <w:tcBorders>
+              <w:top w:val="single" w:color="C5D3E8" w:sz="1"/>
+              <w:left w:val="single" w:color="C5D3E8" w:sz="1"/>
+              <w:bottom w:val="single" w:color="C5D3E8" w:sz="1"/>
+              <w:right w:val="single" w:color="C5D3E8" w:sz="1"/>
+            </w:tcBorders>
+            <w:shd w:fill="FFFFFF" w:val="clear"/>
+            <w:tcMar>
+              <w:top w:type="dxa" w:w="80"/>
+              <w:left w:type="dxa" w:w="140"/>
+              <w:bottom w:type="dxa" w:w="80"/>
+              <w:right w:type="dxa" w:w="140"/>
+            </w:tcMar>
+          </w:tcPr>
+          <w:p>
+            <w:pPr>
+              <w:spacing w:after="0" w:before="0"/>
+            </w:pPr>
+            <w:r>
+              <w:rPr>
+                <w:rFonts w:ascii="Arial" w:cs="Arial" w:eastAsia="Arial" w:hAnsi="Arial"/>
+                <w:color w:val="212529"/>
+                <w:sz w:val="20"/>
+                <w:szCs w:val="20"/>
+              </w:rPr>
+              <w:t xml:space="preserve">Mon Profil</w:t>
+            </w:r>
+          </w:p>
+        </w:tc>
+        <w:tc>
+          <w:tcPr>
+            <w:tcW w:type="dxa" w:w="2200"/>
+            <w:tcBorders>
+              <w:top w:val="single" w:color="C5D3E8" w:sz="1"/>
+              <w:left w:val="single" w:color="C5D3E8" w:sz="1"/>
+              <w:bottom w:val="single" w:color="C5D3E8" w:sz="1"/>
+              <w:right w:val="single" w:color="C5D3E8" w:sz="1"/>
+            </w:tcBorders>
+            <w:shd w:fill="FFFFFF" w:val="clear"/>
+            <w:tcMar>
+              <w:top w:type="dxa" w:w="80"/>
+              <w:left w:type="dxa" w:w="140"/>
+              <w:bottom w:type="dxa" w:w="80"/>
+              <w:right w:type="dxa" w:w="140"/>
+            </w:tcMar>
+          </w:tcPr>
+          <w:p>
+            <w:pPr>
+              <w:spacing w:after="0" w:before="0"/>
+            </w:pPr>
+            <w:r>
+              <w:rPr>
+                <w:rFonts w:ascii="Arial" w:cs="Arial" w:eastAsia="Arial" w:hAnsi="Arial"/>
+                <w:color w:val="212529"/>
+                <w:sz w:val="20"/>
+                <w:szCs w:val="20"/>
+              </w:rPr>
+              <w:t xml:space="preserve">Toujours</w:t>
+            </w:r>
+          </w:p>
+        </w:tc>
+        <w:tc>
+          <w:tcPr>
+            <w:tcW w:type="dxa" w:w="3400"/>
+            <w:tcBorders>
+              <w:top w:val="single" w:color="C5D3E8" w:sz="1"/>
+              <w:left w:val="single" w:color="C5D3E8" w:sz="1"/>
+              <w:bottom w:val="single" w:color="C5D3E8" w:sz="1"/>
+              <w:right w:val="single" w:color="C5D3E8" w:sz="1"/>
+            </w:tcBorders>
+            <w:shd w:fill="FFFFFF" w:val="clear"/>
+            <w:tcMar>
+              <w:top w:type="dxa" w:w="80"/>
+              <w:left w:type="dxa" w:w="140"/>
+              <w:bottom w:type="dxa" w:w="80"/>
+              <w:right w:type="dxa" w:w="140"/>
+            </w:tcMar>
+          </w:tcPr>
+          <w:p>
+            <w:pPr>
+              <w:spacing w:after="0" w:before="0"/>
+            </w:pPr>
+            <w:r>
+              <w:rPr>
+                <w:rFonts w:ascii="Arial" w:cs="Arial" w:eastAsia="Arial" w:hAnsi="Arial"/>
+                <w:color w:val="212529"/>
+                <w:sz w:val="20"/>
+                <w:szCs w:val="20"/>
+              </w:rPr>
+              <w:t xml:space="preserve">Absences, préférences, notifications</w:t>
+            </w:r>
+          </w:p>
+        </w:tc>
+      </w:tr>
+    </w:tbl>
+    <w:p>
+      <w:pPr>
+        <w:spacing w:after="160" w:before="0"/>
+      </w:pPr>
+    </w:p>
+    <w:p>
+      <w:pPr>
+        <w:pStyle w:val="Heading2"/>
+        <w:spacing w:after="120" w:before="280"/>
+      </w:pPr>
+      <w:r>
+        <w:rPr>
+          <w:rFonts w:ascii="Arial" w:cs="Arial" w:eastAsia="Arial" w:hAnsi="Arial"/>
+          <w:b/>
+          <w:bCs/>
+          <w:color w:val="1971C2"/>
+          <w:sz w:val="26"/>
+          <w:szCs w:val="26"/>
+        </w:rPr>
+        <w:t xml:space="preserve">1.4 Installer l'app sur mobile (optionnel)</w:t>
+      </w:r>
+    </w:p>
+    <w:p>
+      <w:pPr>
+        <w:spacing w:after="100" w:before="60"/>
+      </w:pPr>
+      <w:r>
+        <w:rPr>
+          <w:rFonts w:ascii="Arial" w:cs="Arial" w:eastAsia="Arial" w:hAnsi="Arial"/>
+          <w:b w:val="false"/>
+          <w:bCs w:val="false"/>
+          <w:i w:val="false"/>
+          <w:iCs w:val="false"/>
+          <w:color w:val="212529"/>
+          <w:sz w:val="22"/>
+          <w:szCs w:val="22"/>
+        </w:rPr>
+        <w:t xml:space="preserve">RadioPlan AI peut fonctionner comme une application native sur ton smartphone :</w:t>
+      </w:r>
+    </w:p>
+    <w:p>
+      <w:pPr>
+        <w:spacing w:after="100" w:before="60"/>
+      </w:pPr>
+      <w:r>
+        <w:rPr>
+          <w:rFonts w:ascii="Arial" w:cs="Arial" w:eastAsia="Arial" w:hAnsi="Arial"/>
+          <w:b/>
+          <w:bCs/>
+          <w:i w:val="false"/>
+          <w:iCs w:val="false"/>
+          <w:color w:val="212529"/>
+          <w:sz w:val="22"/>
+          <w:szCs w:val="22"/>
+        </w:rPr>
+        <w:t xml:space="preserve">Sur iPhone/iPad (Safari) :</w:t>
+      </w:r>
+    </w:p>
+    <w:p>
+      <w:pPr>
+        <w:pStyle w:val="ListParagraph"/>
+        <w:numPr>
+          <w:ilvl w:val="0"/>
+          <w:numId w:val="2"/>
+        </w:numPr>
+        <w:spacing w:after="40" w:before="40"/>
+      </w:pPr>
+      <w:r>
+        <w:rPr>
+          <w:rFonts w:ascii="Arial" w:cs="Arial" w:eastAsia="Arial" w:hAnsi="Arial"/>
+          <w:color w:val="212529"/>
+          <w:sz w:val="22"/>
+          <w:szCs w:val="22"/>
+        </w:rPr>
+        <w:t xml:space="preserve">Tap le bouton "Partager" (carré avec flèche vers le haut).</w:t>
+      </w:r>
+    </w:p>
+    <w:p>
+      <w:pPr>
+        <w:pStyle w:val="ListParagraph"/>
+        <w:numPr>
+          <w:ilvl w:val="0"/>
+          <w:numId w:val="2"/>
+        </w:numPr>
+        <w:spacing w:after="40" w:before="40"/>
+      </w:pPr>
+      <w:r>
+        <w:rPr>
+          <w:rFonts w:ascii="Arial" w:cs="Arial" w:eastAsia="Arial" w:hAnsi="Arial"/>
+          <w:color w:val="212529"/>
+          <w:sz w:val="22"/>
+          <w:szCs w:val="22"/>
+        </w:rPr>
+        <w:t xml:space="preserve">Choisis "Sur l'écran d'accueil".</w:t>
+      </w:r>
+    </w:p>
+    <w:p>
+      <w:pPr>
+        <w:pStyle w:val="ListParagraph"/>
+        <w:numPr>
+          <w:ilvl w:val="0"/>
+          <w:numId w:val="2"/>
+        </w:numPr>
+        <w:spacing w:after="40" w:before="40"/>
+      </w:pPr>
+      <w:r>
+        <w:rPr>
+          <w:rFonts w:ascii="Arial" w:cs="Arial" w:eastAsia="Arial" w:hAnsi="Arial"/>
+          <w:color w:val="212529"/>
+          <w:sz w:val="22"/>
+          <w:szCs w:val="22"/>
+        </w:rPr>
+        <w:t xml:space="preserve">Confirme → l'icône RadioPlan AI apparaît sur ton écran d'accueil.</w:t>
+      </w:r>
+    </w:p>
+    <w:p>
+      <w:pPr>
+        <w:spacing w:after="100" w:before="60"/>
+      </w:pPr>
+      <w:r>
+        <w:rPr>
+          <w:rFonts w:ascii="Arial" w:cs="Arial" w:eastAsia="Arial" w:hAnsi="Arial"/>
+          <w:b/>
+          <w:bCs/>
+          <w:i w:val="false"/>
+          <w:iCs w:val="false"/>
+          <w:color w:val="212529"/>
+          <w:sz w:val="22"/>
+          <w:szCs w:val="22"/>
+        </w:rPr>
+        <w:t xml:space="preserve">Sur Android (Chrome) :</w:t>
+      </w:r>
+    </w:p>
+    <w:p>
+      <w:pPr>
+        <w:pStyle w:val="ListParagraph"/>
+        <w:numPr>
+          <w:ilvl w:val="0"/>
+          <w:numId w:val="2"/>
+        </w:numPr>
+        <w:spacing w:after="40" w:before="40"/>
+      </w:pPr>
+      <w:r>
+        <w:rPr>
+          <w:rFonts w:ascii="Arial" w:cs="Arial" w:eastAsia="Arial" w:hAnsi="Arial"/>
+          <w:color w:val="212529"/>
+          <w:sz w:val="22"/>
+          <w:szCs w:val="22"/>
+        </w:rPr>
+        <w:t xml:space="preserve">Tape les 3 points en haut à droite.</w:t>
+      </w:r>
+    </w:p>
+    <w:p>
+      <w:pPr>
+        <w:pStyle w:val="ListParagraph"/>
+        <w:numPr>
+          <w:ilvl w:val="0"/>
+          <w:numId w:val="2"/>
+        </w:numPr>
+        <w:spacing w:after="40" w:before="40"/>
+      </w:pPr>
+      <w:r>
+        <w:rPr>
+          <w:rFonts w:ascii="Arial" w:cs="Arial" w:eastAsia="Arial" w:hAnsi="Arial"/>
+          <w:color w:val="212529"/>
+          <w:sz w:val="22"/>
+          <w:szCs w:val="22"/>
+        </w:rPr>
+        <w:t xml:space="preserve">Choisis "Ajouter à l'écran d'accueil".</w:t>
+      </w:r>
+    </w:p>
+    <w:p>
+      <w:pPr>
+        <w:pBdr>
+          <w:left w:val="single" w:color="3B5BDB" w:sz="8" w:space="8"/>
+        </w:pBdr>
+        <w:spacing w:after="80" w:before="80"/>
+        <w:ind w:left="360"/>
+      </w:pPr>
+      <w:r>
+        <w:rPr>
+          <w:rFonts w:ascii="Arial" w:cs="Arial" w:eastAsia="Arial" w:hAnsi="Arial"/>
+          <w:sz w:val="22"/>
+          <w:szCs w:val="22"/>
+        </w:rPr>
+        <w:t xml:space="preserve">💡 </w:t>
+      </w:r>
+      <w:r>
+        <w:rPr>
+          <w:rFonts w:ascii="Arial" w:cs="Arial" w:eastAsia="Arial" w:hAnsi="Arial"/>
+          <w:i/>
+          <w:iCs/>
+          <w:color w:val="1971C2"/>
+          <w:sz w:val="22"/>
+          <w:szCs w:val="22"/>
+        </w:rPr>
+        <w:t xml:space="preserve">Une fois installée, l'app s'ouvre en plein écran sans barre du navigateur, exactement comme une app native.</w:t>
+      </w:r>
+    </w:p>
+    <w:p>
+      <w:pPr>
+        <w:pStyle w:val="Heading2"/>
+        <w:spacing w:after="120" w:before="280"/>
+      </w:pPr>
+      <w:r>
+        <w:rPr>
+          <w:rFonts w:ascii="Arial" w:cs="Arial" w:eastAsia="Arial" w:hAnsi="Arial"/>
+          <w:b/>
+          <w:bCs/>
+          <w:color w:val="1971C2"/>
+          <w:sz w:val="26"/>
+          <w:szCs w:val="26"/>
+        </w:rPr>
+        <w:t xml:space="preserve">1.5 Se déconnecter</w:t>
+      </w:r>
+    </w:p>
+    <w:p>
+      <w:pPr>
+        <w:spacing w:after="100" w:before="60"/>
+      </w:pPr>
+      <w:r>
+        <w:rPr>
+          <w:rFonts w:ascii="Arial" w:cs="Arial" w:eastAsia="Arial" w:hAnsi="Arial"/>
+          <w:b w:val="false"/>
+          <w:bCs w:val="false"/>
+          <w:i w:val="false"/>
+          <w:iCs w:val="false"/>
+          <w:color w:val="212529"/>
+          <w:sz w:val="22"/>
+          <w:szCs w:val="22"/>
+        </w:rPr>
+        <w:t xml:space="preserve">Clique sur le bouton de déconnexion (icône de sortie) en bas de la sidebar. Sur mobile, accède à "Mon Profil" puis "Déconnexion".</w:t>
       </w:r>
     </w:p>
     <w:sectPr>
@@ -458,6 +1540,18 @@
   </w:abstractNum>
   <w:num w:numId="1">
     <w:abstractNumId w:val="1"/>
+    <w:lvlOverride w:ilvl="0">
+      <w:startOverride w:val="1"/>
+    </w:lvlOverride>
+  </w:num>
+  <w:num w:numId="2">
+    <w:abstractNumId w:val="3"/>
+    <w:lvlOverride w:ilvl="0">
+      <w:startOverride w:val="1"/>
+    </w:lvlOverride>
+  </w:num>
+  <w:num w:numId="3">
+    <w:abstractNumId w:val="2"/>
     <w:lvlOverride w:ilvl="0">
       <w:startOverride w:val="1"/>
     </w:lvlOverride>

</xml_diff>

<commit_message>
feat(docs): add chapters 2-7 - Manuel médecin RadioPlan (tableau de bord, planning, activités, profil, notifications)
Co-Authored-By: Claude Sonnet 4.6 <noreply@anthropic.com>
</commit_message>
<xml_diff>
--- a/docs/Manuel_Utilisateur_Medecin_RadioPlan.docx
+++ b/docs/Manuel_Utilisateur_Medecin_RadioPlan.docx
@@ -1242,6 +1242,4979 @@
           <w:szCs w:val="22"/>
         </w:rPr>
         <w:t xml:space="preserve">Clique sur le bouton de déconnexion (icône de sortie) en bas de la sidebar. Sur mobile, accède à "Mon Profil" puis "Déconnexion".</w:t>
+      </w:r>
+    </w:p>
+    <w:p>
+      <w:pPr>
+        <w:pStyle w:val="Heading1"/>
+        <w:pageBreakBefore/>
+        <w:spacing w:after="240" w:before="0"/>
+      </w:pPr>
+      <w:r>
+        <w:rPr>
+          <w:rFonts w:ascii="Arial" w:cs="Arial" w:eastAsia="Arial" w:hAnsi="Arial"/>
+          <w:b/>
+          <w:bCs/>
+          <w:color w:val="3B5BDB"/>
+          <w:sz w:val="32"/>
+          <w:szCs w:val="32"/>
+        </w:rPr>
+        <w:t xml:space="preserve">2. Tableau de bord</w:t>
+      </w:r>
+    </w:p>
+    <w:p>
+      <w:pPr>
+        <w:spacing w:after="100" w:before="60"/>
+      </w:pPr>
+      <w:r>
+        <w:rPr>
+          <w:rFonts w:ascii="Arial" w:cs="Arial" w:eastAsia="Arial" w:hAnsi="Arial"/>
+          <w:b w:val="false"/>
+          <w:bCs w:val="false"/>
+          <w:i w:val="false"/>
+          <w:iCs w:val="false"/>
+          <w:color w:val="212529"/>
+          <w:sz w:val="22"/>
+          <w:szCs w:val="22"/>
+        </w:rPr>
+        <w:t xml:space="preserve">Le tableau de bord est la page d'accueil de RadioPlan AI. Il te donne une vue instantanée de l'état du planning.</w:t>
+      </w:r>
+    </w:p>
+    <w:p>
+      <w:pPr>
+        <w:pStyle w:val="Heading2"/>
+        <w:spacing w:after="120" w:before="280"/>
+      </w:pPr>
+      <w:r>
+        <w:rPr>
+          <w:rFonts w:ascii="Arial" w:cs="Arial" w:eastAsia="Arial" w:hAnsi="Arial"/>
+          <w:b/>
+          <w:bCs/>
+          <w:color w:val="1971C2"/>
+          <w:sz w:val="26"/>
+          <w:szCs w:val="26"/>
+        </w:rPr>
+        <w:t xml:space="preserve">2.1 Vue jour / Vue semaine</w:t>
+      </w:r>
+    </w:p>
+    <w:p>
+      <w:pPr>
+        <w:spacing w:after="100" w:before="60"/>
+      </w:pPr>
+      <w:r>
+        <w:rPr>
+          <w:rFonts w:ascii="Arial" w:cs="Arial" w:eastAsia="Arial" w:hAnsi="Arial"/>
+          <w:b w:val="false"/>
+          <w:bCs w:val="false"/>
+          <w:i w:val="false"/>
+          <w:iCs w:val="false"/>
+          <w:color w:val="212529"/>
+          <w:sz w:val="22"/>
+          <w:szCs w:val="22"/>
+        </w:rPr>
+        <w:t xml:space="preserve">Utilise le bouton bascule en haut à droite pour choisir l'affichage :</w:t>
+      </w:r>
+    </w:p>
+    <w:p>
+      <w:pPr>
+        <w:pStyle w:val="ListParagraph"/>
+        <w:numPr>
+          <w:ilvl w:val="0"/>
+          <w:numId w:val="3"/>
+        </w:numPr>
+        <w:spacing w:after="40" w:before="40"/>
+      </w:pPr>
+      <w:r>
+        <w:rPr>
+          <w:rFonts w:ascii="Arial" w:cs="Arial" w:eastAsia="Arial" w:hAnsi="Arial"/>
+          <w:color w:val="212529"/>
+          <w:sz w:val="22"/>
+          <w:szCs w:val="22"/>
+        </w:rPr>
+        <w:t xml:space="preserve">Vue jour : détail de la journée sélectionnée (matin + après-midi), avec tous les médecins assignés.</w:t>
+      </w:r>
+    </w:p>
+    <w:p>
+      <w:pPr>
+        <w:pStyle w:val="ListParagraph"/>
+        <w:numPr>
+          <w:ilvl w:val="0"/>
+          <w:numId w:val="3"/>
+        </w:numPr>
+        <w:spacing w:after="40" w:before="40"/>
+      </w:pPr>
+      <w:r>
+        <w:rPr>
+          <w:rFonts w:ascii="Arial" w:cs="Arial" w:eastAsia="Arial" w:hAnsi="Arial"/>
+          <w:color w:val="212529"/>
+          <w:sz w:val="22"/>
+          <w:szCs w:val="22"/>
+        </w:rPr>
+        <w:t xml:space="preserve">Vue semaine : résumé des 5 jours avec les statistiques clés.</w:t>
+      </w:r>
+    </w:p>
+    <w:p>
+      <w:pPr>
+        <w:spacing w:after="100" w:before="60"/>
+      </w:pPr>
+      <w:r>
+        <w:rPr>
+          <w:rFonts w:ascii="Arial" w:cs="Arial" w:eastAsia="Arial" w:hAnsi="Arial"/>
+          <w:b w:val="false"/>
+          <w:bCs w:val="false"/>
+          <w:i w:val="false"/>
+          <w:iCs w:val="false"/>
+          <w:color w:val="212529"/>
+          <w:sz w:val="22"/>
+          <w:szCs w:val="22"/>
+        </w:rPr>
+        <w:t xml:space="preserve">Les flèches ← → te permettent de naviguer semaine par semaine.</w:t>
+      </w:r>
+    </w:p>
+    <w:p>
+      <w:pPr>
+        <w:pStyle w:val="Heading2"/>
+        <w:spacing w:after="120" w:before="280"/>
+      </w:pPr>
+      <w:r>
+        <w:rPr>
+          <w:rFonts w:ascii="Arial" w:cs="Arial" w:eastAsia="Arial" w:hAnsi="Arial"/>
+          <w:b/>
+          <w:bCs/>
+          <w:color w:val="1971C2"/>
+          <w:sz w:val="26"/>
+          <w:szCs w:val="26"/>
+        </w:rPr>
+        <w:t xml:space="preserve">2.2 Cartes de statistiques</w:t>
+      </w:r>
+    </w:p>
+    <w:p>
+      <w:pPr>
+        <w:spacing w:after="100" w:before="60"/>
+      </w:pPr>
+      <w:r>
+        <w:rPr>
+          <w:rFonts w:ascii="Arial" w:cs="Arial" w:eastAsia="Arial" w:hAnsi="Arial"/>
+          <w:b w:val="false"/>
+          <w:bCs w:val="false"/>
+          <w:i w:val="false"/>
+          <w:iCs w:val="false"/>
+          <w:color w:val="212529"/>
+          <w:sz w:val="22"/>
+          <w:szCs w:val="22"/>
+        </w:rPr>
+        <w:t xml:space="preserve">En haut de chaque vue, des cartes t'informent d'un coup d'œil :</w:t>
+      </w:r>
+    </w:p>
+    <w:p>
+      <w:pPr>
+        <w:spacing w:after="120" w:before="0"/>
+      </w:pPr>
+    </w:p>
+    <w:tbl>
+      <w:tblPr>
+        <w:tblW w:type="dxa" w:w="9000"/>
+        <w:tblBorders>
+          <w:top w:val="single" w:color="auto" w:sz="4"/>
+          <w:left w:val="single" w:color="auto" w:sz="4"/>
+          <w:bottom w:val="single" w:color="auto" w:sz="4"/>
+          <w:right w:val="single" w:color="auto" w:sz="4"/>
+          <w:insideH w:val="single" w:color="auto" w:sz="4"/>
+          <w:insideV w:val="single" w:color="auto" w:sz="4"/>
+        </w:tblBorders>
+      </w:tblPr>
+      <w:tblGrid>
+        <w:gridCol w:w="3000"/>
+        <w:gridCol w:w="6000"/>
+      </w:tblGrid>
+      <w:tr>
+        <w:trPr>
+          <w:tblHeader/>
+        </w:trPr>
+        <w:tc>
+          <w:tcPr>
+            <w:tcW w:type="dxa" w:w="3000"/>
+            <w:tcBorders>
+              <w:top w:val="single" w:color="3B5BDB" w:sz="1"/>
+              <w:left w:val="single" w:color="3B5BDB" w:sz="1"/>
+              <w:bottom w:val="single" w:color="3B5BDB" w:sz="1"/>
+              <w:right w:val="single" w:color="3B5BDB" w:sz="1"/>
+            </w:tcBorders>
+            <w:shd w:fill="1E3A5F" w:val="clear"/>
+            <w:tcMar>
+              <w:top w:type="dxa" w:w="80"/>
+              <w:left w:type="dxa" w:w="140"/>
+              <w:bottom w:type="dxa" w:w="80"/>
+              <w:right w:type="dxa" w:w="140"/>
+            </w:tcMar>
+          </w:tcPr>
+          <w:p>
+            <w:pPr>
+              <w:spacing w:after="0" w:before="0"/>
+            </w:pPr>
+            <w:r>
+              <w:rPr>
+                <w:rFonts w:ascii="Arial" w:cs="Arial" w:eastAsia="Arial" w:hAnsi="Arial"/>
+                <w:b/>
+                <w:bCs/>
+                <w:color w:val="FFFFFF"/>
+                <w:sz w:val="20"/>
+                <w:szCs w:val="20"/>
+              </w:rPr>
+              <w:t xml:space="preserve">Carte</w:t>
+            </w:r>
+          </w:p>
+        </w:tc>
+        <w:tc>
+          <w:tcPr>
+            <w:tcW w:type="dxa" w:w="6000"/>
+            <w:tcBorders>
+              <w:top w:val="single" w:color="3B5BDB" w:sz="1"/>
+              <w:left w:val="single" w:color="3B5BDB" w:sz="1"/>
+              <w:bottom w:val="single" w:color="3B5BDB" w:sz="1"/>
+              <w:right w:val="single" w:color="3B5BDB" w:sz="1"/>
+            </w:tcBorders>
+            <w:shd w:fill="1E3A5F" w:val="clear"/>
+            <w:tcMar>
+              <w:top w:type="dxa" w:w="80"/>
+              <w:left w:type="dxa" w:w="140"/>
+              <w:bottom w:type="dxa" w:w="80"/>
+              <w:right w:type="dxa" w:w="140"/>
+            </w:tcMar>
+          </w:tcPr>
+          <w:p>
+            <w:pPr>
+              <w:spacing w:after="0" w:before="0"/>
+            </w:pPr>
+            <w:r>
+              <w:rPr>
+                <w:rFonts w:ascii="Arial" w:cs="Arial" w:eastAsia="Arial" w:hAnsi="Arial"/>
+                <w:b/>
+                <w:bCs/>
+                <w:color w:val="FFFFFF"/>
+                <w:sz w:val="20"/>
+                <w:szCs w:val="20"/>
+              </w:rPr>
+              <w:t xml:space="preserve">Ce qu'elle indique</w:t>
+            </w:r>
+          </w:p>
+        </w:tc>
+      </w:tr>
+      <w:tr>
+        <w:tc>
+          <w:tcPr>
+            <w:tcW w:type="dxa" w:w="3000"/>
+            <w:tcBorders>
+              <w:top w:val="single" w:color="C5D3E8" w:sz="1"/>
+              <w:left w:val="single" w:color="C5D3E8" w:sz="1"/>
+              <w:bottom w:val="single" w:color="C5D3E8" w:sz="1"/>
+              <w:right w:val="single" w:color="C5D3E8" w:sz="1"/>
+            </w:tcBorders>
+            <w:shd w:fill="FFFFFF" w:val="clear"/>
+            <w:tcMar>
+              <w:top w:type="dxa" w:w="80"/>
+              <w:left w:type="dxa" w:w="140"/>
+              <w:bottom w:type="dxa" w:w="80"/>
+              <w:right w:type="dxa" w:w="140"/>
+            </w:tcMar>
+          </w:tcPr>
+          <w:p>
+            <w:pPr>
+              <w:spacing w:after="0" w:before="0"/>
+            </w:pPr>
+            <w:r>
+              <w:rPr>
+                <w:rFonts w:ascii="Arial" w:cs="Arial" w:eastAsia="Arial" w:hAnsi="Arial"/>
+                <w:color w:val="212529"/>
+                <w:sz w:val="20"/>
+                <w:szCs w:val="20"/>
+              </w:rPr>
+              <w:t xml:space="preserve">Médecins présents</w:t>
+            </w:r>
+          </w:p>
+        </w:tc>
+        <w:tc>
+          <w:tcPr>
+            <w:tcW w:type="dxa" w:w="6000"/>
+            <w:tcBorders>
+              <w:top w:val="single" w:color="C5D3E8" w:sz="1"/>
+              <w:left w:val="single" w:color="C5D3E8" w:sz="1"/>
+              <w:bottom w:val="single" w:color="C5D3E8" w:sz="1"/>
+              <w:right w:val="single" w:color="C5D3E8" w:sz="1"/>
+            </w:tcBorders>
+            <w:shd w:fill="FFFFFF" w:val="clear"/>
+            <w:tcMar>
+              <w:top w:type="dxa" w:w="80"/>
+              <w:left w:type="dxa" w:w="140"/>
+              <w:bottom w:type="dxa" w:w="80"/>
+              <w:right w:type="dxa" w:w="140"/>
+            </w:tcMar>
+          </w:tcPr>
+          <w:p>
+            <w:pPr>
+              <w:spacing w:after="0" w:before="0"/>
+            </w:pPr>
+            <w:r>
+              <w:rPr>
+                <w:rFonts w:ascii="Arial" w:cs="Arial" w:eastAsia="Arial" w:hAnsi="Arial"/>
+                <w:color w:val="212529"/>
+                <w:sz w:val="20"/>
+                <w:szCs w:val="20"/>
+              </w:rPr>
+              <w:t xml:space="preserve">Nombre de médecins disponibles ce jour / cette semaine</w:t>
+            </w:r>
+          </w:p>
+        </w:tc>
+      </w:tr>
+      <w:tr>
+        <w:tc>
+          <w:tcPr>
+            <w:tcW w:type="dxa" w:w="3000"/>
+            <w:tcBorders>
+              <w:top w:val="single" w:color="C5D3E8" w:sz="1"/>
+              <w:left w:val="single" w:color="C5D3E8" w:sz="1"/>
+              <w:bottom w:val="single" w:color="C5D3E8" w:sz="1"/>
+              <w:right w:val="single" w:color="C5D3E8" w:sz="1"/>
+            </w:tcBorders>
+            <w:shd w:fill="F1F3F9" w:val="clear"/>
+            <w:tcMar>
+              <w:top w:type="dxa" w:w="80"/>
+              <w:left w:type="dxa" w:w="140"/>
+              <w:bottom w:type="dxa" w:w="80"/>
+              <w:right w:type="dxa" w:w="140"/>
+            </w:tcMar>
+          </w:tcPr>
+          <w:p>
+            <w:pPr>
+              <w:spacing w:after="0" w:before="0"/>
+            </w:pPr>
+            <w:r>
+              <w:rPr>
+                <w:rFonts w:ascii="Arial" w:cs="Arial" w:eastAsia="Arial" w:hAnsi="Arial"/>
+                <w:color w:val="212529"/>
+                <w:sz w:val="20"/>
+                <w:szCs w:val="20"/>
+              </w:rPr>
+              <w:t xml:space="preserve">Absences</w:t>
+            </w:r>
+          </w:p>
+        </w:tc>
+        <w:tc>
+          <w:tcPr>
+            <w:tcW w:type="dxa" w:w="6000"/>
+            <w:tcBorders>
+              <w:top w:val="single" w:color="C5D3E8" w:sz="1"/>
+              <w:left w:val="single" w:color="C5D3E8" w:sz="1"/>
+              <w:bottom w:val="single" w:color="C5D3E8" w:sz="1"/>
+              <w:right w:val="single" w:color="C5D3E8" w:sz="1"/>
+            </w:tcBorders>
+            <w:shd w:fill="F1F3F9" w:val="clear"/>
+            <w:tcMar>
+              <w:top w:type="dxa" w:w="80"/>
+              <w:left w:type="dxa" w:w="140"/>
+              <w:bottom w:type="dxa" w:w="80"/>
+              <w:right w:type="dxa" w:w="140"/>
+            </w:tcMar>
+          </w:tcPr>
+          <w:p>
+            <w:pPr>
+              <w:spacing w:after="0" w:before="0"/>
+            </w:pPr>
+            <w:r>
+              <w:rPr>
+                <w:rFonts w:ascii="Arial" w:cs="Arial" w:eastAsia="Arial" w:hAnsi="Arial"/>
+                <w:color w:val="212529"/>
+                <w:sz w:val="20"/>
+                <w:szCs w:val="20"/>
+              </w:rPr>
+              <w:t xml:space="preserve">Nombre d'absences déclarées sur la période</w:t>
+            </w:r>
+          </w:p>
+        </w:tc>
+      </w:tr>
+      <w:tr>
+        <w:tc>
+          <w:tcPr>
+            <w:tcW w:type="dxa" w:w="3000"/>
+            <w:tcBorders>
+              <w:top w:val="single" w:color="C5D3E8" w:sz="1"/>
+              <w:left w:val="single" w:color="C5D3E8" w:sz="1"/>
+              <w:bottom w:val="single" w:color="C5D3E8" w:sz="1"/>
+              <w:right w:val="single" w:color="C5D3E8" w:sz="1"/>
+            </w:tcBorders>
+            <w:shd w:fill="FFFFFF" w:val="clear"/>
+            <w:tcMar>
+              <w:top w:type="dxa" w:w="80"/>
+              <w:left w:type="dxa" w:w="140"/>
+              <w:bottom w:type="dxa" w:w="80"/>
+              <w:right w:type="dxa" w:w="140"/>
+            </w:tcMar>
+          </w:tcPr>
+          <w:p>
+            <w:pPr>
+              <w:spacing w:after="0" w:before="0"/>
+            </w:pPr>
+            <w:r>
+              <w:rPr>
+                <w:rFonts w:ascii="Arial" w:cs="Arial" w:eastAsia="Arial" w:hAnsi="Arial"/>
+                <w:color w:val="212529"/>
+                <w:sz w:val="20"/>
+                <w:szCs w:val="20"/>
+              </w:rPr>
+              <w:t xml:space="preserve">Conflits</w:t>
+            </w:r>
+          </w:p>
+        </w:tc>
+        <w:tc>
+          <w:tcPr>
+            <w:tcW w:type="dxa" w:w="6000"/>
+            <w:tcBorders>
+              <w:top w:val="single" w:color="C5D3E8" w:sz="1"/>
+              <w:left w:val="single" w:color="C5D3E8" w:sz="1"/>
+              <w:bottom w:val="single" w:color="C5D3E8" w:sz="1"/>
+              <w:right w:val="single" w:color="C5D3E8" w:sz="1"/>
+            </w:tcBorders>
+            <w:shd w:fill="FFFFFF" w:val="clear"/>
+            <w:tcMar>
+              <w:top w:type="dxa" w:w="80"/>
+              <w:left w:type="dxa" w:w="140"/>
+              <w:bottom w:type="dxa" w:w="80"/>
+              <w:right w:type="dxa" w:w="140"/>
+            </w:tcMar>
+          </w:tcPr>
+          <w:p>
+            <w:pPr>
+              <w:spacing w:after="0" w:before="0"/>
+            </w:pPr>
+            <w:r>
+              <w:rPr>
+                <w:rFonts w:ascii="Arial" w:cs="Arial" w:eastAsia="Arial" w:hAnsi="Arial"/>
+                <w:color w:val="212529"/>
+                <w:sz w:val="20"/>
+                <w:szCs w:val="20"/>
+              </w:rPr>
+              <w:t xml:space="preserve">Nombre de conflits détectés (voir section 2.3)</w:t>
+            </w:r>
+          </w:p>
+        </w:tc>
+      </w:tr>
+      <w:tr>
+        <w:tc>
+          <w:tcPr>
+            <w:tcW w:type="dxa" w:w="3000"/>
+            <w:tcBorders>
+              <w:top w:val="single" w:color="C5D3E8" w:sz="1"/>
+              <w:left w:val="single" w:color="C5D3E8" w:sz="1"/>
+              <w:bottom w:val="single" w:color="C5D3E8" w:sz="1"/>
+              <w:right w:val="single" w:color="C5D3E8" w:sz="1"/>
+            </w:tcBorders>
+            <w:shd w:fill="F1F3F9" w:val="clear"/>
+            <w:tcMar>
+              <w:top w:type="dxa" w:w="80"/>
+              <w:left w:type="dxa" w:w="140"/>
+              <w:bottom w:type="dxa" w:w="80"/>
+              <w:right w:type="dxa" w:w="140"/>
+            </w:tcMar>
+          </w:tcPr>
+          <w:p>
+            <w:pPr>
+              <w:spacing w:after="0" w:before="0"/>
+            </w:pPr>
+            <w:r>
+              <w:rPr>
+                <w:rFonts w:ascii="Arial" w:cs="Arial" w:eastAsia="Arial" w:hAnsi="Arial"/>
+                <w:color w:val="212529"/>
+                <w:sz w:val="20"/>
+                <w:szCs w:val="20"/>
+              </w:rPr>
+              <w:t xml:space="preserve">Activités planifiées</w:t>
+            </w:r>
+          </w:p>
+        </w:tc>
+        <w:tc>
+          <w:tcPr>
+            <w:tcW w:type="dxa" w:w="6000"/>
+            <w:tcBorders>
+              <w:top w:val="single" w:color="C5D3E8" w:sz="1"/>
+              <w:left w:val="single" w:color="C5D3E8" w:sz="1"/>
+              <w:bottom w:val="single" w:color="C5D3E8" w:sz="1"/>
+              <w:right w:val="single" w:color="C5D3E8" w:sz="1"/>
+            </w:tcBorders>
+            <w:shd w:fill="F1F3F9" w:val="clear"/>
+            <w:tcMar>
+              <w:top w:type="dxa" w:w="80"/>
+              <w:left w:type="dxa" w:w="140"/>
+              <w:bottom w:type="dxa" w:w="80"/>
+              <w:right w:type="dxa" w:w="140"/>
+            </w:tcMar>
+          </w:tcPr>
+          <w:p>
+            <w:pPr>
+              <w:spacing w:after="0" w:before="0"/>
+            </w:pPr>
+            <w:r>
+              <w:rPr>
+                <w:rFonts w:ascii="Arial" w:cs="Arial" w:eastAsia="Arial" w:hAnsi="Arial"/>
+                <w:color w:val="212529"/>
+                <w:sz w:val="20"/>
+                <w:szCs w:val="20"/>
+              </w:rPr>
+              <w:t xml:space="preserve">Nombre d'activités (gardes, Unity, Workflow) sur la semaine</w:t>
+            </w:r>
+          </w:p>
+        </w:tc>
+      </w:tr>
+    </w:tbl>
+    <w:p>
+      <w:pPr>
+        <w:spacing w:after="160" w:before="0"/>
+      </w:pPr>
+    </w:p>
+    <w:p>
+      <w:pPr>
+        <w:pStyle w:val="Heading2"/>
+        <w:spacing w:after="120" w:before="280"/>
+      </w:pPr>
+      <w:r>
+        <w:rPr>
+          <w:rFonts w:ascii="Arial" w:cs="Arial" w:eastAsia="Arial" w:hAnsi="Arial"/>
+          <w:b/>
+          <w:bCs/>
+          <w:color w:val="1971C2"/>
+          <w:sz w:val="26"/>
+          <w:szCs w:val="26"/>
+        </w:rPr>
+        <w:t xml:space="preserve">2.3 Les conflits</w:t>
+      </w:r>
+    </w:p>
+    <w:p>
+      <w:pPr>
+        <w:spacing w:after="100" w:before="60"/>
+      </w:pPr>
+      <w:r>
+        <w:rPr>
+          <w:rFonts w:ascii="Arial" w:cs="Arial" w:eastAsia="Arial" w:hAnsi="Arial"/>
+          <w:b w:val="false"/>
+          <w:bCs w:val="false"/>
+          <w:i w:val="false"/>
+          <w:iCs w:val="false"/>
+          <w:color w:val="212529"/>
+          <w:sz w:val="22"/>
+          <w:szCs w:val="22"/>
+        </w:rPr>
+        <w:t xml:space="preserve">Un conflit se produit quand un médecin est assigné à un slot alors qu'il est absent ou non disponible. Il est signalé par une icône triangle orange ⚠️ sur le slot concerné.</w:t>
+      </w:r>
+    </w:p>
+    <w:p>
+      <w:pPr>
+        <w:pBdr>
+          <w:left w:val="single" w:color="FFC107" w:sz="8" w:space="8"/>
+        </w:pBdr>
+        <w:spacing w:after="80" w:before="80"/>
+        <w:ind w:left="360"/>
+      </w:pPr>
+      <w:r>
+        <w:rPr>
+          <w:rFonts w:ascii="Arial" w:cs="Arial" w:eastAsia="Arial" w:hAnsi="Arial"/>
+          <w:sz w:val="22"/>
+          <w:szCs w:val="22"/>
+        </w:rPr>
+        <w:t xml:space="preserve">⚠️ </w:t>
+      </w:r>
+      <w:r>
+        <w:rPr>
+          <w:rFonts w:ascii="Arial" w:cs="Arial" w:eastAsia="Arial" w:hAnsi="Arial"/>
+          <w:i/>
+          <w:iCs/>
+          <w:color w:val="856404"/>
+          <w:sz w:val="22"/>
+          <w:szCs w:val="22"/>
+        </w:rPr>
+        <w:t xml:space="preserve">Si tu détectes un conflit qui te concerne, contacte ton administrateur. Lui seul peut modifier le planning ou demander un remplacement en ton nom.</w:t>
+      </w:r>
+    </w:p>
+    <w:p>
+      <w:pPr>
+        <w:pStyle w:val="Heading2"/>
+        <w:spacing w:after="120" w:before="280"/>
+      </w:pPr>
+      <w:r>
+        <w:rPr>
+          <w:rFonts w:ascii="Arial" w:cs="Arial" w:eastAsia="Arial" w:hAnsi="Arial"/>
+          <w:b/>
+          <w:bCs/>
+          <w:color w:val="1971C2"/>
+          <w:sz w:val="26"/>
+          <w:szCs w:val="26"/>
+        </w:rPr>
+        <w:t xml:space="preserve">2.4 Jours fériés</w:t>
+      </w:r>
+    </w:p>
+    <w:p>
+      <w:pPr>
+        <w:spacing w:after="100" w:before="60"/>
+      </w:pPr>
+      <w:r>
+        <w:rPr>
+          <w:rFonts w:ascii="Arial" w:cs="Arial" w:eastAsia="Arial" w:hAnsi="Arial"/>
+          <w:b w:val="false"/>
+          <w:bCs w:val="false"/>
+          <w:i w:val="false"/>
+          <w:iCs w:val="false"/>
+          <w:color w:val="212529"/>
+          <w:sz w:val="22"/>
+          <w:szCs w:val="22"/>
+        </w:rPr>
+        <w:t xml:space="preserve">Les jours fériés français sont automatiquement détectés et grisés. Le système ne génère aucun slot ce jour-là. Si un RCP tombe un jour férié, l'administrateur peut le déplacer manuellement.</w:t>
+      </w:r>
+    </w:p>
+    <w:p>
+      <w:pPr>
+        <w:pStyle w:val="Heading2"/>
+        <w:spacing w:after="120" w:before="280"/>
+      </w:pPr>
+      <w:r>
+        <w:rPr>
+          <w:rFonts w:ascii="Arial" w:cs="Arial" w:eastAsia="Arial" w:hAnsi="Arial"/>
+          <w:b/>
+          <w:bCs/>
+          <w:color w:val="1971C2"/>
+          <w:sz w:val="26"/>
+          <w:szCs w:val="26"/>
+        </w:rPr>
+        <w:t xml:space="preserve">2.5 Semaines verrouillées</w:t>
+      </w:r>
+    </w:p>
+    <w:p>
+      <w:pPr>
+        <w:spacing w:after="100" w:before="60"/>
+      </w:pPr>
+      <w:r>
+        <w:rPr>
+          <w:rFonts w:ascii="Arial" w:cs="Arial" w:eastAsia="Arial" w:hAnsi="Arial"/>
+          <w:b w:val="false"/>
+          <w:bCs w:val="false"/>
+          <w:i w:val="false"/>
+          <w:iCs w:val="false"/>
+          <w:color w:val="212529"/>
+          <w:sz w:val="22"/>
+          <w:szCs w:val="22"/>
+        </w:rPr>
+        <w:t xml:space="preserve">Une icône cadenas 🔒 près du numéro de semaine signifie que cette semaine a été validée par l'administrateur. Le planning est figé : aucune modification n'est possible.</w:t>
+      </w:r>
+    </w:p>
+    <w:p>
+      <w:pPr>
+        <w:pStyle w:val="Heading1"/>
+        <w:pageBreakBefore/>
+        <w:spacing w:after="240" w:before="0"/>
+      </w:pPr>
+      <w:r>
+        <w:rPr>
+          <w:rFonts w:ascii="Arial" w:cs="Arial" w:eastAsia="Arial" w:hAnsi="Arial"/>
+          <w:b/>
+          <w:bCs/>
+          <w:color w:val="3B5BDB"/>
+          <w:sz w:val="32"/>
+          <w:szCs w:val="32"/>
+        </w:rPr>
+        <w:t xml:space="preserve">3. Mon Planning</w:t>
+      </w:r>
+    </w:p>
+    <w:p>
+      <w:pPr>
+        <w:spacing w:after="100" w:before="60"/>
+      </w:pPr>
+      <w:r>
+        <w:rPr>
+          <w:rFonts w:ascii="Arial" w:cs="Arial" w:eastAsia="Arial" w:hAnsi="Arial"/>
+          <w:b w:val="false"/>
+          <w:bCs w:val="false"/>
+          <w:i w:val="false"/>
+          <w:iCs w:val="false"/>
+          <w:color w:val="212529"/>
+          <w:sz w:val="22"/>
+          <w:szCs w:val="22"/>
+        </w:rPr>
+        <w:t xml:space="preserve">Cette page est ton agenda personnel. Elle affiche uniquement tes slots — consultations, RCP et activités — mis en évidence avec ta couleur de badge.</w:t>
+      </w:r>
+    </w:p>
+    <w:p>
+      <w:pPr>
+        <w:pStyle w:val="Heading2"/>
+        <w:spacing w:after="120" w:before="280"/>
+      </w:pPr>
+      <w:r>
+        <w:rPr>
+          <w:rFonts w:ascii="Arial" w:cs="Arial" w:eastAsia="Arial" w:hAnsi="Arial"/>
+          <w:b/>
+          <w:bCs/>
+          <w:color w:val="1971C2"/>
+          <w:sz w:val="26"/>
+          <w:szCs w:val="26"/>
+        </w:rPr>
+        <w:t xml:space="preserve">3.1 Vue semaine</w:t>
+      </w:r>
+    </w:p>
+    <w:p>
+      <w:pPr>
+        <w:spacing w:after="100" w:before="60"/>
+      </w:pPr>
+      <w:r>
+        <w:rPr>
+          <w:rFonts w:ascii="Arial" w:cs="Arial" w:eastAsia="Arial" w:hAnsi="Arial"/>
+          <w:b w:val="false"/>
+          <w:bCs w:val="false"/>
+          <w:i w:val="false"/>
+          <w:iCs w:val="false"/>
+          <w:color w:val="212529"/>
+          <w:sz w:val="22"/>
+          <w:szCs w:val="22"/>
+        </w:rPr>
+        <w:t xml:space="preserve">La vue semaine affiche tes créneaux du lundi au vendredi, organisés par demi-journée (matin / après-midi). Chaque slot indique :</w:t>
+      </w:r>
+    </w:p>
+    <w:p>
+      <w:pPr>
+        <w:pStyle w:val="ListParagraph"/>
+        <w:numPr>
+          <w:ilvl w:val="0"/>
+          <w:numId w:val="3"/>
+        </w:numPr>
+        <w:spacing w:after="40" w:before="40"/>
+      </w:pPr>
+      <w:r>
+        <w:rPr>
+          <w:rFonts w:ascii="Arial" w:cs="Arial" w:eastAsia="Arial" w:hAnsi="Arial"/>
+          <w:color w:val="212529"/>
+          <w:sz w:val="22"/>
+          <w:szCs w:val="22"/>
+        </w:rPr>
+        <w:t xml:space="preserve">Le type de créneau : Consultation (Box 1/2/3), RCP, Activité (Astreinte, Unity, Workflow)</w:t>
+      </w:r>
+    </w:p>
+    <w:p>
+      <w:pPr>
+        <w:pStyle w:val="ListParagraph"/>
+        <w:numPr>
+          <w:ilvl w:val="0"/>
+          <w:numId w:val="3"/>
+        </w:numPr>
+        <w:spacing w:after="40" w:before="40"/>
+      </w:pPr>
+      <w:r>
+        <w:rPr>
+          <w:rFonts w:ascii="Arial" w:cs="Arial" w:eastAsia="Arial" w:hAnsi="Arial"/>
+          <w:color w:val="212529"/>
+          <w:sz w:val="22"/>
+          <w:szCs w:val="22"/>
+        </w:rPr>
+        <w:t xml:space="preserve">Le lieu ou l'intitulé</w:t>
+      </w:r>
+    </w:p>
+    <w:p>
+      <w:pPr>
+        <w:pStyle w:val="ListParagraph"/>
+        <w:numPr>
+          <w:ilvl w:val="0"/>
+          <w:numId w:val="3"/>
+        </w:numPr>
+        <w:spacing w:after="40" w:before="40"/>
+      </w:pPr>
+      <w:r>
+        <w:rPr>
+          <w:rFonts w:ascii="Arial" w:cs="Arial" w:eastAsia="Arial" w:hAnsi="Arial"/>
+          <w:color w:val="212529"/>
+          <w:sz w:val="22"/>
+          <w:szCs w:val="22"/>
+        </w:rPr>
+        <w:t xml:space="preserve">Les co-médecins éventuellement partagés sur ce slot</w:t>
+      </w:r>
+    </w:p>
+    <w:p>
+      <w:pPr>
+        <w:spacing w:after="100" w:before="60"/>
+      </w:pPr>
+      <w:r>
+        <w:rPr>
+          <w:rFonts w:ascii="Arial" w:cs="Arial" w:eastAsia="Arial" w:hAnsi="Arial"/>
+          <w:b w:val="false"/>
+          <w:bCs w:val="false"/>
+          <w:i w:val="false"/>
+          <w:iCs w:val="false"/>
+          <w:color w:val="212529"/>
+          <w:sz w:val="22"/>
+          <w:szCs w:val="22"/>
+        </w:rPr>
+        <w:t xml:space="preserve">Clique sur un slot pour en voir le détail complet.</w:t>
+      </w:r>
+    </w:p>
+    <w:p>
+      <w:pPr>
+        <w:pBdr>
+          <w:left w:val="single" w:color="3B5BDB" w:sz="8" w:space="8"/>
+        </w:pBdr>
+        <w:spacing w:after="80" w:before="80"/>
+        <w:ind w:left="360"/>
+      </w:pPr>
+      <w:r>
+        <w:rPr>
+          <w:rFonts w:ascii="Arial" w:cs="Arial" w:eastAsia="Arial" w:hAnsi="Arial"/>
+          <w:sz w:val="22"/>
+          <w:szCs w:val="22"/>
+        </w:rPr>
+        <w:t xml:space="preserve">💡 </w:t>
+      </w:r>
+      <w:r>
+        <w:rPr>
+          <w:rFonts w:ascii="Arial" w:cs="Arial" w:eastAsia="Arial" w:hAnsi="Arial"/>
+          <w:i/>
+          <w:iCs/>
+          <w:color w:val="1971C2"/>
+          <w:sz w:val="22"/>
+          <w:szCs w:val="22"/>
+        </w:rPr>
+        <w:t xml:space="preserve">Les flèches ← → te permettent de naviguer semaine par semaine. Le bouton "Aujourd'hui" te ramène à la semaine en cours.</w:t>
+      </w:r>
+    </w:p>
+    <w:p>
+      <w:pPr>
+        <w:pStyle w:val="Heading2"/>
+        <w:spacing w:after="120" w:before="280"/>
+      </w:pPr>
+      <w:r>
+        <w:rPr>
+          <w:rFonts w:ascii="Arial" w:cs="Arial" w:eastAsia="Arial" w:hAnsi="Arial"/>
+          <w:b/>
+          <w:bCs/>
+          <w:color w:val="1971C2"/>
+          <w:sz w:val="26"/>
+          <w:szCs w:val="26"/>
+        </w:rPr>
+        <w:t xml:space="preserve">3.2 Vue mois</w:t>
+      </w:r>
+    </w:p>
+    <w:p>
+      <w:pPr>
+        <w:spacing w:after="100" w:before="60"/>
+      </w:pPr>
+      <w:r>
+        <w:rPr>
+          <w:rFonts w:ascii="Arial" w:cs="Arial" w:eastAsia="Arial" w:hAnsi="Arial"/>
+          <w:b w:val="false"/>
+          <w:bCs w:val="false"/>
+          <w:i w:val="false"/>
+          <w:iCs w:val="false"/>
+          <w:color w:val="212529"/>
+          <w:sz w:val="22"/>
+          <w:szCs w:val="22"/>
+        </w:rPr>
+        <w:t xml:space="preserve">La vue mois affiche un calendrier de tes slots sur tout le mois. Utile pour avoir une vision d'ensemble de ta charge. Clique sur "Mois" en haut de la page pour basculer.</w:t>
+      </w:r>
+    </w:p>
+    <w:p>
+      <w:pPr>
+        <w:pStyle w:val="Heading2"/>
+        <w:spacing w:after="120" w:before="280"/>
+      </w:pPr>
+      <w:r>
+        <w:rPr>
+          <w:rFonts w:ascii="Arial" w:cs="Arial" w:eastAsia="Arial" w:hAnsi="Arial"/>
+          <w:b/>
+          <w:bCs/>
+          <w:color w:val="1971C2"/>
+          <w:sz w:val="26"/>
+          <w:szCs w:val="26"/>
+        </w:rPr>
+        <w:t xml:space="preserve">3.3 Modifier une consultation</w:t>
+      </w:r>
+    </w:p>
+    <w:p>
+      <w:pPr>
+        <w:spacing w:after="100" w:before="60"/>
+      </w:pPr>
+      <w:r>
+        <w:rPr>
+          <w:rFonts w:ascii="Arial" w:cs="Arial" w:eastAsia="Arial" w:hAnsi="Arial"/>
+          <w:b w:val="false"/>
+          <w:bCs w:val="false"/>
+          <w:i w:val="false"/>
+          <w:iCs w:val="false"/>
+          <w:color w:val="212529"/>
+          <w:sz w:val="22"/>
+          <w:szCs w:val="22"/>
+        </w:rPr>
+        <w:t xml:space="preserve">Si tu es assigné à un slot de consultation (Box 1, 2 ou 3), tu peux demander un remplacement :</w:t>
+      </w:r>
+    </w:p>
+    <w:p>
+      <w:pPr>
+        <w:pStyle w:val="ListParagraph"/>
+        <w:numPr>
+          <w:ilvl w:val="0"/>
+          <w:numId w:val="2"/>
+        </w:numPr>
+        <w:spacing w:after="40" w:before="40"/>
+      </w:pPr>
+      <w:r>
+        <w:rPr>
+          <w:rFonts w:ascii="Arial" w:cs="Arial" w:eastAsia="Arial" w:hAnsi="Arial"/>
+          <w:color w:val="212529"/>
+          <w:sz w:val="22"/>
+          <w:szCs w:val="22"/>
+        </w:rPr>
+        <w:t xml:space="preserve">Clique sur le slot de consultation concerné.</w:t>
+      </w:r>
+    </w:p>
+    <w:p>
+      <w:pPr>
+        <w:pStyle w:val="ListParagraph"/>
+        <w:numPr>
+          <w:ilvl w:val="0"/>
+          <w:numId w:val="2"/>
+        </w:numPr>
+        <w:spacing w:after="40" w:before="40"/>
+      </w:pPr>
+      <w:r>
+        <w:rPr>
+          <w:rFonts w:ascii="Arial" w:cs="Arial" w:eastAsia="Arial" w:hAnsi="Arial"/>
+          <w:color w:val="212529"/>
+          <w:sz w:val="22"/>
+          <w:szCs w:val="22"/>
+        </w:rPr>
+        <w:t xml:space="preserve">Dans le panneau de détail, clique sur "Demander un remplacement".</w:t>
+      </w:r>
+    </w:p>
+    <w:p>
+      <w:pPr>
+        <w:pStyle w:val="ListParagraph"/>
+        <w:numPr>
+          <w:ilvl w:val="0"/>
+          <w:numId w:val="2"/>
+        </w:numPr>
+        <w:spacing w:after="40" w:before="40"/>
+      </w:pPr>
+      <w:r>
+        <w:rPr>
+          <w:rFonts w:ascii="Arial" w:cs="Arial" w:eastAsia="Arial" w:hAnsi="Arial"/>
+          <w:color w:val="212529"/>
+          <w:sz w:val="22"/>
+          <w:szCs w:val="22"/>
+        </w:rPr>
+        <w:t xml:space="preserve">Sélectionne le médecin cible dans la liste.</w:t>
+      </w:r>
+    </w:p>
+    <w:p>
+      <w:pPr>
+        <w:pStyle w:val="ListParagraph"/>
+        <w:numPr>
+          <w:ilvl w:val="0"/>
+          <w:numId w:val="2"/>
+        </w:numPr>
+        <w:spacing w:after="40" w:before="40"/>
+      </w:pPr>
+      <w:r>
+        <w:rPr>
+          <w:rFonts w:ascii="Arial" w:cs="Arial" w:eastAsia="Arial" w:hAnsi="Arial"/>
+          <w:color w:val="212529"/>
+          <w:sz w:val="22"/>
+          <w:szCs w:val="22"/>
+        </w:rPr>
+        <w:t xml:space="preserve">Confirme → le médecin reçoit une notification.</w:t>
+      </w:r>
+    </w:p>
+    <w:p>
+      <w:pPr>
+        <w:pBdr>
+          <w:left w:val="single" w:color="FFC107" w:sz="8" w:space="8"/>
+        </w:pBdr>
+        <w:spacing w:after="80" w:before="80"/>
+        <w:ind w:left="360"/>
+      </w:pPr>
+      <w:r>
+        <w:rPr>
+          <w:rFonts w:ascii="Arial" w:cs="Arial" w:eastAsia="Arial" w:hAnsi="Arial"/>
+          <w:sz w:val="22"/>
+          <w:szCs w:val="22"/>
+        </w:rPr>
+        <w:t xml:space="preserve">⚠️ </w:t>
+      </w:r>
+      <w:r>
+        <w:rPr>
+          <w:rFonts w:ascii="Arial" w:cs="Arial" w:eastAsia="Arial" w:hAnsi="Arial"/>
+          <w:i/>
+          <w:iCs/>
+          <w:color w:val="856404"/>
+          <w:sz w:val="22"/>
+          <w:szCs w:val="22"/>
+        </w:rPr>
+        <w:t xml:space="preserve">Les demandes de remplacement ne modifient pas le planning automatiquement. Le planning est mis à jour uniquement si le médecin cible accepte.</w:t>
+      </w:r>
+    </w:p>
+    <w:p>
+      <w:pPr>
+        <w:pStyle w:val="Heading2"/>
+        <w:spacing w:after="120" w:before="280"/>
+      </w:pPr>
+      <w:r>
+        <w:rPr>
+          <w:rFonts w:ascii="Arial" w:cs="Arial" w:eastAsia="Arial" w:hAnsi="Arial"/>
+          <w:b/>
+          <w:bCs/>
+          <w:color w:val="1971C2"/>
+          <w:sz w:val="26"/>
+          <w:szCs w:val="26"/>
+        </w:rPr>
+        <w:t xml:space="preserve">3.4 Confirmer sa présence à un RCP</w:t>
+      </w:r>
+    </w:p>
+    <w:p>
+      <w:pPr>
+        <w:spacing w:after="100" w:before="60"/>
+      </w:pPr>
+      <w:r>
+        <w:rPr>
+          <w:rFonts w:ascii="Arial" w:cs="Arial" w:eastAsia="Arial" w:hAnsi="Arial"/>
+          <w:b w:val="false"/>
+          <w:bCs w:val="false"/>
+          <w:i w:val="false"/>
+          <w:iCs w:val="false"/>
+          <w:color w:val="212529"/>
+          <w:sz w:val="22"/>
+          <w:szCs w:val="22"/>
+        </w:rPr>
+        <w:t xml:space="preserve">Les RCP (Réunions de Concertation Pluridisciplinaire) apparaissent dans ton planning hebdomadaire. Pour confirmer ou décliner ta présence :</w:t>
+      </w:r>
+    </w:p>
+    <w:p>
+      <w:pPr>
+        <w:pStyle w:val="ListParagraph"/>
+        <w:numPr>
+          <w:ilvl w:val="0"/>
+          <w:numId w:val="2"/>
+        </w:numPr>
+        <w:spacing w:after="40" w:before="40"/>
+      </w:pPr>
+      <w:r>
+        <w:rPr>
+          <w:rFonts w:ascii="Arial" w:cs="Arial" w:eastAsia="Arial" w:hAnsi="Arial"/>
+          <w:color w:val="212529"/>
+          <w:sz w:val="22"/>
+          <w:szCs w:val="22"/>
+        </w:rPr>
+        <w:t xml:space="preserve">Clique sur le slot RCP.</w:t>
+      </w:r>
+    </w:p>
+    <w:p>
+      <w:pPr>
+        <w:pStyle w:val="ListParagraph"/>
+        <w:numPr>
+          <w:ilvl w:val="0"/>
+          <w:numId w:val="2"/>
+        </w:numPr>
+        <w:spacing w:after="40" w:before="40"/>
+      </w:pPr>
+      <w:r>
+        <w:rPr>
+          <w:rFonts w:ascii="Arial" w:cs="Arial" w:eastAsia="Arial" w:hAnsi="Arial"/>
+          <w:color w:val="212529"/>
+          <w:sz w:val="22"/>
+          <w:szCs w:val="22"/>
+        </w:rPr>
+        <w:t xml:space="preserve">Dans le modal, sélectionne PRÉSENT ou ABSENT.</w:t>
+      </w:r>
+    </w:p>
+    <w:p>
+      <w:pPr>
+        <w:pStyle w:val="ListParagraph"/>
+        <w:numPr>
+          <w:ilvl w:val="0"/>
+          <w:numId w:val="2"/>
+        </w:numPr>
+        <w:spacing w:after="40" w:before="40"/>
+      </w:pPr>
+      <w:r>
+        <w:rPr>
+          <w:rFonts w:ascii="Arial" w:cs="Arial" w:eastAsia="Arial" w:hAnsi="Arial"/>
+          <w:color w:val="212529"/>
+          <w:sz w:val="22"/>
+          <w:szCs w:val="22"/>
+        </w:rPr>
+        <w:t xml:space="preserve">Valide.</w:t>
+      </w:r>
+    </w:p>
+    <w:p>
+      <w:pPr>
+        <w:pBdr>
+          <w:left w:val="single" w:color="3B5BDB" w:sz="8" w:space="8"/>
+        </w:pBdr>
+        <w:spacing w:after="80" w:before="80"/>
+        <w:ind w:left="360"/>
+      </w:pPr>
+      <w:r>
+        <w:rPr>
+          <w:rFonts w:ascii="Arial" w:cs="Arial" w:eastAsia="Arial" w:hAnsi="Arial"/>
+          <w:sz w:val="22"/>
+          <w:szCs w:val="22"/>
+        </w:rPr>
+        <w:t xml:space="preserve">💡 </w:t>
+      </w:r>
+      <w:r>
+        <w:rPr>
+          <w:rFonts w:ascii="Arial" w:cs="Arial" w:eastAsia="Arial" w:hAnsi="Arial"/>
+          <w:i/>
+          <w:iCs/>
+          <w:color w:val="1971C2"/>
+          <w:sz w:val="22"/>
+          <w:szCs w:val="22"/>
+        </w:rPr>
+        <w:t xml:space="preserve">Le premier médecin à confirmer PRÉSENT "verrouille" le slot — le RCP est confirmé comme tenu. Les autres médecins peuvent toujours renseigner leur présence ensuite.</w:t>
+      </w:r>
+    </w:p>
+    <w:p>
+      <w:pPr>
+        <w:pStyle w:val="Heading1"/>
+        <w:pageBreakBefore/>
+        <w:spacing w:after="240" w:before="0"/>
+      </w:pPr>
+      <w:r>
+        <w:rPr>
+          <w:rFonts w:ascii="Arial" w:cs="Arial" w:eastAsia="Arial" w:hAnsi="Arial"/>
+          <w:b/>
+          <w:bCs/>
+          <w:color w:val="3B5BDB"/>
+          <w:sz w:val="32"/>
+          <w:szCs w:val="32"/>
+        </w:rPr>
+        <w:t xml:space="preserve">4. Planning Global</w:t>
+      </w:r>
+    </w:p>
+    <w:p>
+      <w:pPr>
+        <w:spacing w:after="100" w:before="60"/>
+      </w:pPr>
+      <w:r>
+        <w:rPr>
+          <w:rFonts w:ascii="Arial" w:cs="Arial" w:eastAsia="Arial" w:hAnsi="Arial"/>
+          <w:b w:val="false"/>
+          <w:bCs w:val="false"/>
+          <w:i w:val="false"/>
+          <w:iCs w:val="false"/>
+          <w:color w:val="212529"/>
+          <w:sz w:val="22"/>
+          <w:szCs w:val="22"/>
+        </w:rPr>
+        <w:t xml:space="preserve">Le Planning Global affiche le planning complet de toute l'équipe sur une semaine. Cette page peut nécessiter une autorisation de l'administrateur pour être accessible.</w:t>
+      </w:r>
+    </w:p>
+    <w:p>
+      <w:pPr>
+        <w:pStyle w:val="Heading2"/>
+        <w:spacing w:after="120" w:before="280"/>
+      </w:pPr>
+      <w:r>
+        <w:rPr>
+          <w:rFonts w:ascii="Arial" w:cs="Arial" w:eastAsia="Arial" w:hAnsi="Arial"/>
+          <w:b/>
+          <w:bCs/>
+          <w:color w:val="1971C2"/>
+          <w:sz w:val="26"/>
+          <w:szCs w:val="26"/>
+        </w:rPr>
+        <w:t xml:space="preserve">4.1 Lire le tableau</w:t>
+      </w:r>
+    </w:p>
+    <w:p>
+      <w:pPr>
+        <w:spacing w:after="100" w:before="60"/>
+      </w:pPr>
+      <w:r>
+        <w:rPr>
+          <w:rFonts w:ascii="Arial" w:cs="Arial" w:eastAsia="Arial" w:hAnsi="Arial"/>
+          <w:b w:val="false"/>
+          <w:bCs w:val="false"/>
+          <w:i w:val="false"/>
+          <w:iCs w:val="false"/>
+          <w:color w:val="212529"/>
+          <w:sz w:val="22"/>
+          <w:szCs w:val="22"/>
+        </w:rPr>
+        <w:t xml:space="preserve">Le tableau est organisé ainsi :</w:t>
+      </w:r>
+    </w:p>
+    <w:p>
+      <w:pPr>
+        <w:pStyle w:val="ListParagraph"/>
+        <w:numPr>
+          <w:ilvl w:val="0"/>
+          <w:numId w:val="3"/>
+        </w:numPr>
+        <w:spacing w:after="40" w:before="40"/>
+      </w:pPr>
+      <w:r>
+        <w:rPr>
+          <w:rFonts w:ascii="Arial" w:cs="Arial" w:eastAsia="Arial" w:hAnsi="Arial"/>
+          <w:color w:val="212529"/>
+          <w:sz w:val="22"/>
+          <w:szCs w:val="22"/>
+        </w:rPr>
+        <w:t xml:space="preserve">Lignes : créneaux temporels (Lundi matin, Lundi après-midi, etc.)</w:t>
+      </w:r>
+    </w:p>
+    <w:p>
+      <w:pPr>
+        <w:pStyle w:val="ListParagraph"/>
+        <w:numPr>
+          <w:ilvl w:val="0"/>
+          <w:numId w:val="3"/>
+        </w:numPr>
+        <w:spacing w:after="40" w:before="40"/>
+      </w:pPr>
+      <w:r>
+        <w:rPr>
+          <w:rFonts w:ascii="Arial" w:cs="Arial" w:eastAsia="Arial" w:hAnsi="Arial"/>
+          <w:color w:val="212529"/>
+          <w:sz w:val="22"/>
+          <w:szCs w:val="22"/>
+        </w:rPr>
+        <w:t xml:space="preserve">Colonnes : postes / salles (Box 1, Box 2, Box 3, Machine, RCP...)</w:t>
+      </w:r>
+    </w:p>
+    <w:p>
+      <w:pPr>
+        <w:pStyle w:val="ListParagraph"/>
+        <w:numPr>
+          <w:ilvl w:val="0"/>
+          <w:numId w:val="3"/>
+        </w:numPr>
+        <w:spacing w:after="40" w:before="40"/>
+      </w:pPr>
+      <w:r>
+        <w:rPr>
+          <w:rFonts w:ascii="Arial" w:cs="Arial" w:eastAsia="Arial" w:hAnsi="Arial"/>
+          <w:color w:val="212529"/>
+          <w:sz w:val="22"/>
+          <w:szCs w:val="22"/>
+        </w:rPr>
+        <w:t xml:space="preserve">Cellules : médecin assigné, affiché avec sa couleur unique</w:t>
+      </w:r>
+    </w:p>
+    <w:p>
+      <w:pPr>
+        <w:spacing w:after="100" w:before="60"/>
+      </w:pPr>
+      <w:r>
+        <w:rPr>
+          <w:rFonts w:ascii="Arial" w:cs="Arial" w:eastAsia="Arial" w:hAnsi="Arial"/>
+          <w:b w:val="false"/>
+          <w:bCs w:val="false"/>
+          <w:i w:val="false"/>
+          <w:iCs w:val="false"/>
+          <w:color w:val="212529"/>
+          <w:sz w:val="22"/>
+          <w:szCs w:val="22"/>
+        </w:rPr>
+        <w:t xml:space="preserve">Chaque médecin a une couleur de badge unique, visible dans la légende en bas de page.</w:t>
+      </w:r>
+    </w:p>
+    <w:p>
+      <w:pPr>
+        <w:pStyle w:val="Heading2"/>
+        <w:spacing w:after="120" w:before="280"/>
+      </w:pPr>
+      <w:r>
+        <w:rPr>
+          <w:rFonts w:ascii="Arial" w:cs="Arial" w:eastAsia="Arial" w:hAnsi="Arial"/>
+          <w:b/>
+          <w:bCs/>
+          <w:color w:val="1971C2"/>
+          <w:sz w:val="26"/>
+          <w:szCs w:val="26"/>
+        </w:rPr>
+        <w:t xml:space="preserve">4.2 Types de slots</w:t>
+      </w:r>
+    </w:p>
+    <w:p>
+      <w:pPr>
+        <w:spacing w:after="120" w:before="0"/>
+      </w:pPr>
+    </w:p>
+    <w:tbl>
+      <w:tblPr>
+        <w:tblW w:type="dxa" w:w="9000"/>
+        <w:tblBorders>
+          <w:top w:val="single" w:color="auto" w:sz="4"/>
+          <w:left w:val="single" w:color="auto" w:sz="4"/>
+          <w:bottom w:val="single" w:color="auto" w:sz="4"/>
+          <w:right w:val="single" w:color="auto" w:sz="4"/>
+          <w:insideH w:val="single" w:color="auto" w:sz="4"/>
+          <w:insideV w:val="single" w:color="auto" w:sz="4"/>
+        </w:tblBorders>
+      </w:tblPr>
+      <w:tblGrid>
+        <w:gridCol w:w="2800"/>
+        <w:gridCol w:w="6200"/>
+      </w:tblGrid>
+      <w:tr>
+        <w:trPr>
+          <w:tblHeader/>
+        </w:trPr>
+        <w:tc>
+          <w:tcPr>
+            <w:tcW w:type="dxa" w:w="2800"/>
+            <w:tcBorders>
+              <w:top w:val="single" w:color="3B5BDB" w:sz="1"/>
+              <w:left w:val="single" w:color="3B5BDB" w:sz="1"/>
+              <w:bottom w:val="single" w:color="3B5BDB" w:sz="1"/>
+              <w:right w:val="single" w:color="3B5BDB" w:sz="1"/>
+            </w:tcBorders>
+            <w:shd w:fill="1E3A5F" w:val="clear"/>
+            <w:tcMar>
+              <w:top w:type="dxa" w:w="80"/>
+              <w:left w:type="dxa" w:w="140"/>
+              <w:bottom w:type="dxa" w:w="80"/>
+              <w:right w:type="dxa" w:w="140"/>
+            </w:tcMar>
+          </w:tcPr>
+          <w:p>
+            <w:pPr>
+              <w:spacing w:after="0" w:before="0"/>
+            </w:pPr>
+            <w:r>
+              <w:rPr>
+                <w:rFonts w:ascii="Arial" w:cs="Arial" w:eastAsia="Arial" w:hAnsi="Arial"/>
+                <w:b/>
+                <w:bCs/>
+                <w:color w:val="FFFFFF"/>
+                <w:sz w:val="20"/>
+                <w:szCs w:val="20"/>
+              </w:rPr>
+              <w:t xml:space="preserve">Type</w:t>
+            </w:r>
+          </w:p>
+        </w:tc>
+        <w:tc>
+          <w:tcPr>
+            <w:tcW w:type="dxa" w:w="6200"/>
+            <w:tcBorders>
+              <w:top w:val="single" w:color="3B5BDB" w:sz="1"/>
+              <w:left w:val="single" w:color="3B5BDB" w:sz="1"/>
+              <w:bottom w:val="single" w:color="3B5BDB" w:sz="1"/>
+              <w:right w:val="single" w:color="3B5BDB" w:sz="1"/>
+            </w:tcBorders>
+            <w:shd w:fill="1E3A5F" w:val="clear"/>
+            <w:tcMar>
+              <w:top w:type="dxa" w:w="80"/>
+              <w:left w:type="dxa" w:w="140"/>
+              <w:bottom w:type="dxa" w:w="80"/>
+              <w:right w:type="dxa" w:w="140"/>
+            </w:tcMar>
+          </w:tcPr>
+          <w:p>
+            <w:pPr>
+              <w:spacing w:after="0" w:before="0"/>
+            </w:pPr>
+            <w:r>
+              <w:rPr>
+                <w:rFonts w:ascii="Arial" w:cs="Arial" w:eastAsia="Arial" w:hAnsi="Arial"/>
+                <w:b/>
+                <w:bCs/>
+                <w:color w:val="FFFFFF"/>
+                <w:sz w:val="20"/>
+                <w:szCs w:val="20"/>
+              </w:rPr>
+              <w:t xml:space="preserve">Description</w:t>
+            </w:r>
+          </w:p>
+        </w:tc>
+      </w:tr>
+      <w:tr>
+        <w:tc>
+          <w:tcPr>
+            <w:tcW w:type="dxa" w:w="2800"/>
+            <w:tcBorders>
+              <w:top w:val="single" w:color="C5D3E8" w:sz="1"/>
+              <w:left w:val="single" w:color="C5D3E8" w:sz="1"/>
+              <w:bottom w:val="single" w:color="C5D3E8" w:sz="1"/>
+              <w:right w:val="single" w:color="C5D3E8" w:sz="1"/>
+            </w:tcBorders>
+            <w:shd w:fill="FFFFFF" w:val="clear"/>
+            <w:tcMar>
+              <w:top w:type="dxa" w:w="80"/>
+              <w:left w:type="dxa" w:w="140"/>
+              <w:bottom w:type="dxa" w:w="80"/>
+              <w:right w:type="dxa" w:w="140"/>
+            </w:tcMar>
+          </w:tcPr>
+          <w:p>
+            <w:pPr>
+              <w:spacing w:after="0" w:before="0"/>
+            </w:pPr>
+            <w:r>
+              <w:rPr>
+                <w:rFonts w:ascii="Arial" w:cs="Arial" w:eastAsia="Arial" w:hAnsi="Arial"/>
+                <w:color w:val="212529"/>
+                <w:sz w:val="20"/>
+                <w:szCs w:val="20"/>
+              </w:rPr>
+              <w:t xml:space="preserve">Consultation</w:t>
+            </w:r>
+          </w:p>
+        </w:tc>
+        <w:tc>
+          <w:tcPr>
+            <w:tcW w:type="dxa" w:w="6200"/>
+            <w:tcBorders>
+              <w:top w:val="single" w:color="C5D3E8" w:sz="1"/>
+              <w:left w:val="single" w:color="C5D3E8" w:sz="1"/>
+              <w:bottom w:val="single" w:color="C5D3E8" w:sz="1"/>
+              <w:right w:val="single" w:color="C5D3E8" w:sz="1"/>
+            </w:tcBorders>
+            <w:shd w:fill="FFFFFF" w:val="clear"/>
+            <w:tcMar>
+              <w:top w:type="dxa" w:w="80"/>
+              <w:left w:type="dxa" w:w="140"/>
+              <w:bottom w:type="dxa" w:w="80"/>
+              <w:right w:type="dxa" w:w="140"/>
+            </w:tcMar>
+          </w:tcPr>
+          <w:p>
+            <w:pPr>
+              <w:spacing w:after="0" w:before="0"/>
+            </w:pPr>
+            <w:r>
+              <w:rPr>
+                <w:rFonts w:ascii="Arial" w:cs="Arial" w:eastAsia="Arial" w:hAnsi="Arial"/>
+                <w:color w:val="212529"/>
+                <w:sz w:val="20"/>
+                <w:szCs w:val="20"/>
+              </w:rPr>
+              <w:t xml:space="preserve">Consultation patient en salle Box (Box 1, 2, 3)</w:t>
+            </w:r>
+          </w:p>
+        </w:tc>
+      </w:tr>
+      <w:tr>
+        <w:tc>
+          <w:tcPr>
+            <w:tcW w:type="dxa" w:w="2800"/>
+            <w:tcBorders>
+              <w:top w:val="single" w:color="C5D3E8" w:sz="1"/>
+              <w:left w:val="single" w:color="C5D3E8" w:sz="1"/>
+              <w:bottom w:val="single" w:color="C5D3E8" w:sz="1"/>
+              <w:right w:val="single" w:color="C5D3E8" w:sz="1"/>
+            </w:tcBorders>
+            <w:shd w:fill="F1F3F9" w:val="clear"/>
+            <w:tcMar>
+              <w:top w:type="dxa" w:w="80"/>
+              <w:left w:type="dxa" w:w="140"/>
+              <w:bottom w:type="dxa" w:w="80"/>
+              <w:right w:type="dxa" w:w="140"/>
+            </w:tcMar>
+          </w:tcPr>
+          <w:p>
+            <w:pPr>
+              <w:spacing w:after="0" w:before="0"/>
+            </w:pPr>
+            <w:r>
+              <w:rPr>
+                <w:rFonts w:ascii="Arial" w:cs="Arial" w:eastAsia="Arial" w:hAnsi="Arial"/>
+                <w:color w:val="212529"/>
+                <w:sz w:val="20"/>
+                <w:szCs w:val="20"/>
+              </w:rPr>
+              <w:t xml:space="preserve">RCP</w:t>
+            </w:r>
+          </w:p>
+        </w:tc>
+        <w:tc>
+          <w:tcPr>
+            <w:tcW w:type="dxa" w:w="6200"/>
+            <w:tcBorders>
+              <w:top w:val="single" w:color="C5D3E8" w:sz="1"/>
+              <w:left w:val="single" w:color="C5D3E8" w:sz="1"/>
+              <w:bottom w:val="single" w:color="C5D3E8" w:sz="1"/>
+              <w:right w:val="single" w:color="C5D3E8" w:sz="1"/>
+            </w:tcBorders>
+            <w:shd w:fill="F1F3F9" w:val="clear"/>
+            <w:tcMar>
+              <w:top w:type="dxa" w:w="80"/>
+              <w:left w:type="dxa" w:w="140"/>
+              <w:bottom w:type="dxa" w:w="80"/>
+              <w:right w:type="dxa" w:w="140"/>
+            </w:tcMar>
+          </w:tcPr>
+          <w:p>
+            <w:pPr>
+              <w:spacing w:after="0" w:before="0"/>
+            </w:pPr>
+            <w:r>
+              <w:rPr>
+                <w:rFonts w:ascii="Arial" w:cs="Arial" w:eastAsia="Arial" w:hAnsi="Arial"/>
+                <w:color w:val="212529"/>
+                <w:sz w:val="20"/>
+                <w:szCs w:val="20"/>
+              </w:rPr>
+              <w:t xml:space="preserve">Réunion de Concertation Pluridisciplinaire</w:t>
+            </w:r>
+          </w:p>
+        </w:tc>
+      </w:tr>
+      <w:tr>
+        <w:tc>
+          <w:tcPr>
+            <w:tcW w:type="dxa" w:w="2800"/>
+            <w:tcBorders>
+              <w:top w:val="single" w:color="C5D3E8" w:sz="1"/>
+              <w:left w:val="single" w:color="C5D3E8" w:sz="1"/>
+              <w:bottom w:val="single" w:color="C5D3E8" w:sz="1"/>
+              <w:right w:val="single" w:color="C5D3E8" w:sz="1"/>
+            </w:tcBorders>
+            <w:shd w:fill="FFFFFF" w:val="clear"/>
+            <w:tcMar>
+              <w:top w:type="dxa" w:w="80"/>
+              <w:left w:type="dxa" w:w="140"/>
+              <w:bottom w:type="dxa" w:w="80"/>
+              <w:right w:type="dxa" w:w="140"/>
+            </w:tcMar>
+          </w:tcPr>
+          <w:p>
+            <w:pPr>
+              <w:spacing w:after="0" w:before="0"/>
+            </w:pPr>
+            <w:r>
+              <w:rPr>
+                <w:rFonts w:ascii="Arial" w:cs="Arial" w:eastAsia="Arial" w:hAnsi="Arial"/>
+                <w:color w:val="212529"/>
+                <w:sz w:val="20"/>
+                <w:szCs w:val="20"/>
+              </w:rPr>
+              <w:t xml:space="preserve">Activité</w:t>
+            </w:r>
+          </w:p>
+        </w:tc>
+        <w:tc>
+          <w:tcPr>
+            <w:tcW w:type="dxa" w:w="6200"/>
+            <w:tcBorders>
+              <w:top w:val="single" w:color="C5D3E8" w:sz="1"/>
+              <w:left w:val="single" w:color="C5D3E8" w:sz="1"/>
+              <w:bottom w:val="single" w:color="C5D3E8" w:sz="1"/>
+              <w:right w:val="single" w:color="C5D3E8" w:sz="1"/>
+            </w:tcBorders>
+            <w:shd w:fill="FFFFFF" w:val="clear"/>
+            <w:tcMar>
+              <w:top w:type="dxa" w:w="80"/>
+              <w:left w:type="dxa" w:w="140"/>
+              <w:bottom w:type="dxa" w:w="80"/>
+              <w:right w:type="dxa" w:w="140"/>
+            </w:tcMar>
+          </w:tcPr>
+          <w:p>
+            <w:pPr>
+              <w:spacing w:after="0" w:before="0"/>
+            </w:pPr>
+            <w:r>
+              <w:rPr>
+                <w:rFonts w:ascii="Arial" w:cs="Arial" w:eastAsia="Arial" w:hAnsi="Arial"/>
+                <w:color w:val="212529"/>
+                <w:sz w:val="20"/>
+                <w:szCs w:val="20"/>
+              </w:rPr>
+              <w:t xml:space="preserve">Astreinte, Unity ou Supervision Workflow</w:t>
+            </w:r>
+          </w:p>
+        </w:tc>
+      </w:tr>
+      <w:tr>
+        <w:tc>
+          <w:tcPr>
+            <w:tcW w:type="dxa" w:w="2800"/>
+            <w:tcBorders>
+              <w:top w:val="single" w:color="C5D3E8" w:sz="1"/>
+              <w:left w:val="single" w:color="C5D3E8" w:sz="1"/>
+              <w:bottom w:val="single" w:color="C5D3E8" w:sz="1"/>
+              <w:right w:val="single" w:color="C5D3E8" w:sz="1"/>
+            </w:tcBorders>
+            <w:shd w:fill="F1F3F9" w:val="clear"/>
+            <w:tcMar>
+              <w:top w:type="dxa" w:w="80"/>
+              <w:left w:type="dxa" w:w="140"/>
+              <w:bottom w:type="dxa" w:w="80"/>
+              <w:right w:type="dxa" w:w="140"/>
+            </w:tcMar>
+          </w:tcPr>
+          <w:p>
+            <w:pPr>
+              <w:spacing w:after="0" w:before="0"/>
+            </w:pPr>
+            <w:r>
+              <w:rPr>
+                <w:rFonts w:ascii="Arial" w:cs="Arial" w:eastAsia="Arial" w:hAnsi="Arial"/>
+                <w:color w:val="212529"/>
+                <w:sz w:val="20"/>
+                <w:szCs w:val="20"/>
+              </w:rPr>
+              <w:t xml:space="preserve">Machine</w:t>
+            </w:r>
+          </w:p>
+        </w:tc>
+        <w:tc>
+          <w:tcPr>
+            <w:tcW w:type="dxa" w:w="6200"/>
+            <w:tcBorders>
+              <w:top w:val="single" w:color="C5D3E8" w:sz="1"/>
+              <w:left w:val="single" w:color="C5D3E8" w:sz="1"/>
+              <w:bottom w:val="single" w:color="C5D3E8" w:sz="1"/>
+              <w:right w:val="single" w:color="C5D3E8" w:sz="1"/>
+            </w:tcBorders>
+            <w:shd w:fill="F1F3F9" w:val="clear"/>
+            <w:tcMar>
+              <w:top w:type="dxa" w:w="80"/>
+              <w:left w:type="dxa" w:w="140"/>
+              <w:bottom w:type="dxa" w:w="80"/>
+              <w:right w:type="dxa" w:w="140"/>
+            </w:tcMar>
+          </w:tcPr>
+          <w:p>
+            <w:pPr>
+              <w:spacing w:after="0" w:before="0"/>
+            </w:pPr>
+            <w:r>
+              <w:rPr>
+                <w:rFonts w:ascii="Arial" w:cs="Arial" w:eastAsia="Arial" w:hAnsi="Arial"/>
+                <w:color w:val="212529"/>
+                <w:sz w:val="20"/>
+                <w:szCs w:val="20"/>
+              </w:rPr>
+              <w:t xml:space="preserve">Supervision d'un appareil de traitement</w:t>
+            </w:r>
+          </w:p>
+        </w:tc>
+      </w:tr>
+    </w:tbl>
+    <w:p>
+      <w:pPr>
+        <w:spacing w:after="160" w:before="0"/>
+      </w:pPr>
+    </w:p>
+    <w:p>
+      <w:pPr>
+        <w:pStyle w:val="Heading2"/>
+        <w:spacing w:after="120" w:before="280"/>
+      </w:pPr>
+      <w:r>
+        <w:rPr>
+          <w:rFonts w:ascii="Arial" w:cs="Arial" w:eastAsia="Arial" w:hAnsi="Arial"/>
+          <w:b/>
+          <w:bCs/>
+          <w:color w:val="1971C2"/>
+          <w:sz w:val="26"/>
+          <w:szCs w:val="26"/>
+        </w:rPr>
+        <w:t xml:space="preserve">4.3 Semaine verrouillée</w:t>
+      </w:r>
+    </w:p>
+    <w:p>
+      <w:pPr>
+        <w:spacing w:after="100" w:before="60"/>
+      </w:pPr>
+      <w:r>
+        <w:rPr>
+          <w:rFonts w:ascii="Arial" w:cs="Arial" w:eastAsia="Arial" w:hAnsi="Arial"/>
+          <w:b w:val="false"/>
+          <w:bCs w:val="false"/>
+          <w:i w:val="false"/>
+          <w:iCs w:val="false"/>
+          <w:color w:val="212529"/>
+          <w:sz w:val="22"/>
+          <w:szCs w:val="22"/>
+        </w:rPr>
+        <w:t xml:space="preserve">Quand un cadenas 🔒 apparaît sur la semaine, le planning a été validé par l'administrateur. Aucune interaction n'est possible — le planning est en lecture seule.</w:t>
+      </w:r>
+    </w:p>
+    <w:p>
+      <w:pPr>
+        <w:pStyle w:val="Heading2"/>
+        <w:spacing w:after="120" w:before="280"/>
+      </w:pPr>
+      <w:r>
+        <w:rPr>
+          <w:rFonts w:ascii="Arial" w:cs="Arial" w:eastAsia="Arial" w:hAnsi="Arial"/>
+          <w:b/>
+          <w:bCs/>
+          <w:color w:val="1971C2"/>
+          <w:sz w:val="26"/>
+          <w:szCs w:val="26"/>
+        </w:rPr>
+        <w:t xml:space="preserve">4.4 Exporter le planning</w:t>
+      </w:r>
+    </w:p>
+    <w:p>
+      <w:pPr>
+        <w:pStyle w:val="ListParagraph"/>
+        <w:numPr>
+          <w:ilvl w:val="0"/>
+          <w:numId w:val="3"/>
+        </w:numPr>
+        <w:spacing w:after="40" w:before="40"/>
+      </w:pPr>
+      <w:r>
+        <w:rPr>
+          <w:rFonts w:ascii="Arial" w:cs="Arial" w:eastAsia="Arial" w:hAnsi="Arial"/>
+          <w:color w:val="212529"/>
+          <w:sz w:val="22"/>
+          <w:szCs w:val="22"/>
+        </w:rPr>
+        <w:t xml:space="preserve">Bouton "PDF" : génère un PDF imprimable de la semaine affichée.</w:t>
+      </w:r>
+    </w:p>
+    <w:p>
+      <w:pPr>
+        <w:pStyle w:val="ListParagraph"/>
+        <w:numPr>
+          <w:ilvl w:val="0"/>
+          <w:numId w:val="3"/>
+        </w:numPr>
+        <w:spacing w:after="40" w:before="40"/>
+      </w:pPr>
+      <w:r>
+        <w:rPr>
+          <w:rFonts w:ascii="Arial" w:cs="Arial" w:eastAsia="Arial" w:hAnsi="Arial"/>
+          <w:color w:val="212529"/>
+          <w:sz w:val="22"/>
+          <w:szCs w:val="22"/>
+        </w:rPr>
+        <w:t xml:space="preserve">Bouton "Image" : télécharge une capture PNG du tableau.</w:t>
+      </w:r>
+    </w:p>
+    <w:p>
+      <w:pPr>
+        <w:pBdr>
+          <w:left w:val="single" w:color="3B5BDB" w:sz="8" w:space="8"/>
+        </w:pBdr>
+        <w:spacing w:after="80" w:before="80"/>
+        <w:ind w:left="360"/>
+      </w:pPr>
+      <w:r>
+        <w:rPr>
+          <w:rFonts w:ascii="Arial" w:cs="Arial" w:eastAsia="Arial" w:hAnsi="Arial"/>
+          <w:sz w:val="22"/>
+          <w:szCs w:val="22"/>
+        </w:rPr>
+        <w:t xml:space="preserve">💡 </w:t>
+      </w:r>
+      <w:r>
+        <w:rPr>
+          <w:rFonts w:ascii="Arial" w:cs="Arial" w:eastAsia="Arial" w:hAnsi="Arial"/>
+          <w:i/>
+          <w:iCs/>
+          <w:color w:val="1971C2"/>
+          <w:sz w:val="22"/>
+          <w:szCs w:val="22"/>
+        </w:rPr>
+        <w:t xml:space="preserve">Ces exports sont pratiques pour partager ou afficher le planning de la semaine dans le service.</w:t>
+      </w:r>
+    </w:p>
+    <w:p>
+      <w:pPr>
+        <w:pStyle w:val="Heading1"/>
+        <w:pageBreakBefore/>
+        <w:spacing w:after="240" w:before="0"/>
+      </w:pPr>
+      <w:r>
+        <w:rPr>
+          <w:rFonts w:ascii="Arial" w:cs="Arial" w:eastAsia="Arial" w:hAnsi="Arial"/>
+          <w:b/>
+          <w:bCs/>
+          <w:color w:val="3B5BDB"/>
+          <w:sz w:val="32"/>
+          <w:szCs w:val="32"/>
+        </w:rPr>
+        <w:t xml:space="preserve">5. Activités &amp; Répartition automatique</w:t>
+      </w:r>
+    </w:p>
+    <w:p>
+      <w:pPr>
+        <w:spacing w:after="100" w:before="60"/>
+      </w:pPr>
+      <w:r>
+        <w:rPr>
+          <w:rFonts w:ascii="Arial" w:cs="Arial" w:eastAsia="Arial" w:hAnsi="Arial"/>
+          <w:b w:val="false"/>
+          <w:bCs w:val="false"/>
+          <w:i w:val="false"/>
+          <w:iCs w:val="false"/>
+          <w:color w:val="212529"/>
+          <w:sz w:val="22"/>
+          <w:szCs w:val="22"/>
+        </w:rPr>
+        <w:t xml:space="preserve">La page Activités gère les gardes et activités spécialisées. Le système les répartit automatiquement de façon équitable entre tous les médecins du service.</w:t>
+      </w:r>
+    </w:p>
+    <w:p>
+      <w:pPr>
+        <w:pStyle w:val="Heading2"/>
+        <w:spacing w:after="120" w:before="280"/>
+      </w:pPr>
+      <w:r>
+        <w:rPr>
+          <w:rFonts w:ascii="Arial" w:cs="Arial" w:eastAsia="Arial" w:hAnsi="Arial"/>
+          <w:b/>
+          <w:bCs/>
+          <w:color w:val="1971C2"/>
+          <w:sz w:val="26"/>
+          <w:szCs w:val="26"/>
+        </w:rPr>
+        <w:t xml:space="preserve">5.1 Les trois types d'activités</w:t>
+      </w:r>
+    </w:p>
+    <w:p>
+      <w:pPr>
+        <w:spacing w:after="120" w:before="0"/>
+      </w:pPr>
+    </w:p>
+    <w:tbl>
+      <w:tblPr>
+        <w:tblW w:type="dxa" w:w="9000"/>
+        <w:tblBorders>
+          <w:top w:val="single" w:color="auto" w:sz="4"/>
+          <w:left w:val="single" w:color="auto" w:sz="4"/>
+          <w:bottom w:val="single" w:color="auto" w:sz="4"/>
+          <w:right w:val="single" w:color="auto" w:sz="4"/>
+          <w:insideH w:val="single" w:color="auto" w:sz="4"/>
+          <w:insideV w:val="single" w:color="auto" w:sz="4"/>
+        </w:tblBorders>
+      </w:tblPr>
+      <w:tblGrid>
+        <w:gridCol w:w="2400"/>
+        <w:gridCol w:w="6600"/>
+      </w:tblGrid>
+      <w:tr>
+        <w:trPr>
+          <w:tblHeader/>
+        </w:trPr>
+        <w:tc>
+          <w:tcPr>
+            <w:tcW w:type="dxa" w:w="2400"/>
+            <w:tcBorders>
+              <w:top w:val="single" w:color="3B5BDB" w:sz="1"/>
+              <w:left w:val="single" w:color="3B5BDB" w:sz="1"/>
+              <w:bottom w:val="single" w:color="3B5BDB" w:sz="1"/>
+              <w:right w:val="single" w:color="3B5BDB" w:sz="1"/>
+            </w:tcBorders>
+            <w:shd w:fill="1E3A5F" w:val="clear"/>
+            <w:tcMar>
+              <w:top w:type="dxa" w:w="80"/>
+              <w:left w:type="dxa" w:w="140"/>
+              <w:bottom w:type="dxa" w:w="80"/>
+              <w:right w:type="dxa" w:w="140"/>
+            </w:tcMar>
+          </w:tcPr>
+          <w:p>
+            <w:pPr>
+              <w:spacing w:after="0" w:before="0"/>
+            </w:pPr>
+            <w:r>
+              <w:rPr>
+                <w:rFonts w:ascii="Arial" w:cs="Arial" w:eastAsia="Arial" w:hAnsi="Arial"/>
+                <w:b/>
+                <w:bCs/>
+                <w:color w:val="FFFFFF"/>
+                <w:sz w:val="20"/>
+                <w:szCs w:val="20"/>
+              </w:rPr>
+              <w:t xml:space="preserve">Activité</w:t>
+            </w:r>
+          </w:p>
+        </w:tc>
+        <w:tc>
+          <w:tcPr>
+            <w:tcW w:type="dxa" w:w="6600"/>
+            <w:tcBorders>
+              <w:top w:val="single" w:color="3B5BDB" w:sz="1"/>
+              <w:left w:val="single" w:color="3B5BDB" w:sz="1"/>
+              <w:bottom w:val="single" w:color="3B5BDB" w:sz="1"/>
+              <w:right w:val="single" w:color="3B5BDB" w:sz="1"/>
+            </w:tcBorders>
+            <w:shd w:fill="1E3A5F" w:val="clear"/>
+            <w:tcMar>
+              <w:top w:type="dxa" w:w="80"/>
+              <w:left w:type="dxa" w:w="140"/>
+              <w:bottom w:type="dxa" w:w="80"/>
+              <w:right w:type="dxa" w:w="140"/>
+            </w:tcMar>
+          </w:tcPr>
+          <w:p>
+            <w:pPr>
+              <w:spacing w:after="0" w:before="0"/>
+            </w:pPr>
+            <w:r>
+              <w:rPr>
+                <w:rFonts w:ascii="Arial" w:cs="Arial" w:eastAsia="Arial" w:hAnsi="Arial"/>
+                <w:b/>
+                <w:bCs/>
+                <w:color w:val="FFFFFF"/>
+                <w:sz w:val="20"/>
+                <w:szCs w:val="20"/>
+              </w:rPr>
+              <w:t xml:space="preserve">Description</w:t>
+            </w:r>
+          </w:p>
+        </w:tc>
+      </w:tr>
+      <w:tr>
+        <w:tc>
+          <w:tcPr>
+            <w:tcW w:type="dxa" w:w="2400"/>
+            <w:tcBorders>
+              <w:top w:val="single" w:color="C5D3E8" w:sz="1"/>
+              <w:left w:val="single" w:color="C5D3E8" w:sz="1"/>
+              <w:bottom w:val="single" w:color="C5D3E8" w:sz="1"/>
+              <w:right w:val="single" w:color="C5D3E8" w:sz="1"/>
+            </w:tcBorders>
+            <w:shd w:fill="FFFFFF" w:val="clear"/>
+            <w:tcMar>
+              <w:top w:type="dxa" w:w="80"/>
+              <w:left w:type="dxa" w:w="140"/>
+              <w:bottom w:type="dxa" w:w="80"/>
+              <w:right w:type="dxa" w:w="140"/>
+            </w:tcMar>
+          </w:tcPr>
+          <w:p>
+            <w:pPr>
+              <w:spacing w:after="0" w:before="0"/>
+            </w:pPr>
+            <w:r>
+              <w:rPr>
+                <w:rFonts w:ascii="Arial" w:cs="Arial" w:eastAsia="Arial" w:hAnsi="Arial"/>
+                <w:color w:val="212529"/>
+                <w:sz w:val="20"/>
+                <w:szCs w:val="20"/>
+              </w:rPr>
+              <w:t xml:space="preserve">Astreinte</w:t>
+            </w:r>
+          </w:p>
+        </w:tc>
+        <w:tc>
+          <w:tcPr>
+            <w:tcW w:type="dxa" w:w="6600"/>
+            <w:tcBorders>
+              <w:top w:val="single" w:color="C5D3E8" w:sz="1"/>
+              <w:left w:val="single" w:color="C5D3E8" w:sz="1"/>
+              <w:bottom w:val="single" w:color="C5D3E8" w:sz="1"/>
+              <w:right w:val="single" w:color="C5D3E8" w:sz="1"/>
+            </w:tcBorders>
+            <w:shd w:fill="FFFFFF" w:val="clear"/>
+            <w:tcMar>
+              <w:top w:type="dxa" w:w="80"/>
+              <w:left w:type="dxa" w:w="140"/>
+              <w:bottom w:type="dxa" w:w="80"/>
+              <w:right w:type="dxa" w:w="140"/>
+            </w:tcMar>
+          </w:tcPr>
+          <w:p>
+            <w:pPr>
+              <w:spacing w:after="0" w:before="0"/>
+            </w:pPr>
+            <w:r>
+              <w:rPr>
+                <w:rFonts w:ascii="Arial" w:cs="Arial" w:eastAsia="Arial" w:hAnsi="Arial"/>
+                <w:color w:val="212529"/>
+                <w:sz w:val="20"/>
+                <w:szCs w:val="20"/>
+              </w:rPr>
+              <w:t xml:space="preserve">Garde sur site ou à distance. Pool commun avec Unity.</w:t>
+            </w:r>
+          </w:p>
+        </w:tc>
+      </w:tr>
+      <w:tr>
+        <w:tc>
+          <w:tcPr>
+            <w:tcW w:type="dxa" w:w="2400"/>
+            <w:tcBorders>
+              <w:top w:val="single" w:color="C5D3E8" w:sz="1"/>
+              <w:left w:val="single" w:color="C5D3E8" w:sz="1"/>
+              <w:bottom w:val="single" w:color="C5D3E8" w:sz="1"/>
+              <w:right w:val="single" w:color="C5D3E8" w:sz="1"/>
+            </w:tcBorders>
+            <w:shd w:fill="F1F3F9" w:val="clear"/>
+            <w:tcMar>
+              <w:top w:type="dxa" w:w="80"/>
+              <w:left w:type="dxa" w:w="140"/>
+              <w:bottom w:type="dxa" w:w="80"/>
+              <w:right w:type="dxa" w:w="140"/>
+            </w:tcMar>
+          </w:tcPr>
+          <w:p>
+            <w:pPr>
+              <w:spacing w:after="0" w:before="0"/>
+            </w:pPr>
+            <w:r>
+              <w:rPr>
+                <w:rFonts w:ascii="Arial" w:cs="Arial" w:eastAsia="Arial" w:hAnsi="Arial"/>
+                <w:color w:val="212529"/>
+                <w:sz w:val="20"/>
+                <w:szCs w:val="20"/>
+              </w:rPr>
+              <w:t xml:space="preserve">Unity</w:t>
+            </w:r>
+          </w:p>
+        </w:tc>
+        <w:tc>
+          <w:tcPr>
+            <w:tcW w:type="dxa" w:w="6600"/>
+            <w:tcBorders>
+              <w:top w:val="single" w:color="C5D3E8" w:sz="1"/>
+              <w:left w:val="single" w:color="C5D3E8" w:sz="1"/>
+              <w:bottom w:val="single" w:color="C5D3E8" w:sz="1"/>
+              <w:right w:val="single" w:color="C5D3E8" w:sz="1"/>
+            </w:tcBorders>
+            <w:shd w:fill="F1F3F9" w:val="clear"/>
+            <w:tcMar>
+              <w:top w:type="dxa" w:w="80"/>
+              <w:left w:type="dxa" w:w="140"/>
+              <w:bottom w:type="dxa" w:w="80"/>
+              <w:right w:type="dxa" w:w="140"/>
+            </w:tcMar>
+          </w:tcPr>
+          <w:p>
+            <w:pPr>
+              <w:spacing w:after="0" w:before="0"/>
+            </w:pPr>
+            <w:r>
+              <w:rPr>
+                <w:rFonts w:ascii="Arial" w:cs="Arial" w:eastAsia="Arial" w:hAnsi="Arial"/>
+                <w:color w:val="212529"/>
+                <w:sz w:val="20"/>
+                <w:szCs w:val="20"/>
+              </w:rPr>
+              <w:t xml:space="preserve">Supervision de la machine Unity. Pool commun avec Astreinte.</w:t>
+            </w:r>
+          </w:p>
+        </w:tc>
+      </w:tr>
+      <w:tr>
+        <w:tc>
+          <w:tcPr>
+            <w:tcW w:type="dxa" w:w="2400"/>
+            <w:tcBorders>
+              <w:top w:val="single" w:color="C5D3E8" w:sz="1"/>
+              <w:left w:val="single" w:color="C5D3E8" w:sz="1"/>
+              <w:bottom w:val="single" w:color="C5D3E8" w:sz="1"/>
+              <w:right w:val="single" w:color="C5D3E8" w:sz="1"/>
+            </w:tcBorders>
+            <w:shd w:fill="FFFFFF" w:val="clear"/>
+            <w:tcMar>
+              <w:top w:type="dxa" w:w="80"/>
+              <w:left w:type="dxa" w:w="140"/>
+              <w:bottom w:type="dxa" w:w="80"/>
+              <w:right w:type="dxa" w:w="140"/>
+            </w:tcMar>
+          </w:tcPr>
+          <w:p>
+            <w:pPr>
+              <w:spacing w:after="0" w:before="0"/>
+            </w:pPr>
+            <w:r>
+              <w:rPr>
+                <w:rFonts w:ascii="Arial" w:cs="Arial" w:eastAsia="Arial" w:hAnsi="Arial"/>
+                <w:color w:val="212529"/>
+                <w:sz w:val="20"/>
+                <w:szCs w:val="20"/>
+              </w:rPr>
+              <w:t xml:space="preserve">Supervision Workflow</w:t>
+            </w:r>
+          </w:p>
+        </w:tc>
+        <w:tc>
+          <w:tcPr>
+            <w:tcW w:type="dxa" w:w="6600"/>
+            <w:tcBorders>
+              <w:top w:val="single" w:color="C5D3E8" w:sz="1"/>
+              <w:left w:val="single" w:color="C5D3E8" w:sz="1"/>
+              <w:bottom w:val="single" w:color="C5D3E8" w:sz="1"/>
+              <w:right w:val="single" w:color="C5D3E8" w:sz="1"/>
+            </w:tcBorders>
+            <w:shd w:fill="FFFFFF" w:val="clear"/>
+            <w:tcMar>
+              <w:top w:type="dxa" w:w="80"/>
+              <w:left w:type="dxa" w:w="140"/>
+              <w:bottom w:type="dxa" w:w="80"/>
+              <w:right w:type="dxa" w:w="140"/>
+            </w:tcMar>
+          </w:tcPr>
+          <w:p>
+            <w:pPr>
+              <w:spacing w:after="0" w:before="0"/>
+            </w:pPr>
+            <w:r>
+              <w:rPr>
+                <w:rFonts w:ascii="Arial" w:cs="Arial" w:eastAsia="Arial" w:hAnsi="Arial"/>
+                <w:color w:val="212529"/>
+                <w:sz w:val="20"/>
+                <w:szCs w:val="20"/>
+              </w:rPr>
+              <w:t xml:space="preserve">Supervision du circuit patients/workflow. Pool indépendant.</w:t>
+            </w:r>
+          </w:p>
+        </w:tc>
+      </w:tr>
+    </w:tbl>
+    <w:p>
+      <w:pPr>
+        <w:spacing w:after="160" w:before="0"/>
+      </w:pPr>
+    </w:p>
+    <w:p>
+      <w:pPr>
+        <w:pStyle w:val="Heading2"/>
+        <w:spacing w:after="120" w:before="280"/>
+      </w:pPr>
+      <w:r>
+        <w:rPr>
+          <w:rFonts w:ascii="Arial" w:cs="Arial" w:eastAsia="Arial" w:hAnsi="Arial"/>
+          <w:b/>
+          <w:bCs/>
+          <w:color w:val="1971C2"/>
+          <w:sz w:val="26"/>
+          <w:szCs w:val="26"/>
+        </w:rPr>
+        <w:t xml:space="preserve">5.2 Comment fonctionne la répartition automatique</w:t>
+      </w:r>
+    </w:p>
+    <w:p>
+      <w:pPr>
+        <w:spacing w:after="100" w:before="60"/>
+      </w:pPr>
+      <w:r>
+        <w:rPr>
+          <w:rFonts w:ascii="Arial" w:cs="Arial" w:eastAsia="Arial" w:hAnsi="Arial"/>
+          <w:b w:val="false"/>
+          <w:bCs w:val="false"/>
+          <w:i w:val="false"/>
+          <w:iCs w:val="false"/>
+          <w:color w:val="212529"/>
+          <w:sz w:val="22"/>
+          <w:szCs w:val="22"/>
+        </w:rPr>
+        <w:t xml:space="preserve">Chaque semaine, le système désigne automatiquement le médecin pour chaque activité. Voici la logique, étape par étape :</w:t>
+      </w:r>
+    </w:p>
+    <w:p>
+      <w:pPr>
+        <w:pStyle w:val="ListParagraph"/>
+        <w:numPr>
+          <w:ilvl w:val="0"/>
+          <w:numId w:val="2"/>
+        </w:numPr>
+        <w:spacing w:after="40" w:before="40"/>
+      </w:pPr>
+      <w:r>
+        <w:rPr>
+          <w:rFonts w:ascii="Arial" w:cs="Arial" w:eastAsia="Arial" w:hAnsi="Arial"/>
+          <w:color w:val="212529"/>
+          <w:sz w:val="22"/>
+          <w:szCs w:val="22"/>
+        </w:rPr>
+        <w:t xml:space="preserve">Étape 1 — Filtrer les absents : tout médecin absent ce jour-là est exclu de la sélection.</w:t>
+      </w:r>
+    </w:p>
+    <w:p>
+      <w:pPr>
+        <w:pStyle w:val="ListParagraph"/>
+        <w:numPr>
+          <w:ilvl w:val="0"/>
+          <w:numId w:val="2"/>
+        </w:numPr>
+        <w:spacing w:after="40" w:before="40"/>
+      </w:pPr>
+      <w:r>
+        <w:rPr>
+          <w:rFonts w:ascii="Arial" w:cs="Arial" w:eastAsia="Arial" w:hAnsi="Arial"/>
+          <w:color w:val="212529"/>
+          <w:sz w:val="22"/>
+          <w:szCs w:val="22"/>
+        </w:rPr>
+        <w:t xml:space="preserve">Étape 2 — Calculer le score d'équité pour chaque médecin disponible :</w:t>
+      </w:r>
+    </w:p>
+    <w:p>
+      <w:pPr>
+        <w:pBdr>
+          <w:top w:val="single" w:color="C5D3E8" w:sz="1"/>
+          <w:bottom w:val="single" w:color="C5D3E8" w:sz="1"/>
+          <w:left w:val="single" w:color="3B5BDB" w:sz="1"/>
+          <w:right w:val="single" w:color="C5D3E8" w:sz="1"/>
+        </w:pBdr>
+        <w:spacing w:after="120" w:before="120"/>
+        <w:ind w:left="720" w:right="720"/>
+        <w:jc w:val="center"/>
+      </w:pPr>
+      <w:r>
+        <w:rPr>
+          <w:rFonts w:ascii="Arial" w:cs="Arial" w:eastAsia="Arial" w:hAnsi="Arial"/>
+          <w:b/>
+          <w:bCs/>
+          <w:i/>
+          <w:iCs/>
+          <w:color w:val="3B5BDB"/>
+          <w:sz w:val="22"/>
+          <w:szCs w:val="22"/>
+        </w:rPr>
+        <w:t xml:space="preserve">Score = Nombre d'activités effectuées ÷ Taux de travail</w:t>
+      </w:r>
+    </w:p>
+    <w:p>
+      <w:pPr>
+        <w:pStyle w:val="ListParagraph"/>
+        <w:numPr>
+          <w:ilvl w:val="0"/>
+          <w:numId w:val="2"/>
+        </w:numPr>
+        <w:spacing w:after="40" w:before="40"/>
+      </w:pPr>
+      <w:r>
+        <w:rPr>
+          <w:rFonts w:ascii="Arial" w:cs="Arial" w:eastAsia="Arial" w:hAnsi="Arial"/>
+          <w:color w:val="212529"/>
+          <w:sz w:val="22"/>
+          <w:szCs w:val="22"/>
+        </w:rPr>
+        <w:t xml:space="preserve">Étape 3 — Désigner le médecin ayant le score le plus bas (il a le moins fait proportionnellement à son temps de travail).</w:t>
+      </w:r>
+    </w:p>
+    <w:p>
+      <w:pPr>
+        <w:pStyle w:val="ListParagraph"/>
+        <w:numPr>
+          <w:ilvl w:val="0"/>
+          <w:numId w:val="2"/>
+        </w:numPr>
+        <w:spacing w:after="40" w:before="40"/>
+      </w:pPr>
+      <w:r>
+        <w:rPr>
+          <w:rFonts w:ascii="Arial" w:cs="Arial" w:eastAsia="Arial" w:hAnsi="Arial"/>
+          <w:color w:val="212529"/>
+          <w:sz w:val="22"/>
+          <w:szCs w:val="22"/>
+        </w:rPr>
+        <w:t xml:space="preserve">Étape 4 — En cas d'égalité, tirage aléatoire entre les ex-æquo.</w:t>
+      </w:r>
+    </w:p>
+    <w:p>
+      <w:pPr>
+        <w:spacing w:after="100" w:before="60"/>
+      </w:pPr>
+      <w:r>
+        <w:rPr>
+          <w:rFonts w:ascii="Arial" w:cs="Arial" w:eastAsia="Arial" w:hAnsi="Arial"/>
+          <w:b/>
+          <w:bCs/>
+          <w:i w:val="false"/>
+          <w:iCs w:val="false"/>
+          <w:color w:val="212529"/>
+          <w:sz w:val="22"/>
+          <w:szCs w:val="22"/>
+        </w:rPr>
+        <w:t xml:space="preserve">Exemple concret :</w:t>
+      </w:r>
+    </w:p>
+    <w:p>
+      <w:pPr>
+        <w:spacing w:after="120" w:before="0"/>
+      </w:pPr>
+    </w:p>
+    <w:tbl>
+      <w:tblPr>
+        <w:tblW w:type="dxa" w:w="9000"/>
+        <w:tblBorders>
+          <w:top w:val="single" w:color="auto" w:sz="4"/>
+          <w:left w:val="single" w:color="auto" w:sz="4"/>
+          <w:bottom w:val="single" w:color="auto" w:sz="4"/>
+          <w:right w:val="single" w:color="auto" w:sz="4"/>
+          <w:insideH w:val="single" w:color="auto" w:sz="4"/>
+          <w:insideV w:val="single" w:color="auto" w:sz="4"/>
+        </w:tblBorders>
+      </w:tblPr>
+      <w:tblGrid>
+        <w:gridCol w:w="2200"/>
+        <w:gridCol w:w="2200"/>
+        <w:gridCol w:w="2600"/>
+        <w:gridCol w:w="2000"/>
+      </w:tblGrid>
+      <w:tr>
+        <w:trPr>
+          <w:tblHeader/>
+        </w:trPr>
+        <w:tc>
+          <w:tcPr>
+            <w:tcW w:type="dxa" w:w="2200"/>
+            <w:tcBorders>
+              <w:top w:val="single" w:color="3B5BDB" w:sz="1"/>
+              <w:left w:val="single" w:color="3B5BDB" w:sz="1"/>
+              <w:bottom w:val="single" w:color="3B5BDB" w:sz="1"/>
+              <w:right w:val="single" w:color="3B5BDB" w:sz="1"/>
+            </w:tcBorders>
+            <w:shd w:fill="1E3A5F" w:val="clear"/>
+            <w:tcMar>
+              <w:top w:type="dxa" w:w="80"/>
+              <w:left w:type="dxa" w:w="140"/>
+              <w:bottom w:type="dxa" w:w="80"/>
+              <w:right w:type="dxa" w:w="140"/>
+            </w:tcMar>
+          </w:tcPr>
+          <w:p>
+            <w:pPr>
+              <w:spacing w:after="0" w:before="0"/>
+            </w:pPr>
+            <w:r>
+              <w:rPr>
+                <w:rFonts w:ascii="Arial" w:cs="Arial" w:eastAsia="Arial" w:hAnsi="Arial"/>
+                <w:b/>
+                <w:bCs/>
+                <w:color w:val="FFFFFF"/>
+                <w:sz w:val="20"/>
+                <w:szCs w:val="20"/>
+              </w:rPr>
+              <w:t xml:space="preserve">Médecin</w:t>
+            </w:r>
+          </w:p>
+        </w:tc>
+        <w:tc>
+          <w:tcPr>
+            <w:tcW w:type="dxa" w:w="2200"/>
+            <w:tcBorders>
+              <w:top w:val="single" w:color="3B5BDB" w:sz="1"/>
+              <w:left w:val="single" w:color="3B5BDB" w:sz="1"/>
+              <w:bottom w:val="single" w:color="3B5BDB" w:sz="1"/>
+              <w:right w:val="single" w:color="3B5BDB" w:sz="1"/>
+            </w:tcBorders>
+            <w:shd w:fill="1E3A5F" w:val="clear"/>
+            <w:tcMar>
+              <w:top w:type="dxa" w:w="80"/>
+              <w:left w:type="dxa" w:w="140"/>
+              <w:bottom w:type="dxa" w:w="80"/>
+              <w:right w:type="dxa" w:w="140"/>
+            </w:tcMar>
+          </w:tcPr>
+          <w:p>
+            <w:pPr>
+              <w:spacing w:after="0" w:before="0"/>
+            </w:pPr>
+            <w:r>
+              <w:rPr>
+                <w:rFonts w:ascii="Arial" w:cs="Arial" w:eastAsia="Arial" w:hAnsi="Arial"/>
+                <w:b/>
+                <w:bCs/>
+                <w:color w:val="FFFFFF"/>
+                <w:sz w:val="20"/>
+                <w:szCs w:val="20"/>
+              </w:rPr>
+              <w:t xml:space="preserve">Taux de travail</w:t>
+            </w:r>
+          </w:p>
+        </w:tc>
+        <w:tc>
+          <w:tcPr>
+            <w:tcW w:type="dxa" w:w="2600"/>
+            <w:tcBorders>
+              <w:top w:val="single" w:color="3B5BDB" w:sz="1"/>
+              <w:left w:val="single" w:color="3B5BDB" w:sz="1"/>
+              <w:bottom w:val="single" w:color="3B5BDB" w:sz="1"/>
+              <w:right w:val="single" w:color="3B5BDB" w:sz="1"/>
+            </w:tcBorders>
+            <w:shd w:fill="1E3A5F" w:val="clear"/>
+            <w:tcMar>
+              <w:top w:type="dxa" w:w="80"/>
+              <w:left w:type="dxa" w:w="140"/>
+              <w:bottom w:type="dxa" w:w="80"/>
+              <w:right w:type="dxa" w:w="140"/>
+            </w:tcMar>
+          </w:tcPr>
+          <w:p>
+            <w:pPr>
+              <w:spacing w:after="0" w:before="0"/>
+            </w:pPr>
+            <w:r>
+              <w:rPr>
+                <w:rFonts w:ascii="Arial" w:cs="Arial" w:eastAsia="Arial" w:hAnsi="Arial"/>
+                <w:b/>
+                <w:bCs/>
+                <w:color w:val="FFFFFF"/>
+                <w:sz w:val="20"/>
+                <w:szCs w:val="20"/>
+              </w:rPr>
+              <w:t xml:space="preserve">Activités effectuées</w:t>
+            </w:r>
+          </w:p>
+        </w:tc>
+        <w:tc>
+          <w:tcPr>
+            <w:tcW w:type="dxa" w:w="2000"/>
+            <w:tcBorders>
+              <w:top w:val="single" w:color="3B5BDB" w:sz="1"/>
+              <w:left w:val="single" w:color="3B5BDB" w:sz="1"/>
+              <w:bottom w:val="single" w:color="3B5BDB" w:sz="1"/>
+              <w:right w:val="single" w:color="3B5BDB" w:sz="1"/>
+            </w:tcBorders>
+            <w:shd w:fill="1E3A5F" w:val="clear"/>
+            <w:tcMar>
+              <w:top w:type="dxa" w:w="80"/>
+              <w:left w:type="dxa" w:w="140"/>
+              <w:bottom w:type="dxa" w:w="80"/>
+              <w:right w:type="dxa" w:w="140"/>
+            </w:tcMar>
+          </w:tcPr>
+          <w:p>
+            <w:pPr>
+              <w:spacing w:after="0" w:before="0"/>
+            </w:pPr>
+            <w:r>
+              <w:rPr>
+                <w:rFonts w:ascii="Arial" w:cs="Arial" w:eastAsia="Arial" w:hAnsi="Arial"/>
+                <w:b/>
+                <w:bCs/>
+                <w:color w:val="FFFFFF"/>
+                <w:sz w:val="20"/>
+                <w:szCs w:val="20"/>
+              </w:rPr>
+              <w:t xml:space="preserve">Score</w:t>
+            </w:r>
+          </w:p>
+        </w:tc>
+      </w:tr>
+      <w:tr>
+        <w:tc>
+          <w:tcPr>
+            <w:tcW w:type="dxa" w:w="2200"/>
+            <w:tcBorders>
+              <w:top w:val="single" w:color="C5D3E8" w:sz="1"/>
+              <w:left w:val="single" w:color="C5D3E8" w:sz="1"/>
+              <w:bottom w:val="single" w:color="C5D3E8" w:sz="1"/>
+              <w:right w:val="single" w:color="C5D3E8" w:sz="1"/>
+            </w:tcBorders>
+            <w:shd w:fill="FFFFFF" w:val="clear"/>
+            <w:tcMar>
+              <w:top w:type="dxa" w:w="80"/>
+              <w:left w:type="dxa" w:w="140"/>
+              <w:bottom w:type="dxa" w:w="80"/>
+              <w:right w:type="dxa" w:w="140"/>
+            </w:tcMar>
+          </w:tcPr>
+          <w:p>
+            <w:pPr>
+              <w:spacing w:after="0" w:before="0"/>
+            </w:pPr>
+            <w:r>
+              <w:rPr>
+                <w:rFonts w:ascii="Arial" w:cs="Arial" w:eastAsia="Arial" w:hAnsi="Arial"/>
+                <w:color w:val="212529"/>
+                <w:sz w:val="20"/>
+                <w:szCs w:val="20"/>
+              </w:rPr>
+              <w:t xml:space="preserve">Dr. Martin</w:t>
+            </w:r>
+          </w:p>
+        </w:tc>
+        <w:tc>
+          <w:tcPr>
+            <w:tcW w:type="dxa" w:w="2200"/>
+            <w:tcBorders>
+              <w:top w:val="single" w:color="C5D3E8" w:sz="1"/>
+              <w:left w:val="single" w:color="C5D3E8" w:sz="1"/>
+              <w:bottom w:val="single" w:color="C5D3E8" w:sz="1"/>
+              <w:right w:val="single" w:color="C5D3E8" w:sz="1"/>
+            </w:tcBorders>
+            <w:shd w:fill="FFFFFF" w:val="clear"/>
+            <w:tcMar>
+              <w:top w:type="dxa" w:w="80"/>
+              <w:left w:type="dxa" w:w="140"/>
+              <w:bottom w:type="dxa" w:w="80"/>
+              <w:right w:type="dxa" w:w="140"/>
+            </w:tcMar>
+          </w:tcPr>
+          <w:p>
+            <w:pPr>
+              <w:spacing w:after="0" w:before="0"/>
+            </w:pPr>
+            <w:r>
+              <w:rPr>
+                <w:rFonts w:ascii="Arial" w:cs="Arial" w:eastAsia="Arial" w:hAnsi="Arial"/>
+                <w:color w:val="212529"/>
+                <w:sz w:val="20"/>
+                <w:szCs w:val="20"/>
+              </w:rPr>
+              <w:t xml:space="preserve">100% (1.0)</w:t>
+            </w:r>
+          </w:p>
+        </w:tc>
+        <w:tc>
+          <w:tcPr>
+            <w:tcW w:type="dxa" w:w="2600"/>
+            <w:tcBorders>
+              <w:top w:val="single" w:color="C5D3E8" w:sz="1"/>
+              <w:left w:val="single" w:color="C5D3E8" w:sz="1"/>
+              <w:bottom w:val="single" w:color="C5D3E8" w:sz="1"/>
+              <w:right w:val="single" w:color="C5D3E8" w:sz="1"/>
+            </w:tcBorders>
+            <w:shd w:fill="FFFFFF" w:val="clear"/>
+            <w:tcMar>
+              <w:top w:type="dxa" w:w="80"/>
+              <w:left w:type="dxa" w:w="140"/>
+              <w:bottom w:type="dxa" w:w="80"/>
+              <w:right w:type="dxa" w:w="140"/>
+            </w:tcMar>
+          </w:tcPr>
+          <w:p>
+            <w:pPr>
+              <w:spacing w:after="0" w:before="0"/>
+            </w:pPr>
+            <w:r>
+              <w:rPr>
+                <w:rFonts w:ascii="Arial" w:cs="Arial" w:eastAsia="Arial" w:hAnsi="Arial"/>
+                <w:color w:val="212529"/>
+                <w:sz w:val="20"/>
+                <w:szCs w:val="20"/>
+              </w:rPr>
+              <w:t xml:space="preserve">6</w:t>
+            </w:r>
+          </w:p>
+        </w:tc>
+        <w:tc>
+          <w:tcPr>
+            <w:tcW w:type="dxa" w:w="2000"/>
+            <w:tcBorders>
+              <w:top w:val="single" w:color="C5D3E8" w:sz="1"/>
+              <w:left w:val="single" w:color="C5D3E8" w:sz="1"/>
+              <w:bottom w:val="single" w:color="C5D3E8" w:sz="1"/>
+              <w:right w:val="single" w:color="C5D3E8" w:sz="1"/>
+            </w:tcBorders>
+            <w:shd w:fill="FFFFFF" w:val="clear"/>
+            <w:tcMar>
+              <w:top w:type="dxa" w:w="80"/>
+              <w:left w:type="dxa" w:w="140"/>
+              <w:bottom w:type="dxa" w:w="80"/>
+              <w:right w:type="dxa" w:w="140"/>
+            </w:tcMar>
+          </w:tcPr>
+          <w:p>
+            <w:pPr>
+              <w:spacing w:after="0" w:before="0"/>
+            </w:pPr>
+            <w:r>
+              <w:rPr>
+                <w:rFonts w:ascii="Arial" w:cs="Arial" w:eastAsia="Arial" w:hAnsi="Arial"/>
+                <w:color w:val="212529"/>
+                <w:sz w:val="20"/>
+                <w:szCs w:val="20"/>
+              </w:rPr>
+              <w:t xml:space="preserve">6.0</w:t>
+            </w:r>
+          </w:p>
+        </w:tc>
+      </w:tr>
+      <w:tr>
+        <w:tc>
+          <w:tcPr>
+            <w:tcW w:type="dxa" w:w="2200"/>
+            <w:tcBorders>
+              <w:top w:val="single" w:color="C5D3E8" w:sz="1"/>
+              <w:left w:val="single" w:color="C5D3E8" w:sz="1"/>
+              <w:bottom w:val="single" w:color="C5D3E8" w:sz="1"/>
+              <w:right w:val="single" w:color="C5D3E8" w:sz="1"/>
+            </w:tcBorders>
+            <w:shd w:fill="F1F3F9" w:val="clear"/>
+            <w:tcMar>
+              <w:top w:type="dxa" w:w="80"/>
+              <w:left w:type="dxa" w:w="140"/>
+              <w:bottom w:type="dxa" w:w="80"/>
+              <w:right w:type="dxa" w:w="140"/>
+            </w:tcMar>
+          </w:tcPr>
+          <w:p>
+            <w:pPr>
+              <w:spacing w:after="0" w:before="0"/>
+            </w:pPr>
+            <w:r>
+              <w:rPr>
+                <w:rFonts w:ascii="Arial" w:cs="Arial" w:eastAsia="Arial" w:hAnsi="Arial"/>
+                <w:color w:val="212529"/>
+                <w:sz w:val="20"/>
+                <w:szCs w:val="20"/>
+              </w:rPr>
+              <w:t xml:space="preserve">Dr. Dupont</w:t>
+            </w:r>
+          </w:p>
+        </w:tc>
+        <w:tc>
+          <w:tcPr>
+            <w:tcW w:type="dxa" w:w="2200"/>
+            <w:tcBorders>
+              <w:top w:val="single" w:color="C5D3E8" w:sz="1"/>
+              <w:left w:val="single" w:color="C5D3E8" w:sz="1"/>
+              <w:bottom w:val="single" w:color="C5D3E8" w:sz="1"/>
+              <w:right w:val="single" w:color="C5D3E8" w:sz="1"/>
+            </w:tcBorders>
+            <w:shd w:fill="F1F3F9" w:val="clear"/>
+            <w:tcMar>
+              <w:top w:type="dxa" w:w="80"/>
+              <w:left w:type="dxa" w:w="140"/>
+              <w:bottom w:type="dxa" w:w="80"/>
+              <w:right w:type="dxa" w:w="140"/>
+            </w:tcMar>
+          </w:tcPr>
+          <w:p>
+            <w:pPr>
+              <w:spacing w:after="0" w:before="0"/>
+            </w:pPr>
+            <w:r>
+              <w:rPr>
+                <w:rFonts w:ascii="Arial" w:cs="Arial" w:eastAsia="Arial" w:hAnsi="Arial"/>
+                <w:color w:val="212529"/>
+                <w:sz w:val="20"/>
+                <w:szCs w:val="20"/>
+              </w:rPr>
+              <w:t xml:space="preserve">50% (0.5)</w:t>
+            </w:r>
+          </w:p>
+        </w:tc>
+        <w:tc>
+          <w:tcPr>
+            <w:tcW w:type="dxa" w:w="2600"/>
+            <w:tcBorders>
+              <w:top w:val="single" w:color="C5D3E8" w:sz="1"/>
+              <w:left w:val="single" w:color="C5D3E8" w:sz="1"/>
+              <w:bottom w:val="single" w:color="C5D3E8" w:sz="1"/>
+              <w:right w:val="single" w:color="C5D3E8" w:sz="1"/>
+            </w:tcBorders>
+            <w:shd w:fill="F1F3F9" w:val="clear"/>
+            <w:tcMar>
+              <w:top w:type="dxa" w:w="80"/>
+              <w:left w:type="dxa" w:w="140"/>
+              <w:bottom w:type="dxa" w:w="80"/>
+              <w:right w:type="dxa" w:w="140"/>
+            </w:tcMar>
+          </w:tcPr>
+          <w:p>
+            <w:pPr>
+              <w:spacing w:after="0" w:before="0"/>
+            </w:pPr>
+            <w:r>
+              <w:rPr>
+                <w:rFonts w:ascii="Arial" w:cs="Arial" w:eastAsia="Arial" w:hAnsi="Arial"/>
+                <w:color w:val="212529"/>
+                <w:sz w:val="20"/>
+                <w:szCs w:val="20"/>
+              </w:rPr>
+              <w:t xml:space="preserve">2</w:t>
+            </w:r>
+          </w:p>
+        </w:tc>
+        <w:tc>
+          <w:tcPr>
+            <w:tcW w:type="dxa" w:w="2000"/>
+            <w:tcBorders>
+              <w:top w:val="single" w:color="C5D3E8" w:sz="1"/>
+              <w:left w:val="single" w:color="C5D3E8" w:sz="1"/>
+              <w:bottom w:val="single" w:color="C5D3E8" w:sz="1"/>
+              <w:right w:val="single" w:color="C5D3E8" w:sz="1"/>
+            </w:tcBorders>
+            <w:shd w:fill="F1F3F9" w:val="clear"/>
+            <w:tcMar>
+              <w:top w:type="dxa" w:w="80"/>
+              <w:left w:type="dxa" w:w="140"/>
+              <w:bottom w:type="dxa" w:w="80"/>
+              <w:right w:type="dxa" w:w="140"/>
+            </w:tcMar>
+          </w:tcPr>
+          <w:p>
+            <w:pPr>
+              <w:spacing w:after="0" w:before="0"/>
+            </w:pPr>
+            <w:r>
+              <w:rPr>
+                <w:rFonts w:ascii="Arial" w:cs="Arial" w:eastAsia="Arial" w:hAnsi="Arial"/>
+                <w:color w:val="212529"/>
+                <w:sz w:val="20"/>
+                <w:szCs w:val="20"/>
+              </w:rPr>
+              <w:t xml:space="preserve">4.0 ← désigné</w:t>
+            </w:r>
+          </w:p>
+        </w:tc>
+      </w:tr>
+      <w:tr>
+        <w:tc>
+          <w:tcPr>
+            <w:tcW w:type="dxa" w:w="2200"/>
+            <w:tcBorders>
+              <w:top w:val="single" w:color="C5D3E8" w:sz="1"/>
+              <w:left w:val="single" w:color="C5D3E8" w:sz="1"/>
+              <w:bottom w:val="single" w:color="C5D3E8" w:sz="1"/>
+              <w:right w:val="single" w:color="C5D3E8" w:sz="1"/>
+            </w:tcBorders>
+            <w:shd w:fill="FFFFFF" w:val="clear"/>
+            <w:tcMar>
+              <w:top w:type="dxa" w:w="80"/>
+              <w:left w:type="dxa" w:w="140"/>
+              <w:bottom w:type="dxa" w:w="80"/>
+              <w:right w:type="dxa" w:w="140"/>
+            </w:tcMar>
+          </w:tcPr>
+          <w:p>
+            <w:pPr>
+              <w:spacing w:after="0" w:before="0"/>
+            </w:pPr>
+            <w:r>
+              <w:rPr>
+                <w:rFonts w:ascii="Arial" w:cs="Arial" w:eastAsia="Arial" w:hAnsi="Arial"/>
+                <w:color w:val="212529"/>
+                <w:sz w:val="20"/>
+                <w:szCs w:val="20"/>
+              </w:rPr>
+              <w:t xml:space="preserve">Dr. Leroy</w:t>
+            </w:r>
+          </w:p>
+        </w:tc>
+        <w:tc>
+          <w:tcPr>
+            <w:tcW w:type="dxa" w:w="2200"/>
+            <w:tcBorders>
+              <w:top w:val="single" w:color="C5D3E8" w:sz="1"/>
+              <w:left w:val="single" w:color="C5D3E8" w:sz="1"/>
+              <w:bottom w:val="single" w:color="C5D3E8" w:sz="1"/>
+              <w:right w:val="single" w:color="C5D3E8" w:sz="1"/>
+            </w:tcBorders>
+            <w:shd w:fill="FFFFFF" w:val="clear"/>
+            <w:tcMar>
+              <w:top w:type="dxa" w:w="80"/>
+              <w:left w:type="dxa" w:w="140"/>
+              <w:bottom w:type="dxa" w:w="80"/>
+              <w:right w:type="dxa" w:w="140"/>
+            </w:tcMar>
+          </w:tcPr>
+          <w:p>
+            <w:pPr>
+              <w:spacing w:after="0" w:before="0"/>
+            </w:pPr>
+            <w:r>
+              <w:rPr>
+                <w:rFonts w:ascii="Arial" w:cs="Arial" w:eastAsia="Arial" w:hAnsi="Arial"/>
+                <w:color w:val="212529"/>
+                <w:sz w:val="20"/>
+                <w:szCs w:val="20"/>
+              </w:rPr>
+              <w:t xml:space="preserve">100% (1.0)</w:t>
+            </w:r>
+          </w:p>
+        </w:tc>
+        <w:tc>
+          <w:tcPr>
+            <w:tcW w:type="dxa" w:w="2600"/>
+            <w:tcBorders>
+              <w:top w:val="single" w:color="C5D3E8" w:sz="1"/>
+              <w:left w:val="single" w:color="C5D3E8" w:sz="1"/>
+              <w:bottom w:val="single" w:color="C5D3E8" w:sz="1"/>
+              <w:right w:val="single" w:color="C5D3E8" w:sz="1"/>
+            </w:tcBorders>
+            <w:shd w:fill="FFFFFF" w:val="clear"/>
+            <w:tcMar>
+              <w:top w:type="dxa" w:w="80"/>
+              <w:left w:type="dxa" w:w="140"/>
+              <w:bottom w:type="dxa" w:w="80"/>
+              <w:right w:type="dxa" w:w="140"/>
+            </w:tcMar>
+          </w:tcPr>
+          <w:p>
+            <w:pPr>
+              <w:spacing w:after="0" w:before="0"/>
+            </w:pPr>
+            <w:r>
+              <w:rPr>
+                <w:rFonts w:ascii="Arial" w:cs="Arial" w:eastAsia="Arial" w:hAnsi="Arial"/>
+                <w:color w:val="212529"/>
+                <w:sz w:val="20"/>
+                <w:szCs w:val="20"/>
+              </w:rPr>
+              <w:t xml:space="preserve">5</w:t>
+            </w:r>
+          </w:p>
+        </w:tc>
+        <w:tc>
+          <w:tcPr>
+            <w:tcW w:type="dxa" w:w="2000"/>
+            <w:tcBorders>
+              <w:top w:val="single" w:color="C5D3E8" w:sz="1"/>
+              <w:left w:val="single" w:color="C5D3E8" w:sz="1"/>
+              <w:bottom w:val="single" w:color="C5D3E8" w:sz="1"/>
+              <w:right w:val="single" w:color="C5D3E8" w:sz="1"/>
+            </w:tcBorders>
+            <w:shd w:fill="FFFFFF" w:val="clear"/>
+            <w:tcMar>
+              <w:top w:type="dxa" w:w="80"/>
+              <w:left w:type="dxa" w:w="140"/>
+              <w:bottom w:type="dxa" w:w="80"/>
+              <w:right w:type="dxa" w:w="140"/>
+            </w:tcMar>
+          </w:tcPr>
+          <w:p>
+            <w:pPr>
+              <w:spacing w:after="0" w:before="0"/>
+            </w:pPr>
+            <w:r>
+              <w:rPr>
+                <w:rFonts w:ascii="Arial" w:cs="Arial" w:eastAsia="Arial" w:hAnsi="Arial"/>
+                <w:color w:val="212529"/>
+                <w:sz w:val="20"/>
+                <w:szCs w:val="20"/>
+              </w:rPr>
+              <w:t xml:space="preserve">5.0</w:t>
+            </w:r>
+          </w:p>
+        </w:tc>
+      </w:tr>
+    </w:tbl>
+    <w:p>
+      <w:pPr>
+        <w:spacing w:after="160" w:before="0"/>
+      </w:pPr>
+    </w:p>
+    <w:p>
+      <w:pPr>
+        <w:pBdr>
+          <w:left w:val="single" w:color="3B5BDB" w:sz="8" w:space="8"/>
+        </w:pBdr>
+        <w:spacing w:after="80" w:before="80"/>
+        <w:ind w:left="360"/>
+      </w:pPr>
+      <w:r>
+        <w:rPr>
+          <w:rFonts w:ascii="Arial" w:cs="Arial" w:eastAsia="Arial" w:hAnsi="Arial"/>
+          <w:sz w:val="22"/>
+          <w:szCs w:val="22"/>
+        </w:rPr>
+        <w:t xml:space="preserve">💡 </w:t>
+      </w:r>
+      <w:r>
+        <w:rPr>
+          <w:rFonts w:ascii="Arial" w:cs="Arial" w:eastAsia="Arial" w:hAnsi="Arial"/>
+          <w:i/>
+          <w:iCs/>
+          <w:color w:val="1971C2"/>
+          <w:sz w:val="22"/>
+          <w:szCs w:val="22"/>
+        </w:rPr>
+        <w:t xml:space="preserve">Un médecin à mi-temps voit son score divisé par 2, ce qui le protège d'une sur-attribution.</w:t>
+      </w:r>
+    </w:p>
+    <w:p>
+      <w:pPr>
+        <w:pStyle w:val="Heading2"/>
+        <w:spacing w:after="120" w:before="280"/>
+      </w:pPr>
+      <w:r>
+        <w:rPr>
+          <w:rFonts w:ascii="Arial" w:cs="Arial" w:eastAsia="Arial" w:hAnsi="Arial"/>
+          <w:b/>
+          <w:bCs/>
+          <w:color w:val="1971C2"/>
+          <w:sz w:val="26"/>
+          <w:szCs w:val="26"/>
+        </w:rPr>
+        <w:t xml:space="preserve">5.3 Groupes d'équité</w:t>
+      </w:r>
+    </w:p>
+    <w:p>
+      <w:pPr>
+        <w:spacing w:after="100" w:before="60"/>
+      </w:pPr>
+      <w:r>
+        <w:rPr>
+          <w:rFonts w:ascii="Arial" w:cs="Arial" w:eastAsia="Arial" w:hAnsi="Arial"/>
+          <w:b w:val="false"/>
+          <w:bCs w:val="false"/>
+          <w:i w:val="false"/>
+          <w:iCs w:val="false"/>
+          <w:color w:val="212529"/>
+          <w:sz w:val="22"/>
+          <w:szCs w:val="22"/>
+        </w:rPr>
+        <w:t xml:space="preserve">Les activités sont regroupées pour que les compteurs soient partagés :</w:t>
+      </w:r>
+    </w:p>
+    <w:p>
+      <w:pPr>
+        <w:pStyle w:val="ListParagraph"/>
+        <w:numPr>
+          <w:ilvl w:val="0"/>
+          <w:numId w:val="3"/>
+        </w:numPr>
+        <w:spacing w:after="40" w:before="40"/>
+      </w:pPr>
+      <w:r>
+        <w:rPr>
+          <w:rFonts w:ascii="Arial" w:cs="Arial" w:eastAsia="Arial" w:hAnsi="Arial"/>
+          <w:color w:val="212529"/>
+          <w:sz w:val="22"/>
+          <w:szCs w:val="22"/>
+        </w:rPr>
+        <w:t xml:space="preserve">Groupe 1 — Unity + Astreinte : faire une astreinte "compte" autant que faire une Unity. Les deux activités partagent le même compteur.</w:t>
+      </w:r>
+    </w:p>
+    <w:p>
+      <w:pPr>
+        <w:pStyle w:val="ListParagraph"/>
+        <w:numPr>
+          <w:ilvl w:val="0"/>
+          <w:numId w:val="3"/>
+        </w:numPr>
+        <w:spacing w:after="40" w:before="40"/>
+      </w:pPr>
+      <w:r>
+        <w:rPr>
+          <w:rFonts w:ascii="Arial" w:cs="Arial" w:eastAsia="Arial" w:hAnsi="Arial"/>
+          <w:color w:val="212529"/>
+          <w:sz w:val="22"/>
+          <w:szCs w:val="22"/>
+        </w:rPr>
+        <w:t xml:space="preserve">Groupe 2 — Supervision Workflow : compteur indépendant.</w:t>
+      </w:r>
+    </w:p>
+    <w:p>
+      <w:pPr>
+        <w:spacing w:after="100" w:before="60"/>
+      </w:pPr>
+      <w:r>
+        <w:rPr>
+          <w:rFonts w:ascii="Arial" w:cs="Arial" w:eastAsia="Arial" w:hAnsi="Arial"/>
+          <w:b w:val="false"/>
+          <w:bCs w:val="false"/>
+          <w:i w:val="false"/>
+          <w:iCs w:val="false"/>
+          <w:color w:val="212529"/>
+          <w:sz w:val="22"/>
+          <w:szCs w:val="22"/>
+        </w:rPr>
+        <w:t xml:space="preserve">Pourquoi des groupes ? Pour éviter qu'un médecin qui fait beaucoup d'astreintes soit épargné sur les Unity, ou inversement.</w:t>
+      </w:r>
+    </w:p>
+    <w:p>
+      <w:pPr>
+        <w:pStyle w:val="Heading2"/>
+        <w:spacing w:after="120" w:before="280"/>
+      </w:pPr>
+      <w:r>
+        <w:rPr>
+          <w:rFonts w:ascii="Arial" w:cs="Arial" w:eastAsia="Arial" w:hAnsi="Arial"/>
+          <w:b/>
+          <w:bCs/>
+          <w:color w:val="1971C2"/>
+          <w:sz w:val="26"/>
+          <w:szCs w:val="26"/>
+        </w:rPr>
+        <w:t xml:space="preserve">5.4 Semaine verrouillée</w:t>
+      </w:r>
+    </w:p>
+    <w:p>
+      <w:pPr>
+        <w:spacing w:after="100" w:before="60"/>
+      </w:pPr>
+      <w:r>
+        <w:rPr>
+          <w:rFonts w:ascii="Arial" w:cs="Arial" w:eastAsia="Arial" w:hAnsi="Arial"/>
+          <w:b w:val="false"/>
+          <w:bCs w:val="false"/>
+          <w:i w:val="false"/>
+          <w:iCs w:val="false"/>
+          <w:color w:val="212529"/>
+          <w:sz w:val="22"/>
+          <w:szCs w:val="22"/>
+        </w:rPr>
+        <w:t xml:space="preserve">Une fois qu'un administrateur valide une semaine (cadenas 🔒), le planning des activités est figé. Plus aucun recalcul automatique ne peut modifier les attributions.</w:t>
+      </w:r>
+    </w:p>
+    <w:p>
+      <w:pPr>
+        <w:pStyle w:val="Heading2"/>
+        <w:spacing w:after="120" w:before="280"/>
+      </w:pPr>
+      <w:r>
+        <w:rPr>
+          <w:rFonts w:ascii="Arial" w:cs="Arial" w:eastAsia="Arial" w:hAnsi="Arial"/>
+          <w:b/>
+          <w:bCs/>
+          <w:color w:val="1971C2"/>
+          <w:sz w:val="26"/>
+          <w:szCs w:val="26"/>
+        </w:rPr>
+        <w:t xml:space="preserve">5.5 Signaler une attribution incorrecte</w:t>
+      </w:r>
+    </w:p>
+    <w:p>
+      <w:pPr>
+        <w:pBdr>
+          <w:left w:val="single" w:color="FFC107" w:sz="8" w:space="8"/>
+        </w:pBdr>
+        <w:spacing w:after="80" w:before="80"/>
+        <w:ind w:left="360"/>
+      </w:pPr>
+      <w:r>
+        <w:rPr>
+          <w:rFonts w:ascii="Arial" w:cs="Arial" w:eastAsia="Arial" w:hAnsi="Arial"/>
+          <w:sz w:val="22"/>
+          <w:szCs w:val="22"/>
+        </w:rPr>
+        <w:t xml:space="preserve">⚠️ </w:t>
+      </w:r>
+      <w:r>
+        <w:rPr>
+          <w:rFonts w:ascii="Arial" w:cs="Arial" w:eastAsia="Arial" w:hAnsi="Arial"/>
+          <w:i/>
+          <w:iCs/>
+          <w:color w:val="856404"/>
+          <w:sz w:val="22"/>
+          <w:szCs w:val="22"/>
+        </w:rPr>
+        <w:t xml:space="preserve">Si tu penses qu'une attribution est incorrecte (ex. : absence non enregistrée, erreur de taux de travail), contacte ton administrateur avant que la semaine soit verrouillée. Après verrouillage, aucune correction n'est possible.</w:t>
+      </w:r>
+    </w:p>
+    <w:p>
+      <w:pPr>
+        <w:pStyle w:val="Heading1"/>
+        <w:pageBreakBefore/>
+        <w:spacing w:after="240" w:before="0"/>
+      </w:pPr>
+      <w:r>
+        <w:rPr>
+          <w:rFonts w:ascii="Arial" w:cs="Arial" w:eastAsia="Arial" w:hAnsi="Arial"/>
+          <w:b/>
+          <w:bCs/>
+          <w:color w:val="3B5BDB"/>
+          <w:sz w:val="32"/>
+          <w:szCs w:val="32"/>
+        </w:rPr>
+        <w:t xml:space="preserve">6. Mon Profil &amp; Absences</w:t>
+      </w:r>
+    </w:p>
+    <w:p>
+      <w:pPr>
+        <w:spacing w:after="100" w:before="60"/>
+      </w:pPr>
+      <w:r>
+        <w:rPr>
+          <w:rFonts w:ascii="Arial" w:cs="Arial" w:eastAsia="Arial" w:hAnsi="Arial"/>
+          <w:b w:val="false"/>
+          <w:bCs w:val="false"/>
+          <w:i w:val="false"/>
+          <w:iCs w:val="false"/>
+          <w:color w:val="212529"/>
+          <w:sz w:val="22"/>
+          <w:szCs w:val="22"/>
+        </w:rPr>
+        <w:t xml:space="preserve">La page Mon Profil te permet de gérer tes disponibilités, tes informations personnelles et tes préférences de notification.</w:t>
+      </w:r>
+    </w:p>
+    <w:p>
+      <w:pPr>
+        <w:pStyle w:val="Heading2"/>
+        <w:spacing w:after="120" w:before="280"/>
+      </w:pPr>
+      <w:r>
+        <w:rPr>
+          <w:rFonts w:ascii="Arial" w:cs="Arial" w:eastAsia="Arial" w:hAnsi="Arial"/>
+          <w:b/>
+          <w:bCs/>
+          <w:color w:val="1971C2"/>
+          <w:sz w:val="26"/>
+          <w:szCs w:val="26"/>
+        </w:rPr>
+        <w:t xml:space="preserve">6.1 Déclarer une absence</w:t>
+      </w:r>
+    </w:p>
+    <w:p>
+      <w:pPr>
+        <w:pStyle w:val="ListParagraph"/>
+        <w:numPr>
+          <w:ilvl w:val="0"/>
+          <w:numId w:val="2"/>
+        </w:numPr>
+        <w:spacing w:after="40" w:before="40"/>
+      </w:pPr>
+      <w:r>
+        <w:rPr>
+          <w:rFonts w:ascii="Arial" w:cs="Arial" w:eastAsia="Arial" w:hAnsi="Arial"/>
+          <w:color w:val="212529"/>
+          <w:sz w:val="22"/>
+          <w:szCs w:val="22"/>
+        </w:rPr>
+        <w:t xml:space="preserve">Accède à "Mon Profil" depuis la sidebar ou la navigation mobile.</w:t>
+      </w:r>
+    </w:p>
+    <w:p>
+      <w:pPr>
+        <w:pStyle w:val="ListParagraph"/>
+        <w:numPr>
+          <w:ilvl w:val="0"/>
+          <w:numId w:val="2"/>
+        </w:numPr>
+        <w:spacing w:after="40" w:before="40"/>
+      </w:pPr>
+      <w:r>
+        <w:rPr>
+          <w:rFonts w:ascii="Arial" w:cs="Arial" w:eastAsia="Arial" w:hAnsi="Arial"/>
+          <w:color w:val="212529"/>
+          <w:sz w:val="22"/>
+          <w:szCs w:val="22"/>
+        </w:rPr>
+        <w:t xml:space="preserve">Clique sur "Ajouter une absence".</w:t>
+      </w:r>
+    </w:p>
+    <w:p>
+      <w:pPr>
+        <w:pStyle w:val="ListParagraph"/>
+        <w:numPr>
+          <w:ilvl w:val="0"/>
+          <w:numId w:val="2"/>
+        </w:numPr>
+        <w:spacing w:after="40" w:before="40"/>
+      </w:pPr>
+      <w:r>
+        <w:rPr>
+          <w:rFonts w:ascii="Arial" w:cs="Arial" w:eastAsia="Arial" w:hAnsi="Arial"/>
+          <w:color w:val="212529"/>
+          <w:sz w:val="22"/>
+          <w:szCs w:val="22"/>
+        </w:rPr>
+        <w:t xml:space="preserve">Renseigne la date de début, la date de fin et le type d'absence (congé, formation, autre).</w:t>
+      </w:r>
+    </w:p>
+    <w:p>
+      <w:pPr>
+        <w:pStyle w:val="ListParagraph"/>
+        <w:numPr>
+          <w:ilvl w:val="0"/>
+          <w:numId w:val="2"/>
+        </w:numPr>
+        <w:spacing w:after="40" w:before="40"/>
+      </w:pPr>
+      <w:r>
+        <w:rPr>
+          <w:rFonts w:ascii="Arial" w:cs="Arial" w:eastAsia="Arial" w:hAnsi="Arial"/>
+          <w:color w:val="212529"/>
+          <w:sz w:val="22"/>
+          <w:szCs w:val="22"/>
+        </w:rPr>
+        <w:t xml:space="preserve">Valide → l'absence est immédiatement prise en compte.</w:t>
+      </w:r>
+    </w:p>
+    <w:p>
+      <w:pPr>
+        <w:pBdr>
+          <w:left w:val="single" w:color="3B5BDB" w:sz="8" w:space="8"/>
+        </w:pBdr>
+        <w:spacing w:after="80" w:before="80"/>
+        <w:ind w:left="360"/>
+      </w:pPr>
+      <w:r>
+        <w:rPr>
+          <w:rFonts w:ascii="Arial" w:cs="Arial" w:eastAsia="Arial" w:hAnsi="Arial"/>
+          <w:sz w:val="22"/>
+          <w:szCs w:val="22"/>
+        </w:rPr>
+        <w:t xml:space="preserve">💡 </w:t>
+      </w:r>
+      <w:r>
+        <w:rPr>
+          <w:rFonts w:ascii="Arial" w:cs="Arial" w:eastAsia="Arial" w:hAnsi="Arial"/>
+          <w:i/>
+          <w:iCs/>
+          <w:color w:val="1971C2"/>
+          <w:sz w:val="22"/>
+          <w:szCs w:val="22"/>
+        </w:rPr>
+        <w:t xml:space="preserve">Déclare tes absences dès que possible. Le système les prend en compte lors du prochain calcul de planning.</w:t>
+      </w:r>
+    </w:p>
+    <w:p>
+      <w:pPr>
+        <w:spacing w:after="100" w:before="60"/>
+      </w:pPr>
+      <w:r>
+        <w:rPr>
+          <w:rFonts w:ascii="Arial" w:cs="Arial" w:eastAsia="Arial" w:hAnsi="Arial"/>
+          <w:b w:val="false"/>
+          <w:bCs w:val="false"/>
+          <w:i w:val="false"/>
+          <w:iCs w:val="false"/>
+          <w:color w:val="212529"/>
+          <w:sz w:val="22"/>
+          <w:szCs w:val="22"/>
+        </w:rPr>
+        <w:t xml:space="preserve">Pour supprimer une absence : clique sur l'icône poubelle 🗑️ à côté de l'entrée concernée.</w:t>
+      </w:r>
+    </w:p>
+    <w:p>
+      <w:pPr>
+        <w:pStyle w:val="Heading2"/>
+        <w:spacing w:after="120" w:before="280"/>
+      </w:pPr>
+      <w:r>
+        <w:rPr>
+          <w:rFonts w:ascii="Arial" w:cs="Arial" w:eastAsia="Arial" w:hAnsi="Arial"/>
+          <w:b/>
+          <w:bCs/>
+          <w:color w:val="1971C2"/>
+          <w:sz w:val="26"/>
+          <w:szCs w:val="26"/>
+        </w:rPr>
+        <w:t xml:space="preserve">6.2 Exclure des demi-journées récurrentes</w:t>
+      </w:r>
+    </w:p>
+    <w:p>
+      <w:pPr>
+        <w:spacing w:after="100" w:before="60"/>
+      </w:pPr>
+      <w:r>
+        <w:rPr>
+          <w:rFonts w:ascii="Arial" w:cs="Arial" w:eastAsia="Arial" w:hAnsi="Arial"/>
+          <w:b w:val="false"/>
+          <w:bCs w:val="false"/>
+          <w:i w:val="false"/>
+          <w:iCs w:val="false"/>
+          <w:color w:val="212529"/>
+          <w:sz w:val="22"/>
+          <w:szCs w:val="22"/>
+        </w:rPr>
+        <w:t xml:space="preserve">Si tu n'es jamais disponible certains créneaux fixes (ex. : mercredi matin tous les semaines), tu peux les exclure de façon permanente :</w:t>
+      </w:r>
+    </w:p>
+    <w:p>
+      <w:pPr>
+        <w:pStyle w:val="ListParagraph"/>
+        <w:numPr>
+          <w:ilvl w:val="0"/>
+          <w:numId w:val="2"/>
+        </w:numPr>
+        <w:spacing w:after="40" w:before="40"/>
+      </w:pPr>
+      <w:r>
+        <w:rPr>
+          <w:rFonts w:ascii="Arial" w:cs="Arial" w:eastAsia="Arial" w:hAnsi="Arial"/>
+          <w:color w:val="212529"/>
+          <w:sz w:val="22"/>
+          <w:szCs w:val="22"/>
+        </w:rPr>
+        <w:t xml:space="preserve">Dans "Mon Profil", section "Demi-journées exclues".</w:t>
+      </w:r>
+    </w:p>
+    <w:p>
+      <w:pPr>
+        <w:pStyle w:val="ListParagraph"/>
+        <w:numPr>
+          <w:ilvl w:val="0"/>
+          <w:numId w:val="2"/>
+        </w:numPr>
+        <w:spacing w:after="40" w:before="40"/>
+      </w:pPr>
+      <w:r>
+        <w:rPr>
+          <w:rFonts w:ascii="Arial" w:cs="Arial" w:eastAsia="Arial" w:hAnsi="Arial"/>
+          <w:color w:val="212529"/>
+          <w:sz w:val="22"/>
+          <w:szCs w:val="22"/>
+        </w:rPr>
+        <w:t xml:space="preserve">Sélectionne le jour et la période (matin / après-midi).</w:t>
+      </w:r>
+    </w:p>
+    <w:p>
+      <w:pPr>
+        <w:pStyle w:val="ListParagraph"/>
+        <w:numPr>
+          <w:ilvl w:val="0"/>
+          <w:numId w:val="2"/>
+        </w:numPr>
+        <w:spacing w:after="40" w:before="40"/>
+      </w:pPr>
+      <w:r>
+        <w:rPr>
+          <w:rFonts w:ascii="Arial" w:cs="Arial" w:eastAsia="Arial" w:hAnsi="Arial"/>
+          <w:color w:val="212529"/>
+          <w:sz w:val="22"/>
+          <w:szCs w:val="22"/>
+        </w:rPr>
+        <w:t xml:space="preserve">Enregistre.</w:t>
+      </w:r>
+    </w:p>
+    <w:p>
+      <w:pPr>
+        <w:pBdr>
+          <w:left w:val="single" w:color="FFC107" w:sz="8" w:space="8"/>
+        </w:pBdr>
+        <w:spacing w:after="80" w:before="80"/>
+        <w:ind w:left="360"/>
+      </w:pPr>
+      <w:r>
+        <w:rPr>
+          <w:rFonts w:ascii="Arial" w:cs="Arial" w:eastAsia="Arial" w:hAnsi="Arial"/>
+          <w:sz w:val="22"/>
+          <w:szCs w:val="22"/>
+        </w:rPr>
+        <w:t xml:space="preserve">⚠️ </w:t>
+      </w:r>
+      <w:r>
+        <w:rPr>
+          <w:rFonts w:ascii="Arial" w:cs="Arial" w:eastAsia="Arial" w:hAnsi="Arial"/>
+          <w:i/>
+          <w:iCs/>
+          <w:color w:val="856404"/>
+          <w:sz w:val="22"/>
+          <w:szCs w:val="22"/>
+        </w:rPr>
+        <w:t xml:space="preserve">Ces exclusions sont prioritaires sur les attributions automatiques. Le système ne t'assignera jamais d'activité sur ces créneaux.</w:t>
+      </w:r>
+    </w:p>
+    <w:p>
+      <w:pPr>
+        <w:pStyle w:val="Heading2"/>
+        <w:spacing w:after="120" w:before="280"/>
+      </w:pPr>
+      <w:r>
+        <w:rPr>
+          <w:rFonts w:ascii="Arial" w:cs="Arial" w:eastAsia="Arial" w:hAnsi="Arial"/>
+          <w:b/>
+          <w:bCs/>
+          <w:color w:val="1971C2"/>
+          <w:sz w:val="26"/>
+          <w:szCs w:val="26"/>
+        </w:rPr>
+        <w:t xml:space="preserve">6.3 Modifier sa photo de profil</w:t>
+      </w:r>
+    </w:p>
+    <w:p>
+      <w:pPr>
+        <w:spacing w:after="100" w:before="60"/>
+      </w:pPr>
+      <w:r>
+        <w:rPr>
+          <w:rFonts w:ascii="Arial" w:cs="Arial" w:eastAsia="Arial" w:hAnsi="Arial"/>
+          <w:b w:val="false"/>
+          <w:bCs w:val="false"/>
+          <w:i w:val="false"/>
+          <w:iCs w:val="false"/>
+          <w:color w:val="212529"/>
+          <w:sz w:val="22"/>
+          <w:szCs w:val="22"/>
+        </w:rPr>
+        <w:t xml:space="preserve">Clique sur l'icône appareil photo sur ton avatar → sélectionne une image depuis ton appareil. La photo est mise à jour immédiatement.</w:t>
+      </w:r>
+    </w:p>
+    <w:p>
+      <w:pPr>
+        <w:pStyle w:val="Heading2"/>
+        <w:spacing w:after="120" w:before="280"/>
+      </w:pPr>
+      <w:r>
+        <w:rPr>
+          <w:rFonts w:ascii="Arial" w:cs="Arial" w:eastAsia="Arial" w:hAnsi="Arial"/>
+          <w:b/>
+          <w:bCs/>
+          <w:color w:val="1971C2"/>
+          <w:sz w:val="26"/>
+          <w:szCs w:val="26"/>
+        </w:rPr>
+        <w:t xml:space="preserve">6.4 Changer de mot de passe</w:t>
+      </w:r>
+    </w:p>
+    <w:p>
+      <w:pPr>
+        <w:spacing w:after="100" w:before="60"/>
+      </w:pPr>
+      <w:r>
+        <w:rPr>
+          <w:rFonts w:ascii="Arial" w:cs="Arial" w:eastAsia="Arial" w:hAnsi="Arial"/>
+          <w:b w:val="false"/>
+          <w:bCs w:val="false"/>
+          <w:i w:val="false"/>
+          <w:iCs w:val="false"/>
+          <w:color w:val="212529"/>
+          <w:sz w:val="22"/>
+          <w:szCs w:val="22"/>
+        </w:rPr>
+        <w:t xml:space="preserve">Clique sur "Modifier le mot de passe" → un email de réinitialisation te sera envoyé. Suis le lien reçu pour définir un nouveau mot de passe.</w:t>
+      </w:r>
+    </w:p>
+    <w:p>
+      <w:pPr>
+        <w:pStyle w:val="Heading2"/>
+        <w:spacing w:after="120" w:before="280"/>
+      </w:pPr>
+      <w:r>
+        <w:rPr>
+          <w:rFonts w:ascii="Arial" w:cs="Arial" w:eastAsia="Arial" w:hAnsi="Arial"/>
+          <w:b/>
+          <w:bCs/>
+          <w:color w:val="1971C2"/>
+          <w:sz w:val="26"/>
+          <w:szCs w:val="26"/>
+        </w:rPr>
+        <w:t xml:space="preserve">6.5 Notifications push (mobile)</w:t>
+      </w:r>
+    </w:p>
+    <w:p>
+      <w:pPr>
+        <w:spacing w:after="100" w:before="60"/>
+      </w:pPr>
+      <w:r>
+        <w:rPr>
+          <w:rFonts w:ascii="Arial" w:cs="Arial" w:eastAsia="Arial" w:hAnsi="Arial"/>
+          <w:b w:val="false"/>
+          <w:bCs w:val="false"/>
+          <w:i w:val="false"/>
+          <w:iCs w:val="false"/>
+          <w:color w:val="212529"/>
+          <w:sz w:val="22"/>
+          <w:szCs w:val="22"/>
+        </w:rPr>
+        <w:t xml:space="preserve">Pour recevoir des alertes sur ton mobile même quand l'application est fermée :</w:t>
+      </w:r>
+    </w:p>
+    <w:p>
+      <w:pPr>
+        <w:pStyle w:val="ListParagraph"/>
+        <w:numPr>
+          <w:ilvl w:val="0"/>
+          <w:numId w:val="2"/>
+        </w:numPr>
+        <w:spacing w:after="40" w:before="40"/>
+      </w:pPr>
+      <w:r>
+        <w:rPr>
+          <w:rFonts w:ascii="Arial" w:cs="Arial" w:eastAsia="Arial" w:hAnsi="Arial"/>
+          <w:color w:val="212529"/>
+          <w:sz w:val="22"/>
+          <w:szCs w:val="22"/>
+        </w:rPr>
+        <w:t xml:space="preserve">Dans "Mon Profil", section "Notifications".</w:t>
+      </w:r>
+    </w:p>
+    <w:p>
+      <w:pPr>
+        <w:pStyle w:val="ListParagraph"/>
+        <w:numPr>
+          <w:ilvl w:val="0"/>
+          <w:numId w:val="2"/>
+        </w:numPr>
+        <w:spacing w:after="40" w:before="40"/>
+      </w:pPr>
+      <w:r>
+        <w:rPr>
+          <w:rFonts w:ascii="Arial" w:cs="Arial" w:eastAsia="Arial" w:hAnsi="Arial"/>
+          <w:color w:val="212529"/>
+          <w:sz w:val="22"/>
+          <w:szCs w:val="22"/>
+        </w:rPr>
+        <w:t xml:space="preserve">Active l'option "Notifications push".</w:t>
+      </w:r>
+    </w:p>
+    <w:p>
+      <w:pPr>
+        <w:pStyle w:val="ListParagraph"/>
+        <w:numPr>
+          <w:ilvl w:val="0"/>
+          <w:numId w:val="2"/>
+        </w:numPr>
+        <w:spacing w:after="40" w:before="40"/>
+      </w:pPr>
+      <w:r>
+        <w:rPr>
+          <w:rFonts w:ascii="Arial" w:cs="Arial" w:eastAsia="Arial" w:hAnsi="Arial"/>
+          <w:color w:val="212529"/>
+          <w:sz w:val="22"/>
+          <w:szCs w:val="22"/>
+        </w:rPr>
+        <w:t xml:space="preserve">Accepte la permission demandée par ton navigateur mobile.</w:t>
+      </w:r>
+    </w:p>
+    <w:p>
+      <w:pPr>
+        <w:spacing w:after="100" w:before="60"/>
+      </w:pPr>
+      <w:r>
+        <w:rPr>
+          <w:rFonts w:ascii="Arial" w:cs="Arial" w:eastAsia="Arial" w:hAnsi="Arial"/>
+          <w:b w:val="false"/>
+          <w:bCs w:val="false"/>
+          <w:i w:val="false"/>
+          <w:iCs w:val="false"/>
+          <w:color w:val="212529"/>
+          <w:sz w:val="22"/>
+          <w:szCs w:val="22"/>
+        </w:rPr>
+        <w:t xml:space="preserve">Tu peux activer ou désactiver chaque type de notification individuellement (RCP, remplacements, rappels).</w:t>
+      </w:r>
+    </w:p>
+    <w:p>
+      <w:pPr>
+        <w:pBdr>
+          <w:left w:val="single" w:color="3B5BDB" w:sz="8" w:space="8"/>
+        </w:pBdr>
+        <w:spacing w:after="80" w:before="80"/>
+        <w:ind w:left="360"/>
+      </w:pPr>
+      <w:r>
+        <w:rPr>
+          <w:rFonts w:ascii="Arial" w:cs="Arial" w:eastAsia="Arial" w:hAnsi="Arial"/>
+          <w:sz w:val="22"/>
+          <w:szCs w:val="22"/>
+        </w:rPr>
+        <w:t xml:space="preserve">💡 </w:t>
+      </w:r>
+      <w:r>
+        <w:rPr>
+          <w:rFonts w:ascii="Arial" w:cs="Arial" w:eastAsia="Arial" w:hAnsi="Arial"/>
+          <w:i/>
+          <w:iCs/>
+          <w:color w:val="1971C2"/>
+          <w:sz w:val="22"/>
+          <w:szCs w:val="22"/>
+        </w:rPr>
+        <w:t xml:space="preserve">Les notifications push ne fonctionnent que si l'application est installée sur l'écran d'accueil (voir section 1.4).</w:t>
+      </w:r>
+    </w:p>
+    <w:p>
+      <w:pPr>
+        <w:pStyle w:val="Heading1"/>
+        <w:pageBreakBefore/>
+        <w:spacing w:after="240" w:before="0"/>
+      </w:pPr>
+      <w:r>
+        <w:rPr>
+          <w:rFonts w:ascii="Arial" w:cs="Arial" w:eastAsia="Arial" w:hAnsi="Arial"/>
+          <w:b/>
+          <w:bCs/>
+          <w:color w:val="3B5BDB"/>
+          <w:sz w:val="32"/>
+          <w:szCs w:val="32"/>
+        </w:rPr>
+        <w:t xml:space="preserve">7. Notifications &amp; Remplacements</w:t>
+      </w:r>
+    </w:p>
+    <w:p>
+      <w:pPr>
+        <w:spacing w:after="100" w:before="60"/>
+      </w:pPr>
+      <w:r>
+        <w:rPr>
+          <w:rFonts w:ascii="Arial" w:cs="Arial" w:eastAsia="Arial" w:hAnsi="Arial"/>
+          <w:b w:val="false"/>
+          <w:bCs w:val="false"/>
+          <w:i w:val="false"/>
+          <w:iCs w:val="false"/>
+          <w:color w:val="212529"/>
+          <w:sz w:val="22"/>
+          <w:szCs w:val="22"/>
+        </w:rPr>
+        <w:t xml:space="preserve">Le système de notifications te tient informé en temps réel des événements qui te concernent : RCP, remplacements, rappels.</w:t>
+      </w:r>
+    </w:p>
+    <w:p>
+      <w:pPr>
+        <w:pStyle w:val="Heading2"/>
+        <w:spacing w:after="120" w:before="280"/>
+      </w:pPr>
+      <w:r>
+        <w:rPr>
+          <w:rFonts w:ascii="Arial" w:cs="Arial" w:eastAsia="Arial" w:hAnsi="Arial"/>
+          <w:b/>
+          <w:bCs/>
+          <w:color w:val="1971C2"/>
+          <w:sz w:val="26"/>
+          <w:szCs w:val="26"/>
+        </w:rPr>
+        <w:t xml:space="preserve">7.1 La cloche de notifications</w:t>
+      </w:r>
+    </w:p>
+    <w:p>
+      <w:pPr>
+        <w:spacing w:after="100" w:before="60"/>
+      </w:pPr>
+      <w:r>
+        <w:rPr>
+          <w:rFonts w:ascii="Arial" w:cs="Arial" w:eastAsia="Arial" w:hAnsi="Arial"/>
+          <w:b w:val="false"/>
+          <w:bCs w:val="false"/>
+          <w:i w:val="false"/>
+          <w:iCs w:val="false"/>
+          <w:color w:val="212529"/>
+          <w:sz w:val="22"/>
+          <w:szCs w:val="22"/>
+        </w:rPr>
+        <w:t xml:space="preserve">L'icône cloche 🔔 est toujours visible :</w:t>
+      </w:r>
+    </w:p>
+    <w:p>
+      <w:pPr>
+        <w:pStyle w:val="ListParagraph"/>
+        <w:numPr>
+          <w:ilvl w:val="0"/>
+          <w:numId w:val="3"/>
+        </w:numPr>
+        <w:spacing w:after="40" w:before="40"/>
+      </w:pPr>
+      <w:r>
+        <w:rPr>
+          <w:rFonts w:ascii="Arial" w:cs="Arial" w:eastAsia="Arial" w:hAnsi="Arial"/>
+          <w:color w:val="212529"/>
+          <w:sz w:val="22"/>
+          <w:szCs w:val="22"/>
+        </w:rPr>
+        <w:t xml:space="preserve">Sur desktop : dans la sidebar en haut à droite.</w:t>
+      </w:r>
+    </w:p>
+    <w:p>
+      <w:pPr>
+        <w:pStyle w:val="ListParagraph"/>
+        <w:numPr>
+          <w:ilvl w:val="0"/>
+          <w:numId w:val="3"/>
+        </w:numPr>
+        <w:spacing w:after="40" w:before="40"/>
+      </w:pPr>
+      <w:r>
+        <w:rPr>
+          <w:rFonts w:ascii="Arial" w:cs="Arial" w:eastAsia="Arial" w:hAnsi="Arial"/>
+          <w:color w:val="212529"/>
+          <w:sz w:val="22"/>
+          <w:szCs w:val="22"/>
+        </w:rPr>
+        <w:t xml:space="preserve">Sur mobile : dans le coin supérieur droit de l'écran.</w:t>
+      </w:r>
+    </w:p>
+    <w:p>
+      <w:pPr>
+        <w:spacing w:after="100" w:before="60"/>
+      </w:pPr>
+      <w:r>
+        <w:rPr>
+          <w:rFonts w:ascii="Arial" w:cs="Arial" w:eastAsia="Arial" w:hAnsi="Arial"/>
+          <w:b w:val="false"/>
+          <w:bCs w:val="false"/>
+          <w:i w:val="false"/>
+          <w:iCs w:val="false"/>
+          <w:color w:val="212529"/>
+          <w:sz w:val="22"/>
+          <w:szCs w:val="22"/>
+        </w:rPr>
+        <w:t xml:space="preserve">Un badge rouge indique le nombre de notifications non lues. Clique sur la cloche pour ouvrir le panneau.</w:t>
+      </w:r>
+    </w:p>
+    <w:p>
+      <w:pPr>
+        <w:spacing w:after="100" w:before="60"/>
+      </w:pPr>
+      <w:r>
+        <w:rPr>
+          <w:rFonts w:ascii="Arial" w:cs="Arial" w:eastAsia="Arial" w:hAnsi="Arial"/>
+          <w:b w:val="false"/>
+          <w:bCs w:val="false"/>
+          <w:i w:val="false"/>
+          <w:iCs w:val="false"/>
+          <w:color w:val="212529"/>
+          <w:sz w:val="22"/>
+          <w:szCs w:val="22"/>
+        </w:rPr>
+        <w:t xml:space="preserve">Dans le panneau, tu peux :</w:t>
+      </w:r>
+    </w:p>
+    <w:p>
+      <w:pPr>
+        <w:pStyle w:val="ListParagraph"/>
+        <w:numPr>
+          <w:ilvl w:val="0"/>
+          <w:numId w:val="3"/>
+        </w:numPr>
+        <w:spacing w:after="40" w:before="40"/>
+      </w:pPr>
+      <w:r>
+        <w:rPr>
+          <w:rFonts w:ascii="Arial" w:cs="Arial" w:eastAsia="Arial" w:hAnsi="Arial"/>
+          <w:color w:val="212529"/>
+          <w:sz w:val="22"/>
+          <w:szCs w:val="22"/>
+        </w:rPr>
+        <w:t xml:space="preserve">"Tout marquer comme lu" → efface le badge rouge sur toutes les notifications.</w:t>
+      </w:r>
+    </w:p>
+    <w:p>
+      <w:pPr>
+        <w:pStyle w:val="ListParagraph"/>
+        <w:numPr>
+          <w:ilvl w:val="0"/>
+          <w:numId w:val="3"/>
+        </w:numPr>
+        <w:spacing w:after="40" w:before="40"/>
+      </w:pPr>
+      <w:r>
+        <w:rPr>
+          <w:rFonts w:ascii="Arial" w:cs="Arial" w:eastAsia="Arial" w:hAnsi="Arial"/>
+          <w:color w:val="212529"/>
+          <w:sz w:val="22"/>
+          <w:szCs w:val="22"/>
+        </w:rPr>
+        <w:t xml:space="preserve">"Tout effacer" → supprime toutes les notifications de la liste.</w:t>
+      </w:r>
+    </w:p>
+    <w:p>
+      <w:pPr>
+        <w:pStyle w:val="Heading2"/>
+        <w:spacing w:after="120" w:before="280"/>
+      </w:pPr>
+      <w:r>
+        <w:rPr>
+          <w:rFonts w:ascii="Arial" w:cs="Arial" w:eastAsia="Arial" w:hAnsi="Arial"/>
+          <w:b/>
+          <w:bCs/>
+          <w:color w:val="1971C2"/>
+          <w:sz w:val="26"/>
+          <w:szCs w:val="26"/>
+        </w:rPr>
+        <w:t xml:space="preserve">7.2 Types de notifications</w:t>
+      </w:r>
+    </w:p>
+    <w:p>
+      <w:pPr>
+        <w:spacing w:after="120" w:before="0"/>
+      </w:pPr>
+    </w:p>
+    <w:tbl>
+      <w:tblPr>
+        <w:tblW w:type="dxa" w:w="9000"/>
+        <w:tblBorders>
+          <w:top w:val="single" w:color="auto" w:sz="4"/>
+          <w:left w:val="single" w:color="auto" w:sz="4"/>
+          <w:bottom w:val="single" w:color="auto" w:sz="4"/>
+          <w:right w:val="single" w:color="auto" w:sz="4"/>
+          <w:insideH w:val="single" w:color="auto" w:sz="4"/>
+          <w:insideV w:val="single" w:color="auto" w:sz="4"/>
+        </w:tblBorders>
+      </w:tblPr>
+      <w:tblGrid>
+        <w:gridCol w:w="2400"/>
+        <w:gridCol w:w="3000"/>
+        <w:gridCol w:w="3600"/>
+      </w:tblGrid>
+      <w:tr>
+        <w:trPr>
+          <w:tblHeader/>
+        </w:trPr>
+        <w:tc>
+          <w:tcPr>
+            <w:tcW w:type="dxa" w:w="2400"/>
+            <w:tcBorders>
+              <w:top w:val="single" w:color="3B5BDB" w:sz="1"/>
+              <w:left w:val="single" w:color="3B5BDB" w:sz="1"/>
+              <w:bottom w:val="single" w:color="3B5BDB" w:sz="1"/>
+              <w:right w:val="single" w:color="3B5BDB" w:sz="1"/>
+            </w:tcBorders>
+            <w:shd w:fill="1E3A5F" w:val="clear"/>
+            <w:tcMar>
+              <w:top w:type="dxa" w:w="80"/>
+              <w:left w:type="dxa" w:w="140"/>
+              <w:bottom w:type="dxa" w:w="80"/>
+              <w:right w:type="dxa" w:w="140"/>
+            </w:tcMar>
+          </w:tcPr>
+          <w:p>
+            <w:pPr>
+              <w:spacing w:after="0" w:before="0"/>
+            </w:pPr>
+            <w:r>
+              <w:rPr>
+                <w:rFonts w:ascii="Arial" w:cs="Arial" w:eastAsia="Arial" w:hAnsi="Arial"/>
+                <w:b/>
+                <w:bCs/>
+                <w:color w:val="FFFFFF"/>
+                <w:sz w:val="20"/>
+                <w:szCs w:val="20"/>
+              </w:rPr>
+              <w:t xml:space="preserve">Icône</w:t>
+            </w:r>
+          </w:p>
+        </w:tc>
+        <w:tc>
+          <w:tcPr>
+            <w:tcW w:type="dxa" w:w="3000"/>
+            <w:tcBorders>
+              <w:top w:val="single" w:color="3B5BDB" w:sz="1"/>
+              <w:left w:val="single" w:color="3B5BDB" w:sz="1"/>
+              <w:bottom w:val="single" w:color="3B5BDB" w:sz="1"/>
+              <w:right w:val="single" w:color="3B5BDB" w:sz="1"/>
+            </w:tcBorders>
+            <w:shd w:fill="1E3A5F" w:val="clear"/>
+            <w:tcMar>
+              <w:top w:type="dxa" w:w="80"/>
+              <w:left w:type="dxa" w:w="140"/>
+              <w:bottom w:type="dxa" w:w="80"/>
+              <w:right w:type="dxa" w:w="140"/>
+            </w:tcMar>
+          </w:tcPr>
+          <w:p>
+            <w:pPr>
+              <w:spacing w:after="0" w:before="0"/>
+            </w:pPr>
+            <w:r>
+              <w:rPr>
+                <w:rFonts w:ascii="Arial" w:cs="Arial" w:eastAsia="Arial" w:hAnsi="Arial"/>
+                <w:b/>
+                <w:bCs/>
+                <w:color w:val="FFFFFF"/>
+                <w:sz w:val="20"/>
+                <w:szCs w:val="20"/>
+              </w:rPr>
+              <w:t xml:space="preserve">Type</w:t>
+            </w:r>
+          </w:p>
+        </w:tc>
+        <w:tc>
+          <w:tcPr>
+            <w:tcW w:type="dxa" w:w="3600"/>
+            <w:tcBorders>
+              <w:top w:val="single" w:color="3B5BDB" w:sz="1"/>
+              <w:left w:val="single" w:color="3B5BDB" w:sz="1"/>
+              <w:bottom w:val="single" w:color="3B5BDB" w:sz="1"/>
+              <w:right w:val="single" w:color="3B5BDB" w:sz="1"/>
+            </w:tcBorders>
+            <w:shd w:fill="1E3A5F" w:val="clear"/>
+            <w:tcMar>
+              <w:top w:type="dxa" w:w="80"/>
+              <w:left w:type="dxa" w:w="140"/>
+              <w:bottom w:type="dxa" w:w="80"/>
+              <w:right w:type="dxa" w:w="140"/>
+            </w:tcMar>
+          </w:tcPr>
+          <w:p>
+            <w:pPr>
+              <w:spacing w:after="0" w:before="0"/>
+            </w:pPr>
+            <w:r>
+              <w:rPr>
+                <w:rFonts w:ascii="Arial" w:cs="Arial" w:eastAsia="Arial" w:hAnsi="Arial"/>
+                <w:b/>
+                <w:bCs/>
+                <w:color w:val="FFFFFF"/>
+                <w:sz w:val="20"/>
+                <w:szCs w:val="20"/>
+              </w:rPr>
+              <w:t xml:space="preserve">Quand tu la reçois</w:t>
+            </w:r>
+          </w:p>
+        </w:tc>
+      </w:tr>
+      <w:tr>
+        <w:tc>
+          <w:tcPr>
+            <w:tcW w:type="dxa" w:w="2400"/>
+            <w:tcBorders>
+              <w:top w:val="single" w:color="C5D3E8" w:sz="1"/>
+              <w:left w:val="single" w:color="C5D3E8" w:sz="1"/>
+              <w:bottom w:val="single" w:color="C5D3E8" w:sz="1"/>
+              <w:right w:val="single" w:color="C5D3E8" w:sz="1"/>
+            </w:tcBorders>
+            <w:shd w:fill="FFFFFF" w:val="clear"/>
+            <w:tcMar>
+              <w:top w:type="dxa" w:w="80"/>
+              <w:left w:type="dxa" w:w="140"/>
+              <w:bottom w:type="dxa" w:w="80"/>
+              <w:right w:type="dxa" w:w="140"/>
+            </w:tcMar>
+          </w:tcPr>
+          <w:p>
+            <w:pPr>
+              <w:spacing w:after="0" w:before="0"/>
+            </w:pPr>
+            <w:r>
+              <w:rPr>
+                <w:rFonts w:ascii="Arial" w:cs="Arial" w:eastAsia="Arial" w:hAnsi="Arial"/>
+                <w:color w:val="212529"/>
+                <w:sz w:val="20"/>
+                <w:szCs w:val="20"/>
+              </w:rPr>
+              <w:t xml:space="preserve">🎲 RCP auto-assigné</w:t>
+            </w:r>
+          </w:p>
+        </w:tc>
+        <w:tc>
+          <w:tcPr>
+            <w:tcW w:type="dxa" w:w="3000"/>
+            <w:tcBorders>
+              <w:top w:val="single" w:color="C5D3E8" w:sz="1"/>
+              <w:left w:val="single" w:color="C5D3E8" w:sz="1"/>
+              <w:bottom w:val="single" w:color="C5D3E8" w:sz="1"/>
+              <w:right w:val="single" w:color="C5D3E8" w:sz="1"/>
+            </w:tcBorders>
+            <w:shd w:fill="FFFFFF" w:val="clear"/>
+            <w:tcMar>
+              <w:top w:type="dxa" w:w="80"/>
+              <w:left w:type="dxa" w:w="140"/>
+              <w:bottom w:type="dxa" w:w="80"/>
+              <w:right w:type="dxa" w:w="140"/>
+            </w:tcMar>
+          </w:tcPr>
+          <w:p>
+            <w:pPr>
+              <w:spacing w:after="0" w:before="0"/>
+            </w:pPr>
+            <w:r>
+              <w:rPr>
+                <w:rFonts w:ascii="Arial" w:cs="Arial" w:eastAsia="Arial" w:hAnsi="Arial"/>
+                <w:color w:val="212529"/>
+                <w:sz w:val="20"/>
+                <w:szCs w:val="20"/>
+              </w:rPr>
+              <w:t xml:space="preserve">Tu as été désigné pour un RCP</w:t>
+            </w:r>
+          </w:p>
+        </w:tc>
+        <w:tc>
+          <w:tcPr>
+            <w:tcW w:type="dxa" w:w="3600"/>
+            <w:tcBorders>
+              <w:top w:val="single" w:color="C5D3E8" w:sz="1"/>
+              <w:left w:val="single" w:color="C5D3E8" w:sz="1"/>
+              <w:bottom w:val="single" w:color="C5D3E8" w:sz="1"/>
+              <w:right w:val="single" w:color="C5D3E8" w:sz="1"/>
+            </w:tcBorders>
+            <w:shd w:fill="FFFFFF" w:val="clear"/>
+            <w:tcMar>
+              <w:top w:type="dxa" w:w="80"/>
+              <w:left w:type="dxa" w:w="140"/>
+              <w:bottom w:type="dxa" w:w="80"/>
+              <w:right w:type="dxa" w:w="140"/>
+            </w:tcMar>
+          </w:tcPr>
+          <w:p>
+            <w:pPr>
+              <w:spacing w:after="0" w:before="0"/>
+            </w:pPr>
+            <w:r>
+              <w:rPr>
+                <w:rFonts w:ascii="Arial" w:cs="Arial" w:eastAsia="Arial" w:hAnsi="Arial"/>
+                <w:color w:val="212529"/>
+                <w:sz w:val="20"/>
+                <w:szCs w:val="20"/>
+              </w:rPr>
+              <w:t xml:space="preserve">Après l'attribution automatique</w:t>
+            </w:r>
+          </w:p>
+        </w:tc>
+      </w:tr>
+      <w:tr>
+        <w:tc>
+          <w:tcPr>
+            <w:tcW w:type="dxa" w:w="2400"/>
+            <w:tcBorders>
+              <w:top w:val="single" w:color="C5D3E8" w:sz="1"/>
+              <w:left w:val="single" w:color="C5D3E8" w:sz="1"/>
+              <w:bottom w:val="single" w:color="C5D3E8" w:sz="1"/>
+              <w:right w:val="single" w:color="C5D3E8" w:sz="1"/>
+            </w:tcBorders>
+            <w:shd w:fill="F1F3F9" w:val="clear"/>
+            <w:tcMar>
+              <w:top w:type="dxa" w:w="80"/>
+              <w:left w:type="dxa" w:w="140"/>
+              <w:bottom w:type="dxa" w:w="80"/>
+              <w:right w:type="dxa" w:w="140"/>
+            </w:tcMar>
+          </w:tcPr>
+          <w:p>
+            <w:pPr>
+              <w:spacing w:after="0" w:before="0"/>
+            </w:pPr>
+            <w:r>
+              <w:rPr>
+                <w:rFonts w:ascii="Arial" w:cs="Arial" w:eastAsia="Arial" w:hAnsi="Arial"/>
+                <w:color w:val="212529"/>
+                <w:sz w:val="20"/>
+                <w:szCs w:val="20"/>
+              </w:rPr>
+              <w:t xml:space="preserve">✅ RCP confirmé</w:t>
+            </w:r>
+          </w:p>
+        </w:tc>
+        <w:tc>
+          <w:tcPr>
+            <w:tcW w:type="dxa" w:w="3000"/>
+            <w:tcBorders>
+              <w:top w:val="single" w:color="C5D3E8" w:sz="1"/>
+              <w:left w:val="single" w:color="C5D3E8" w:sz="1"/>
+              <w:bottom w:val="single" w:color="C5D3E8" w:sz="1"/>
+              <w:right w:val="single" w:color="C5D3E8" w:sz="1"/>
+            </w:tcBorders>
+            <w:shd w:fill="F1F3F9" w:val="clear"/>
+            <w:tcMar>
+              <w:top w:type="dxa" w:w="80"/>
+              <w:left w:type="dxa" w:w="140"/>
+              <w:bottom w:type="dxa" w:w="80"/>
+              <w:right w:type="dxa" w:w="140"/>
+            </w:tcMar>
+          </w:tcPr>
+          <w:p>
+            <w:pPr>
+              <w:spacing w:after="0" w:before="0"/>
+            </w:pPr>
+            <w:r>
+              <w:rPr>
+                <w:rFonts w:ascii="Arial" w:cs="Arial" w:eastAsia="Arial" w:hAnsi="Arial"/>
+                <w:color w:val="212529"/>
+                <w:sz w:val="20"/>
+                <w:szCs w:val="20"/>
+              </w:rPr>
+              <w:t xml:space="preserve">Un RCP est maintenant confirmé</w:t>
+            </w:r>
+          </w:p>
+        </w:tc>
+        <w:tc>
+          <w:tcPr>
+            <w:tcW w:type="dxa" w:w="3600"/>
+            <w:tcBorders>
+              <w:top w:val="single" w:color="C5D3E8" w:sz="1"/>
+              <w:left w:val="single" w:color="C5D3E8" w:sz="1"/>
+              <w:bottom w:val="single" w:color="C5D3E8" w:sz="1"/>
+              <w:right w:val="single" w:color="C5D3E8" w:sz="1"/>
+            </w:tcBorders>
+            <w:shd w:fill="F1F3F9" w:val="clear"/>
+            <w:tcMar>
+              <w:top w:type="dxa" w:w="80"/>
+              <w:left w:type="dxa" w:w="140"/>
+              <w:bottom w:type="dxa" w:w="80"/>
+              <w:right w:type="dxa" w:w="140"/>
+            </w:tcMar>
+          </w:tcPr>
+          <w:p>
+            <w:pPr>
+              <w:spacing w:after="0" w:before="0"/>
+            </w:pPr>
+            <w:r>
+              <w:rPr>
+                <w:rFonts w:ascii="Arial" w:cs="Arial" w:eastAsia="Arial" w:hAnsi="Arial"/>
+                <w:color w:val="212529"/>
+                <w:sz w:val="20"/>
+                <w:szCs w:val="20"/>
+              </w:rPr>
+              <w:t xml:space="preserve">Un médecin a dit PRÉSENT</w:t>
+            </w:r>
+          </w:p>
+        </w:tc>
+      </w:tr>
+      <w:tr>
+        <w:tc>
+          <w:tcPr>
+            <w:tcW w:type="dxa" w:w="2400"/>
+            <w:tcBorders>
+              <w:top w:val="single" w:color="C5D3E8" w:sz="1"/>
+              <w:left w:val="single" w:color="C5D3E8" w:sz="1"/>
+              <w:bottom w:val="single" w:color="C5D3E8" w:sz="1"/>
+              <w:right w:val="single" w:color="C5D3E8" w:sz="1"/>
+            </w:tcBorders>
+            <w:shd w:fill="FFFFFF" w:val="clear"/>
+            <w:tcMar>
+              <w:top w:type="dxa" w:w="80"/>
+              <w:left w:type="dxa" w:w="140"/>
+              <w:bottom w:type="dxa" w:w="80"/>
+              <w:right w:type="dxa" w:w="140"/>
+            </w:tcMar>
+          </w:tcPr>
+          <w:p>
+            <w:pPr>
+              <w:spacing w:after="0" w:before="0"/>
+            </w:pPr>
+            <w:r>
+              <w:rPr>
+                <w:rFonts w:ascii="Arial" w:cs="Arial" w:eastAsia="Arial" w:hAnsi="Arial"/>
+                <w:color w:val="212529"/>
+                <w:sz w:val="20"/>
+                <w:szCs w:val="20"/>
+              </w:rPr>
+              <w:t xml:space="preserve">⏰ Rappel RCP 24h</w:t>
+            </w:r>
+          </w:p>
+        </w:tc>
+        <w:tc>
+          <w:tcPr>
+            <w:tcW w:type="dxa" w:w="3000"/>
+            <w:tcBorders>
+              <w:top w:val="single" w:color="C5D3E8" w:sz="1"/>
+              <w:left w:val="single" w:color="C5D3E8" w:sz="1"/>
+              <w:bottom w:val="single" w:color="C5D3E8" w:sz="1"/>
+              <w:right w:val="single" w:color="C5D3E8" w:sz="1"/>
+            </w:tcBorders>
+            <w:shd w:fill="FFFFFF" w:val="clear"/>
+            <w:tcMar>
+              <w:top w:type="dxa" w:w="80"/>
+              <w:left w:type="dxa" w:w="140"/>
+              <w:bottom w:type="dxa" w:w="80"/>
+              <w:right w:type="dxa" w:w="140"/>
+            </w:tcMar>
+          </w:tcPr>
+          <w:p>
+            <w:pPr>
+              <w:spacing w:after="0" w:before="0"/>
+            </w:pPr>
+            <w:r>
+              <w:rPr>
+                <w:rFonts w:ascii="Arial" w:cs="Arial" w:eastAsia="Arial" w:hAnsi="Arial"/>
+                <w:color w:val="212529"/>
+                <w:sz w:val="20"/>
+                <w:szCs w:val="20"/>
+              </w:rPr>
+              <w:t xml:space="preserve">Un RCP a lieu demain</w:t>
+            </w:r>
+          </w:p>
+        </w:tc>
+        <w:tc>
+          <w:tcPr>
+            <w:tcW w:type="dxa" w:w="3600"/>
+            <w:tcBorders>
+              <w:top w:val="single" w:color="C5D3E8" w:sz="1"/>
+              <w:left w:val="single" w:color="C5D3E8" w:sz="1"/>
+              <w:bottom w:val="single" w:color="C5D3E8" w:sz="1"/>
+              <w:right w:val="single" w:color="C5D3E8" w:sz="1"/>
+            </w:tcBorders>
+            <w:shd w:fill="FFFFFF" w:val="clear"/>
+            <w:tcMar>
+              <w:top w:type="dxa" w:w="80"/>
+              <w:left w:type="dxa" w:w="140"/>
+              <w:bottom w:type="dxa" w:w="80"/>
+              <w:right w:type="dxa" w:w="140"/>
+            </w:tcMar>
+          </w:tcPr>
+          <w:p>
+            <w:pPr>
+              <w:spacing w:after="0" w:before="0"/>
+            </w:pPr>
+            <w:r>
+              <w:rPr>
+                <w:rFonts w:ascii="Arial" w:cs="Arial" w:eastAsia="Arial" w:hAnsi="Arial"/>
+                <w:color w:val="212529"/>
+                <w:sz w:val="20"/>
+                <w:szCs w:val="20"/>
+              </w:rPr>
+              <w:t xml:space="preserve">La veille du RCP</w:t>
+            </w:r>
+          </w:p>
+        </w:tc>
+      </w:tr>
+      <w:tr>
+        <w:tc>
+          <w:tcPr>
+            <w:tcW w:type="dxa" w:w="2400"/>
+            <w:tcBorders>
+              <w:top w:val="single" w:color="C5D3E8" w:sz="1"/>
+              <w:left w:val="single" w:color="C5D3E8" w:sz="1"/>
+              <w:bottom w:val="single" w:color="C5D3E8" w:sz="1"/>
+              <w:right w:val="single" w:color="C5D3E8" w:sz="1"/>
+            </w:tcBorders>
+            <w:shd w:fill="F1F3F9" w:val="clear"/>
+            <w:tcMar>
+              <w:top w:type="dxa" w:w="80"/>
+              <w:left w:type="dxa" w:w="140"/>
+              <w:bottom w:type="dxa" w:w="80"/>
+              <w:right w:type="dxa" w:w="140"/>
+            </w:tcMar>
+          </w:tcPr>
+          <w:p>
+            <w:pPr>
+              <w:spacing w:after="0" w:before="0"/>
+            </w:pPr>
+            <w:r>
+              <w:rPr>
+                <w:rFonts w:ascii="Arial" w:cs="Arial" w:eastAsia="Arial" w:hAnsi="Arial"/>
+                <w:color w:val="212529"/>
+                <w:sz w:val="20"/>
+                <w:szCs w:val="20"/>
+              </w:rPr>
+              <w:t xml:space="preserve">⚠️ Rappel RCP 12h</w:t>
+            </w:r>
+          </w:p>
+        </w:tc>
+        <w:tc>
+          <w:tcPr>
+            <w:tcW w:type="dxa" w:w="3000"/>
+            <w:tcBorders>
+              <w:top w:val="single" w:color="C5D3E8" w:sz="1"/>
+              <w:left w:val="single" w:color="C5D3E8" w:sz="1"/>
+              <w:bottom w:val="single" w:color="C5D3E8" w:sz="1"/>
+              <w:right w:val="single" w:color="C5D3E8" w:sz="1"/>
+            </w:tcBorders>
+            <w:shd w:fill="F1F3F9" w:val="clear"/>
+            <w:tcMar>
+              <w:top w:type="dxa" w:w="80"/>
+              <w:left w:type="dxa" w:w="140"/>
+              <w:bottom w:type="dxa" w:w="80"/>
+              <w:right w:type="dxa" w:w="140"/>
+            </w:tcMar>
+          </w:tcPr>
+          <w:p>
+            <w:pPr>
+              <w:spacing w:after="0" w:before="0"/>
+            </w:pPr>
+            <w:r>
+              <w:rPr>
+                <w:rFonts w:ascii="Arial" w:cs="Arial" w:eastAsia="Arial" w:hAnsi="Arial"/>
+                <w:color w:val="212529"/>
+                <w:sz w:val="20"/>
+                <w:szCs w:val="20"/>
+              </w:rPr>
+              <w:t xml:space="preserve">Un RCP a lieu dans 12h</w:t>
+            </w:r>
+          </w:p>
+        </w:tc>
+        <w:tc>
+          <w:tcPr>
+            <w:tcW w:type="dxa" w:w="3600"/>
+            <w:tcBorders>
+              <w:top w:val="single" w:color="C5D3E8" w:sz="1"/>
+              <w:left w:val="single" w:color="C5D3E8" w:sz="1"/>
+              <w:bottom w:val="single" w:color="C5D3E8" w:sz="1"/>
+              <w:right w:val="single" w:color="C5D3E8" w:sz="1"/>
+            </w:tcBorders>
+            <w:shd w:fill="F1F3F9" w:val="clear"/>
+            <w:tcMar>
+              <w:top w:type="dxa" w:w="80"/>
+              <w:left w:type="dxa" w:w="140"/>
+              <w:bottom w:type="dxa" w:w="80"/>
+              <w:right w:type="dxa" w:w="140"/>
+            </w:tcMar>
+          </w:tcPr>
+          <w:p>
+            <w:pPr>
+              <w:spacing w:after="0" w:before="0"/>
+            </w:pPr>
+            <w:r>
+              <w:rPr>
+                <w:rFonts w:ascii="Arial" w:cs="Arial" w:eastAsia="Arial" w:hAnsi="Arial"/>
+                <w:color w:val="212529"/>
+                <w:sz w:val="20"/>
+                <w:szCs w:val="20"/>
+              </w:rPr>
+              <w:t xml:space="preserve">12h avant le RCP</w:t>
+            </w:r>
+          </w:p>
+        </w:tc>
+      </w:tr>
+      <w:tr>
+        <w:tc>
+          <w:tcPr>
+            <w:tcW w:type="dxa" w:w="2400"/>
+            <w:tcBorders>
+              <w:top w:val="single" w:color="C5D3E8" w:sz="1"/>
+              <w:left w:val="single" w:color="C5D3E8" w:sz="1"/>
+              <w:bottom w:val="single" w:color="C5D3E8" w:sz="1"/>
+              <w:right w:val="single" w:color="C5D3E8" w:sz="1"/>
+            </w:tcBorders>
+            <w:shd w:fill="FFFFFF" w:val="clear"/>
+            <w:tcMar>
+              <w:top w:type="dxa" w:w="80"/>
+              <w:left w:type="dxa" w:w="140"/>
+              <w:bottom w:type="dxa" w:w="80"/>
+              <w:right w:type="dxa" w:w="140"/>
+            </w:tcMar>
+          </w:tcPr>
+          <w:p>
+            <w:pPr>
+              <w:spacing w:after="0" w:before="0"/>
+            </w:pPr>
+            <w:r>
+              <w:rPr>
+                <w:rFonts w:ascii="Arial" w:cs="Arial" w:eastAsia="Arial" w:hAnsi="Arial"/>
+                <w:color w:val="212529"/>
+                <w:sz w:val="20"/>
+                <w:szCs w:val="20"/>
+              </w:rPr>
+              <w:t xml:space="preserve">🚨 RCP sans assigné</w:t>
+            </w:r>
+          </w:p>
+        </w:tc>
+        <w:tc>
+          <w:tcPr>
+            <w:tcW w:type="dxa" w:w="3000"/>
+            <w:tcBorders>
+              <w:top w:val="single" w:color="C5D3E8" w:sz="1"/>
+              <w:left w:val="single" w:color="C5D3E8" w:sz="1"/>
+              <w:bottom w:val="single" w:color="C5D3E8" w:sz="1"/>
+              <w:right w:val="single" w:color="C5D3E8" w:sz="1"/>
+            </w:tcBorders>
+            <w:shd w:fill="FFFFFF" w:val="clear"/>
+            <w:tcMar>
+              <w:top w:type="dxa" w:w="80"/>
+              <w:left w:type="dxa" w:w="140"/>
+              <w:bottom w:type="dxa" w:w="80"/>
+              <w:right w:type="dxa" w:w="140"/>
+            </w:tcMar>
+          </w:tcPr>
+          <w:p>
+            <w:pPr>
+              <w:spacing w:after="0" w:before="0"/>
+            </w:pPr>
+            <w:r>
+              <w:rPr>
+                <w:rFonts w:ascii="Arial" w:cs="Arial" w:eastAsia="Arial" w:hAnsi="Arial"/>
+                <w:color w:val="212529"/>
+                <w:sz w:val="20"/>
+                <w:szCs w:val="20"/>
+              </w:rPr>
+              <w:t xml:space="preserve">Alerte : un RCP n'a personne</w:t>
+            </w:r>
+          </w:p>
+        </w:tc>
+        <w:tc>
+          <w:tcPr>
+            <w:tcW w:type="dxa" w:w="3600"/>
+            <w:tcBorders>
+              <w:top w:val="single" w:color="C5D3E8" w:sz="1"/>
+              <w:left w:val="single" w:color="C5D3E8" w:sz="1"/>
+              <w:bottom w:val="single" w:color="C5D3E8" w:sz="1"/>
+              <w:right w:val="single" w:color="C5D3E8" w:sz="1"/>
+            </w:tcBorders>
+            <w:shd w:fill="FFFFFF" w:val="clear"/>
+            <w:tcMar>
+              <w:top w:type="dxa" w:w="80"/>
+              <w:left w:type="dxa" w:w="140"/>
+              <w:bottom w:type="dxa" w:w="80"/>
+              <w:right w:type="dxa" w:w="140"/>
+            </w:tcMar>
+          </w:tcPr>
+          <w:p>
+            <w:pPr>
+              <w:spacing w:after="0" w:before="0"/>
+            </w:pPr>
+            <w:r>
+              <w:rPr>
+                <w:rFonts w:ascii="Arial" w:cs="Arial" w:eastAsia="Arial" w:hAnsi="Arial"/>
+                <w:color w:val="212529"/>
+                <w:sz w:val="20"/>
+                <w:szCs w:val="20"/>
+              </w:rPr>
+              <w:t xml:space="preserve">Si aucun médecin n'est confirmé</w:t>
+            </w:r>
+          </w:p>
+        </w:tc>
+      </w:tr>
+      <w:tr>
+        <w:tc>
+          <w:tcPr>
+            <w:tcW w:type="dxa" w:w="2400"/>
+            <w:tcBorders>
+              <w:top w:val="single" w:color="C5D3E8" w:sz="1"/>
+              <w:left w:val="single" w:color="C5D3E8" w:sz="1"/>
+              <w:bottom w:val="single" w:color="C5D3E8" w:sz="1"/>
+              <w:right w:val="single" w:color="C5D3E8" w:sz="1"/>
+            </w:tcBorders>
+            <w:shd w:fill="F1F3F9" w:val="clear"/>
+            <w:tcMar>
+              <w:top w:type="dxa" w:w="80"/>
+              <w:left w:type="dxa" w:w="140"/>
+              <w:bottom w:type="dxa" w:w="80"/>
+              <w:right w:type="dxa" w:w="140"/>
+            </w:tcMar>
+          </w:tcPr>
+          <w:p>
+            <w:pPr>
+              <w:spacing w:after="0" w:before="0"/>
+            </w:pPr>
+            <w:r>
+              <w:rPr>
+                <w:rFonts w:ascii="Arial" w:cs="Arial" w:eastAsia="Arial" w:hAnsi="Arial"/>
+                <w:color w:val="212529"/>
+                <w:sz w:val="20"/>
+                <w:szCs w:val="20"/>
+              </w:rPr>
+              <w:t xml:space="preserve">🔄 Demande de remplacement</w:t>
+            </w:r>
+          </w:p>
+        </w:tc>
+        <w:tc>
+          <w:tcPr>
+            <w:tcW w:type="dxa" w:w="3000"/>
+            <w:tcBorders>
+              <w:top w:val="single" w:color="C5D3E8" w:sz="1"/>
+              <w:left w:val="single" w:color="C5D3E8" w:sz="1"/>
+              <w:bottom w:val="single" w:color="C5D3E8" w:sz="1"/>
+              <w:right w:val="single" w:color="C5D3E8" w:sz="1"/>
+            </w:tcBorders>
+            <w:shd w:fill="F1F3F9" w:val="clear"/>
+            <w:tcMar>
+              <w:top w:type="dxa" w:w="80"/>
+              <w:left w:type="dxa" w:w="140"/>
+              <w:bottom w:type="dxa" w:w="80"/>
+              <w:right w:type="dxa" w:w="140"/>
+            </w:tcMar>
+          </w:tcPr>
+          <w:p>
+            <w:pPr>
+              <w:spacing w:after="0" w:before="0"/>
+            </w:pPr>
+            <w:r>
+              <w:rPr>
+                <w:rFonts w:ascii="Arial" w:cs="Arial" w:eastAsia="Arial" w:hAnsi="Arial"/>
+                <w:color w:val="212529"/>
+                <w:sz w:val="20"/>
+                <w:szCs w:val="20"/>
+              </w:rPr>
+              <w:t xml:space="preserve">Un collègue te demande de le remplacer</w:t>
+            </w:r>
+          </w:p>
+        </w:tc>
+        <w:tc>
+          <w:tcPr>
+            <w:tcW w:type="dxa" w:w="3600"/>
+            <w:tcBorders>
+              <w:top w:val="single" w:color="C5D3E8" w:sz="1"/>
+              <w:left w:val="single" w:color="C5D3E8" w:sz="1"/>
+              <w:bottom w:val="single" w:color="C5D3E8" w:sz="1"/>
+              <w:right w:val="single" w:color="C5D3E8" w:sz="1"/>
+            </w:tcBorders>
+            <w:shd w:fill="F1F3F9" w:val="clear"/>
+            <w:tcMar>
+              <w:top w:type="dxa" w:w="80"/>
+              <w:left w:type="dxa" w:w="140"/>
+              <w:bottom w:type="dxa" w:w="80"/>
+              <w:right w:type="dxa" w:w="140"/>
+            </w:tcMar>
+          </w:tcPr>
+          <w:p>
+            <w:pPr>
+              <w:spacing w:after="0" w:before="0"/>
+            </w:pPr>
+            <w:r>
+              <w:rPr>
+                <w:rFonts w:ascii="Arial" w:cs="Arial" w:eastAsia="Arial" w:hAnsi="Arial"/>
+                <w:color w:val="212529"/>
+                <w:sz w:val="20"/>
+                <w:szCs w:val="20"/>
+              </w:rPr>
+              <w:t xml:space="preserve">Dès la demande envoyée</w:t>
+            </w:r>
+          </w:p>
+        </w:tc>
+      </w:tr>
+      <w:tr>
+        <w:tc>
+          <w:tcPr>
+            <w:tcW w:type="dxa" w:w="2400"/>
+            <w:tcBorders>
+              <w:top w:val="single" w:color="C5D3E8" w:sz="1"/>
+              <w:left w:val="single" w:color="C5D3E8" w:sz="1"/>
+              <w:bottom w:val="single" w:color="C5D3E8" w:sz="1"/>
+              <w:right w:val="single" w:color="C5D3E8" w:sz="1"/>
+            </w:tcBorders>
+            <w:shd w:fill="FFFFFF" w:val="clear"/>
+            <w:tcMar>
+              <w:top w:type="dxa" w:w="80"/>
+              <w:left w:type="dxa" w:w="140"/>
+              <w:bottom w:type="dxa" w:w="80"/>
+              <w:right w:type="dxa" w:w="140"/>
+            </w:tcMar>
+          </w:tcPr>
+          <w:p>
+            <w:pPr>
+              <w:spacing w:after="0" w:before="0"/>
+            </w:pPr>
+            <w:r>
+              <w:rPr>
+                <w:rFonts w:ascii="Arial" w:cs="Arial" w:eastAsia="Arial" w:hAnsi="Arial"/>
+                <w:color w:val="212529"/>
+                <w:sz w:val="20"/>
+                <w:szCs w:val="20"/>
+              </w:rPr>
+              <w:t xml:space="preserve">✅ Remplacement accepté</w:t>
+            </w:r>
+          </w:p>
+        </w:tc>
+        <w:tc>
+          <w:tcPr>
+            <w:tcW w:type="dxa" w:w="3000"/>
+            <w:tcBorders>
+              <w:top w:val="single" w:color="C5D3E8" w:sz="1"/>
+              <w:left w:val="single" w:color="C5D3E8" w:sz="1"/>
+              <w:bottom w:val="single" w:color="C5D3E8" w:sz="1"/>
+              <w:right w:val="single" w:color="C5D3E8" w:sz="1"/>
+            </w:tcBorders>
+            <w:shd w:fill="FFFFFF" w:val="clear"/>
+            <w:tcMar>
+              <w:top w:type="dxa" w:w="80"/>
+              <w:left w:type="dxa" w:w="140"/>
+              <w:bottom w:type="dxa" w:w="80"/>
+              <w:right w:type="dxa" w:w="140"/>
+            </w:tcMar>
+          </w:tcPr>
+          <w:p>
+            <w:pPr>
+              <w:spacing w:after="0" w:before="0"/>
+            </w:pPr>
+            <w:r>
+              <w:rPr>
+                <w:rFonts w:ascii="Arial" w:cs="Arial" w:eastAsia="Arial" w:hAnsi="Arial"/>
+                <w:color w:val="212529"/>
+                <w:sz w:val="20"/>
+                <w:szCs w:val="20"/>
+              </w:rPr>
+              <w:t xml:space="preserve">Quelqu'un a accepté ta demande</w:t>
+            </w:r>
+          </w:p>
+        </w:tc>
+        <w:tc>
+          <w:tcPr>
+            <w:tcW w:type="dxa" w:w="3600"/>
+            <w:tcBorders>
+              <w:top w:val="single" w:color="C5D3E8" w:sz="1"/>
+              <w:left w:val="single" w:color="C5D3E8" w:sz="1"/>
+              <w:bottom w:val="single" w:color="C5D3E8" w:sz="1"/>
+              <w:right w:val="single" w:color="C5D3E8" w:sz="1"/>
+            </w:tcBorders>
+            <w:shd w:fill="FFFFFF" w:val="clear"/>
+            <w:tcMar>
+              <w:top w:type="dxa" w:w="80"/>
+              <w:left w:type="dxa" w:w="140"/>
+              <w:bottom w:type="dxa" w:w="80"/>
+              <w:right w:type="dxa" w:w="140"/>
+            </w:tcMar>
+          </w:tcPr>
+          <w:p>
+            <w:pPr>
+              <w:spacing w:after="0" w:before="0"/>
+            </w:pPr>
+            <w:r>
+              <w:rPr>
+                <w:rFonts w:ascii="Arial" w:cs="Arial" w:eastAsia="Arial" w:hAnsi="Arial"/>
+                <w:color w:val="212529"/>
+                <w:sz w:val="20"/>
+                <w:szCs w:val="20"/>
+              </w:rPr>
+              <w:t xml:space="preserve">Après acceptation</w:t>
+            </w:r>
+          </w:p>
+        </w:tc>
+      </w:tr>
+      <w:tr>
+        <w:tc>
+          <w:tcPr>
+            <w:tcW w:type="dxa" w:w="2400"/>
+            <w:tcBorders>
+              <w:top w:val="single" w:color="C5D3E8" w:sz="1"/>
+              <w:left w:val="single" w:color="C5D3E8" w:sz="1"/>
+              <w:bottom w:val="single" w:color="C5D3E8" w:sz="1"/>
+              <w:right w:val="single" w:color="C5D3E8" w:sz="1"/>
+            </w:tcBorders>
+            <w:shd w:fill="F1F3F9" w:val="clear"/>
+            <w:tcMar>
+              <w:top w:type="dxa" w:w="80"/>
+              <w:left w:type="dxa" w:w="140"/>
+              <w:bottom w:type="dxa" w:w="80"/>
+              <w:right w:type="dxa" w:w="140"/>
+            </w:tcMar>
+          </w:tcPr>
+          <w:p>
+            <w:pPr>
+              <w:spacing w:after="0" w:before="0"/>
+            </w:pPr>
+            <w:r>
+              <w:rPr>
+                <w:rFonts w:ascii="Arial" w:cs="Arial" w:eastAsia="Arial" w:hAnsi="Arial"/>
+                <w:color w:val="212529"/>
+                <w:sz w:val="20"/>
+                <w:szCs w:val="20"/>
+              </w:rPr>
+              <w:t xml:space="preserve">❌ Remplacement refusé</w:t>
+            </w:r>
+          </w:p>
+        </w:tc>
+        <w:tc>
+          <w:tcPr>
+            <w:tcW w:type="dxa" w:w="3000"/>
+            <w:tcBorders>
+              <w:top w:val="single" w:color="C5D3E8" w:sz="1"/>
+              <w:left w:val="single" w:color="C5D3E8" w:sz="1"/>
+              <w:bottom w:val="single" w:color="C5D3E8" w:sz="1"/>
+              <w:right w:val="single" w:color="C5D3E8" w:sz="1"/>
+            </w:tcBorders>
+            <w:shd w:fill="F1F3F9" w:val="clear"/>
+            <w:tcMar>
+              <w:top w:type="dxa" w:w="80"/>
+              <w:left w:type="dxa" w:w="140"/>
+              <w:bottom w:type="dxa" w:w="80"/>
+              <w:right w:type="dxa" w:w="140"/>
+            </w:tcMar>
+          </w:tcPr>
+          <w:p>
+            <w:pPr>
+              <w:spacing w:after="0" w:before="0"/>
+            </w:pPr>
+            <w:r>
+              <w:rPr>
+                <w:rFonts w:ascii="Arial" w:cs="Arial" w:eastAsia="Arial" w:hAnsi="Arial"/>
+                <w:color w:val="212529"/>
+                <w:sz w:val="20"/>
+                <w:szCs w:val="20"/>
+              </w:rPr>
+              <w:t xml:space="preserve">Ta demande a été refusée</w:t>
+            </w:r>
+          </w:p>
+        </w:tc>
+        <w:tc>
+          <w:tcPr>
+            <w:tcW w:type="dxa" w:w="3600"/>
+            <w:tcBorders>
+              <w:top w:val="single" w:color="C5D3E8" w:sz="1"/>
+              <w:left w:val="single" w:color="C5D3E8" w:sz="1"/>
+              <w:bottom w:val="single" w:color="C5D3E8" w:sz="1"/>
+              <w:right w:val="single" w:color="C5D3E8" w:sz="1"/>
+            </w:tcBorders>
+            <w:shd w:fill="F1F3F9" w:val="clear"/>
+            <w:tcMar>
+              <w:top w:type="dxa" w:w="80"/>
+              <w:left w:type="dxa" w:w="140"/>
+              <w:bottom w:type="dxa" w:w="80"/>
+              <w:right w:type="dxa" w:w="140"/>
+            </w:tcMar>
+          </w:tcPr>
+          <w:p>
+            <w:pPr>
+              <w:spacing w:after="0" w:before="0"/>
+            </w:pPr>
+            <w:r>
+              <w:rPr>
+                <w:rFonts w:ascii="Arial" w:cs="Arial" w:eastAsia="Arial" w:hAnsi="Arial"/>
+                <w:color w:val="212529"/>
+                <w:sz w:val="20"/>
+                <w:szCs w:val="20"/>
+              </w:rPr>
+              <w:t xml:space="preserve">Après refus</w:t>
+            </w:r>
+          </w:p>
+        </w:tc>
+      </w:tr>
+    </w:tbl>
+    <w:p>
+      <w:pPr>
+        <w:spacing w:after="160" w:before="0"/>
+      </w:pPr>
+    </w:p>
+    <w:p>
+      <w:pPr>
+        <w:pStyle w:val="Heading2"/>
+        <w:spacing w:after="120" w:before="280"/>
+      </w:pPr>
+      <w:r>
+        <w:rPr>
+          <w:rFonts w:ascii="Arial" w:cs="Arial" w:eastAsia="Arial" w:hAnsi="Arial"/>
+          <w:b/>
+          <w:bCs/>
+          <w:color w:val="1971C2"/>
+          <w:sz w:val="26"/>
+          <w:szCs w:val="26"/>
+        </w:rPr>
+        <w:t xml:space="preserve">7.3 Répondre à une demande de remplacement</w:t>
+      </w:r>
+    </w:p>
+    <w:p>
+      <w:pPr>
+        <w:spacing w:after="100" w:before="60"/>
+      </w:pPr>
+      <w:r>
+        <w:rPr>
+          <w:rFonts w:ascii="Arial" w:cs="Arial" w:eastAsia="Arial" w:hAnsi="Arial"/>
+          <w:b w:val="false"/>
+          <w:bCs w:val="false"/>
+          <w:i w:val="false"/>
+          <w:iCs w:val="false"/>
+          <w:color w:val="212529"/>
+          <w:sz w:val="22"/>
+          <w:szCs w:val="22"/>
+        </w:rPr>
+        <w:t xml:space="preserve">Quand tu reçois une notification 🔄 Demande de remplacement :</w:t>
+      </w:r>
+    </w:p>
+    <w:p>
+      <w:pPr>
+        <w:pStyle w:val="ListParagraph"/>
+        <w:numPr>
+          <w:ilvl w:val="0"/>
+          <w:numId w:val="2"/>
+        </w:numPr>
+        <w:spacing w:after="40" w:before="40"/>
+      </w:pPr>
+      <w:r>
+        <w:rPr>
+          <w:rFonts w:ascii="Arial" w:cs="Arial" w:eastAsia="Arial" w:hAnsi="Arial"/>
+          <w:color w:val="212529"/>
+          <w:sz w:val="22"/>
+          <w:szCs w:val="22"/>
+        </w:rPr>
+        <w:t xml:space="preserve">Ouvre la cloche → clique sur la notification.</w:t>
+      </w:r>
+    </w:p>
+    <w:p>
+      <w:pPr>
+        <w:pStyle w:val="ListParagraph"/>
+        <w:numPr>
+          <w:ilvl w:val="0"/>
+          <w:numId w:val="2"/>
+        </w:numPr>
+        <w:spacing w:after="40" w:before="40"/>
+      </w:pPr>
+      <w:r>
+        <w:rPr>
+          <w:rFonts w:ascii="Arial" w:cs="Arial" w:eastAsia="Arial" w:hAnsi="Arial"/>
+          <w:color w:val="212529"/>
+          <w:sz w:val="22"/>
+          <w:szCs w:val="22"/>
+        </w:rPr>
+        <w:t xml:space="preserve">Les détails du créneau s'affichent : date, heure, type, lieu.</w:t>
+      </w:r>
+    </w:p>
+    <w:p>
+      <w:pPr>
+        <w:pStyle w:val="ListParagraph"/>
+        <w:numPr>
+          <w:ilvl w:val="0"/>
+          <w:numId w:val="2"/>
+        </w:numPr>
+        <w:spacing w:after="40" w:before="40"/>
+      </w:pPr>
+      <w:r>
+        <w:rPr>
+          <w:rFonts w:ascii="Arial" w:cs="Arial" w:eastAsia="Arial" w:hAnsi="Arial"/>
+          <w:color w:val="212529"/>
+          <w:sz w:val="22"/>
+          <w:szCs w:val="22"/>
+        </w:rPr>
+        <w:t xml:space="preserve">Clique Accepter ou Refuser.</w:t>
+      </w:r>
+    </w:p>
+    <w:p>
+      <w:pPr>
+        <w:spacing w:after="100" w:before="60"/>
+      </w:pPr>
+      <w:r>
+        <w:rPr>
+          <w:rFonts w:ascii="Arial" w:cs="Arial" w:eastAsia="Arial" w:hAnsi="Arial"/>
+          <w:b w:val="false"/>
+          <w:bCs w:val="false"/>
+          <w:i w:val="false"/>
+          <w:iCs w:val="false"/>
+          <w:color w:val="212529"/>
+          <w:sz w:val="22"/>
+          <w:szCs w:val="22"/>
+        </w:rPr>
+        <w:t xml:space="preserve">Si tu acceptes : le planning est mis à jour automatiquement et le médecin demandeur est notifié.</w:t>
+      </w:r>
+    </w:p>
+    <w:p>
+      <w:pPr>
+        <w:spacing w:after="100" w:before="60"/>
+      </w:pPr>
+      <w:r>
+        <w:rPr>
+          <w:rFonts w:ascii="Arial" w:cs="Arial" w:eastAsia="Arial" w:hAnsi="Arial"/>
+          <w:b w:val="false"/>
+          <w:bCs w:val="false"/>
+          <w:i w:val="false"/>
+          <w:iCs w:val="false"/>
+          <w:color w:val="212529"/>
+          <w:sz w:val="22"/>
+          <w:szCs w:val="22"/>
+        </w:rPr>
+        <w:t xml:space="preserve">Si tu refuses : le médecin demandeur reçoit une notification de refus et peut contacter un autre collègue.</w:t>
+      </w:r>
+    </w:p>
+    <w:p>
+      <w:pPr>
+        <w:pBdr>
+          <w:left w:val="single" w:color="FFC107" w:sz="8" w:space="8"/>
+        </w:pBdr>
+        <w:spacing w:after="80" w:before="80"/>
+        <w:ind w:left="360"/>
+      </w:pPr>
+      <w:r>
+        <w:rPr>
+          <w:rFonts w:ascii="Arial" w:cs="Arial" w:eastAsia="Arial" w:hAnsi="Arial"/>
+          <w:sz w:val="22"/>
+          <w:szCs w:val="22"/>
+        </w:rPr>
+        <w:t xml:space="preserve">⚠️ </w:t>
+      </w:r>
+      <w:r>
+        <w:rPr>
+          <w:rFonts w:ascii="Arial" w:cs="Arial" w:eastAsia="Arial" w:hAnsi="Arial"/>
+          <w:i/>
+          <w:iCs/>
+          <w:color w:val="856404"/>
+          <w:sz w:val="22"/>
+          <w:szCs w:val="22"/>
+        </w:rPr>
+        <w:t xml:space="preserve">Une fois accepté, le remplacement est immédiatement visible dans le Planning Global et dans ton propre planning.</w:t>
+      </w:r>
+    </w:p>
+    <w:p>
+      <w:pPr>
+        <w:pStyle w:val="Heading2"/>
+        <w:spacing w:after="120" w:before="280"/>
+      </w:pPr>
+      <w:r>
+        <w:rPr>
+          <w:rFonts w:ascii="Arial" w:cs="Arial" w:eastAsia="Arial" w:hAnsi="Arial"/>
+          <w:b/>
+          <w:bCs/>
+          <w:color w:val="1971C2"/>
+          <w:sz w:val="26"/>
+          <w:szCs w:val="26"/>
+        </w:rPr>
+        <w:t xml:space="preserve">7.4 Demander un remplacement</w:t>
+      </w:r>
+    </w:p>
+    <w:p>
+      <w:pPr>
+        <w:spacing w:after="100" w:before="60"/>
+      </w:pPr>
+      <w:r>
+        <w:rPr>
+          <w:rFonts w:ascii="Arial" w:cs="Arial" w:eastAsia="Arial" w:hAnsi="Arial"/>
+          <w:b w:val="false"/>
+          <w:bCs w:val="false"/>
+          <w:i w:val="false"/>
+          <w:iCs w:val="false"/>
+          <w:color w:val="212529"/>
+          <w:sz w:val="22"/>
+          <w:szCs w:val="22"/>
+        </w:rPr>
+        <w:t xml:space="preserve">Tu peux demander un remplacement pour tes slots de consultation (Box) et tes activités (Astreinte, Unity, Workflow) :</w:t>
+      </w:r>
+    </w:p>
+    <w:p>
+      <w:pPr>
+        <w:pStyle w:val="ListParagraph"/>
+        <w:numPr>
+          <w:ilvl w:val="0"/>
+          <w:numId w:val="2"/>
+        </w:numPr>
+        <w:spacing w:after="40" w:before="40"/>
+      </w:pPr>
+      <w:r>
+        <w:rPr>
+          <w:rFonts w:ascii="Arial" w:cs="Arial" w:eastAsia="Arial" w:hAnsi="Arial"/>
+          <w:color w:val="212529"/>
+          <w:sz w:val="22"/>
+          <w:szCs w:val="22"/>
+        </w:rPr>
+        <w:t xml:space="preserve">Accède à "Mon Planning" ou au "Tableau de bord".</w:t>
+      </w:r>
+    </w:p>
+    <w:p>
+      <w:pPr>
+        <w:pStyle w:val="ListParagraph"/>
+        <w:numPr>
+          <w:ilvl w:val="0"/>
+          <w:numId w:val="2"/>
+        </w:numPr>
+        <w:spacing w:after="40" w:before="40"/>
+      </w:pPr>
+      <w:r>
+        <w:rPr>
+          <w:rFonts w:ascii="Arial" w:cs="Arial" w:eastAsia="Arial" w:hAnsi="Arial"/>
+          <w:color w:val="212529"/>
+          <w:sz w:val="22"/>
+          <w:szCs w:val="22"/>
+        </w:rPr>
+        <w:t xml:space="preserve">Clique sur le slot concerné.</w:t>
+      </w:r>
+    </w:p>
+    <w:p>
+      <w:pPr>
+        <w:pStyle w:val="ListParagraph"/>
+        <w:numPr>
+          <w:ilvl w:val="0"/>
+          <w:numId w:val="2"/>
+        </w:numPr>
+        <w:spacing w:after="40" w:before="40"/>
+      </w:pPr>
+      <w:r>
+        <w:rPr>
+          <w:rFonts w:ascii="Arial" w:cs="Arial" w:eastAsia="Arial" w:hAnsi="Arial"/>
+          <w:color w:val="212529"/>
+          <w:sz w:val="22"/>
+          <w:szCs w:val="22"/>
+        </w:rPr>
+        <w:t xml:space="preserve">Dans le panneau de détail, clique sur "Demander un remplacement".</w:t>
+      </w:r>
+    </w:p>
+    <w:p>
+      <w:pPr>
+        <w:pStyle w:val="ListParagraph"/>
+        <w:numPr>
+          <w:ilvl w:val="0"/>
+          <w:numId w:val="2"/>
+        </w:numPr>
+        <w:spacing w:after="40" w:before="40"/>
+      </w:pPr>
+      <w:r>
+        <w:rPr>
+          <w:rFonts w:ascii="Arial" w:cs="Arial" w:eastAsia="Arial" w:hAnsi="Arial"/>
+          <w:color w:val="212529"/>
+          <w:sz w:val="22"/>
+          <w:szCs w:val="22"/>
+        </w:rPr>
+        <w:t xml:space="preserve">Sélectionne le médecin cible dans la liste (tous les médecins de l'équipe sont listables).</w:t>
+      </w:r>
+    </w:p>
+    <w:p>
+      <w:pPr>
+        <w:pStyle w:val="ListParagraph"/>
+        <w:numPr>
+          <w:ilvl w:val="0"/>
+          <w:numId w:val="2"/>
+        </w:numPr>
+        <w:spacing w:after="40" w:before="40"/>
+      </w:pPr>
+      <w:r>
+        <w:rPr>
+          <w:rFonts w:ascii="Arial" w:cs="Arial" w:eastAsia="Arial" w:hAnsi="Arial"/>
+          <w:color w:val="212529"/>
+          <w:sz w:val="22"/>
+          <w:szCs w:val="22"/>
+        </w:rPr>
+        <w:t xml:space="preserve">Confirme → le médecin reçoit une notification 🔄.</w:t>
+      </w:r>
+    </w:p>
+    <w:p>
+      <w:pPr>
+        <w:pBdr>
+          <w:left w:val="single" w:color="3B5BDB" w:sz="8" w:space="8"/>
+        </w:pBdr>
+        <w:spacing w:after="80" w:before="80"/>
+        <w:ind w:left="360"/>
+      </w:pPr>
+      <w:r>
+        <w:rPr>
+          <w:rFonts w:ascii="Arial" w:cs="Arial" w:eastAsia="Arial" w:hAnsi="Arial"/>
+          <w:sz w:val="22"/>
+          <w:szCs w:val="22"/>
+        </w:rPr>
+        <w:t xml:space="preserve">💡 </w:t>
+      </w:r>
+      <w:r>
+        <w:rPr>
+          <w:rFonts w:ascii="Arial" w:cs="Arial" w:eastAsia="Arial" w:hAnsi="Arial"/>
+          <w:i/>
+          <w:iCs/>
+          <w:color w:val="1971C2"/>
+          <w:sz w:val="22"/>
+          <w:szCs w:val="22"/>
+        </w:rPr>
+        <w:t xml:space="preserve">Pense à contacter le médecin directement en parallèle pour le prévenir. La notification peut parfois être vue avec un léger délai.</w:t>
       </w:r>
     </w:p>
     <w:sectPr>

</xml_diff>

<commit_message>
feat(docs): finalize Manuel Utilisateur Médecin v1.0
</commit_message>
<xml_diff>
--- a/docs/Manuel_Utilisateur_Medecin_RadioPlan.docx
+++ b/docs/Manuel_Utilisateur_Medecin_RadioPlan.docx
@@ -6215,6 +6215,43 @@
           <w:szCs w:val="22"/>
         </w:rPr>
         <w:t xml:space="preserve">Pense à contacter le médecin directement en parallèle pour le prévenir. La notification peut parfois être vue avec un léger délai.</w:t>
+      </w:r>
+    </w:p>
+    <w:p>
+      <w:r>
+        <w:br w:type="page"/>
+      </w:r>
+    </w:p>
+    <w:p>
+      <w:pPr>
+        <w:spacing w:after="0" w:before="2400"/>
+        <w:jc w:val="center"/>
+      </w:pPr>
+      <w:r>
+        <w:rPr>
+          <w:rFonts w:ascii="Arial" w:cs="Arial" w:eastAsia="Arial" w:hAnsi="Arial"/>
+          <w:i/>
+          <w:iCs/>
+          <w:color w:val="6C757D"/>
+          <w:sz w:val="22"/>
+          <w:szCs w:val="22"/>
+        </w:rPr>
+        <w:t xml:space="preserve">Fin du manuel</w:t>
+      </w:r>
+    </w:p>
+    <w:p>
+      <w:pPr>
+        <w:spacing w:after="0" w:before="80"/>
+        <w:jc w:val="center"/>
+      </w:pPr>
+      <w:r>
+        <w:rPr>
+          <w:rFonts w:ascii="Arial" w:cs="Arial" w:eastAsia="Arial" w:hAnsi="Arial"/>
+          <w:color w:val="6C757D"/>
+          <w:sz w:val="20"/>
+          <w:szCs w:val="20"/>
+        </w:rPr>
+        <w:t xml:space="preserve">Pour toute question, contactez votre administrateur RadioPlan AI.</w:t>
       </w:r>
     </w:p>
     <w:sectPr>

</xml_diff>